<commit_message>
feat(document-engine): the general training material
The material for the general introductory training: 85 pages, seventeen
chapters, and the last stage 1 document. Its closing chapter lists the
unit's own risks, which the original typed for a gelato bar; the table now
repeats a row per item of `unitRisks`, numbered with the new `{{$index}}`.

The contents table loses its page numbers, typed by hand and wrong as
soon as anything moves. Dashes under a letter sit one tier further in.
A last sweep over the saved XML unwraps the dead links and the justified
empty paragraphs that LibreOffice's API does not reach.

Claude-Session: https://claude.ai/code/session_019fFLd3rEWZKkUNU1RuQAwk
</commit_message>
<xml_diff>
--- a/packages/document-engine/templates/11_employer_briefing.docx
+++ b/packages/document-engine/templates/11_employer_briefing.docx
@@ -18355,7 +18355,7 @@
           <w:szCs w:val="20"/>
           <w:lang w:val="ro-RO"/>
         </w:rPr>
-        <w:t>accidentul suferit de cei care urmează cursuri de calificare, recalificare sau perfecționare a pregătirii profesionale, în timpul și din cauza efectuării activităților aferente stagiului de practica;</w:t>
+        <w:t>accidentul suferit de cei care urmează cursuri de calificare, recalificare sau perfecționare a pregătirii profesionale, în timpul și din cauza efectuării activităților aferente stagiului de practică;</w:t>
       </w:r>
     </w:p>
     <w:p>
@@ -29570,7 +29570,7 @@
           <w:szCs w:val="20"/>
           <w:lang w:val="ro-RO"/>
         </w:rPr>
-        <w:t>studenți în practica.</w:t>
+        <w:t>studenți în practică.</w:t>
       </w:r>
     </w:p>
     <w:p>

</xml_diff>

<commit_message>
fix(templates): the employer briefing's safe text slips from the fifth pack's sweep
Diacritics, agreement and spelling slips, capital L in Legea/Legii,
end marks of list items, "etc." commas, procesul-verbal, 30 °C; Art. 1
lists the decisions in order 1.1-1.5 and spells E.I.P. as 6 does.

Claude-Session: https://claude.ai/code/session_01A9qjCHVH6kcDAEKFiJoShR
</commit_message>
<xml_diff>
--- a/packages/document-engine/templates/11_employer_briefing.docx
+++ b/packages/document-engine/templates/11_employer_briefing.docx
@@ -456,7 +456,7 @@
           <w:szCs w:val="20"/>
           <w:lang w:val="ro-RO"/>
         </w:rPr>
-        <w:t>Decizia / Dispoziția privind responsabilii cu acordarea primului ajutor</w:t>
+        <w:t xml:space="preserve">Decizia / Dispoziția de constituire a echipei de evaluare a riscurilor de accidentare și/ sau îmbolnăvire profesională</w:t>
       </w:r>
     </w:p>
     <w:p>
@@ -487,7 +487,7 @@
           <w:szCs w:val="20"/>
           <w:lang w:val="ro-RO"/>
         </w:rPr>
-        <w:t xml:space="preserve">Decizia / Dispoziția de constituire a echipei de evaluare a riscurilor de accidentare și/ sau îmbolnăvire profesională</w:t>
+        <w:t>Decizia / Dispoziția privind responsabilii cu acordarea primului ajutor</w:t>
       </w:r>
     </w:p>
     <w:p>
@@ -820,7 +820,7 @@
           <w:szCs w:val="20"/>
           <w:lang w:val="ro-RO"/>
         </w:rPr>
-        <w:t>Lista internă cu necesarul de dotare cu echipament individual de protecție (e.i.p.) a lucrătorilor (cod LN E.I.P.)</w:t>
+        <w:t xml:space="preserve">Lista internă cu necesarul de dotare cu echipament individual de protecție (E.I.P.) a lucrătorilor (cod LN E.I.P.)</w:t>
       </w:r>
     </w:p>
     <w:p>
@@ -913,7 +913,7 @@
           <w:szCs w:val="20"/>
           <w:lang w:val="ro-RO"/>
         </w:rPr>
-        <w:t>Evaluarea riscurilor de accidentare și îmbolnăvire profesională pentru locurile de muncă (Descrierea metodei elaborate de I.N.C.D.P.M București, utilizată de evaluator) (cod EVR)</w:t>
+        <w:t xml:space="preserve">Evaluarea riscurilor de accidentare și îmbolnăvire profesională pentru locurile de muncă (Descrierea metodei elaborate de I.N.C.D.P.M. București, utilizată de evaluator) (cod EVR)</w:t>
       </w:r>
     </w:p>
     <w:p>
@@ -1019,7 +1019,7 @@
           <w:szCs w:val="20"/>
           <w:lang w:val="ro-RO"/>
         </w:rPr>
-        <w:t>Capitolul I. Prevederi generale pentru angajator conform legii 319/ 2006</w:t>
+        <w:t xml:space="preserve">Capitolul I. Prevederi generale pentru angajator conform Legii 319/ 2006</w:t>
       </w:r>
     </w:p>
     <w:p>
@@ -1397,7 +1397,7 @@
           <w:szCs w:val="20"/>
           <w:lang w:val="ro-RO"/>
         </w:rPr>
-        <w:t>Capitolul VII. Comunicarea, cercetarea, înregistrarea și raportarea evenimentelor, accidente de muncă și boli profesionale</w:t>
+        <w:t xml:space="preserve">Capitolul VII. Comunicarea, cercetarea, înregistrarea și raportarea evenimentelor, accidentelor de muncă și bolilor profesionale</w:t>
       </w:r>
     </w:p>
     <w:p>
@@ -1539,7 +1539,7 @@
           <w:szCs w:val="20"/>
           <w:lang w:val="ro-RO"/>
         </w:rPr>
-        <w:t>Capitolul I. Prevederi generale pentru angajator conform legii 319/ 2006</w:t>
+        <w:t xml:space="preserve">Capitolul I. Prevederi generale pentru angajator conform Legii 319/ 2006</w:t>
       </w:r>
     </w:p>
     <w:p>
@@ -1706,7 +1706,7 @@
           <w:szCs w:val="20"/>
           <w:lang w:val="ro-RO"/>
         </w:rPr>
-        <w:t>(Legea 319/ 2006, Art. 7, alin. 3) Angajatorul are obligația să implementeze măsurile prevăzute de legea 319/ 2006 pe baza următoarelor principii generale de prevenire:</w:t>
+        <w:t xml:space="preserve">(Legea 319/ 2006, Art. 7, alin. 3) Angajatorul are obligația să implementeze măsurile prevăzute de Legea 319/ 2006 pe baza următoarelor principii generale de prevenire:</w:t>
       </w:r>
     </w:p>
     <w:p>
@@ -2765,7 +2765,7 @@
           <w:szCs w:val="20"/>
           <w:lang w:val="ro-RO"/>
         </w:rPr>
-        <w:t xml:space="preserve"> Fără a aduce atingere altor prevederi ale legi 319/ 2006, ținând seama de natura activităților din întreprindere și/ sau unitate, angajatorul are obligația:</w:t>
+        <w:t xml:space="preserve"> Fără a aduce atingere altor prevederi ale Legii 319/ 2006, ținând seama de natura activităților din întreprindere și/ sau unitate, angajatorul are obligația:</w:t>
       </w:r>
     </w:p>
     <w:p>
@@ -3244,7 +3244,7 @@
           <w:szCs w:val="20"/>
           <w:lang w:val="ro-RO"/>
         </w:rPr>
-        <w:t>să ia măsuri și să furnizeze instrucțiuni pentru a da lucrătorilor posibilitatea să oprească lucrul și/sau să părăsească imediat locul de muncă și să se îndrepte spre o zona sigură, în caz de pericol grav și iminent;</w:t>
+        <w:t xml:space="preserve">să ia măsuri și să furnizeze instrucțiuni pentru a da lucrătorilor posibilitatea să oprească lucrul și/sau să părăsească imediat locul de muncă și să se îndrepte spre o zonă sigură, în caz de pericol grav și iminent;</w:t>
       </w:r>
     </w:p>
     <w:p>
@@ -3315,7 +3315,7 @@
           <w:szCs w:val="20"/>
           <w:lang w:val="ro-RO"/>
         </w:rPr>
-        <w:t xml:space="preserve"> Lucrătorii care, în cazul unui pericol grav și iminent, părăsesc locul de muncă și/ sau o zona periculoasă nu trebuie să fie prejudiciați și trebuie să fie protejați împotriva oricăror consecințe negative și nejustificate pentru aceștia.</w:t>
+        <w:t xml:space="preserve"> Lucrătorii care, în cazul unui pericol grav și iminent, părăsesc locul de muncă și/ sau o zonă periculoasă nu trebuie să fie prejudiciați și trebuie să fie protejați împotriva oricăror consecințe negative și nejustificate pentru aceștia.</w:t>
       </w:r>
     </w:p>
     <w:p>
@@ -3355,7 +3355,7 @@
           <w:szCs w:val="20"/>
           <w:lang w:val="ro-RO"/>
         </w:rPr>
-        <w:t xml:space="preserve"> Angajatorul trebuie să se asigure ca, în cazul unui pericol grav și iminent pentru propria securitate sau a altor persoane, atunci când șeful ierarhic imediat superior nu poate fi contactat, toți lucrătorii sunt apți să aplice măsurile corespunzătoare, în conformitate cu cunoștințele lor și cu mijloacele tehnice de care dispun, pentru a evita consecințele unui astfel de pericol.</w:t>
+        <w:t xml:space="preserve"> Angajatorul trebuie să se asigure că, în cazul unui pericol grav și iminent pentru propria securitate sau a altor persoane, atunci când șeful ierarhic imediat superior nu poate fi contactat, toți lucrătorii sunt apți să aplice măsurile corespunzătoare, în conformitate cu cunoștințele lor și cu mijloacele tehnice de care dispun, pentru a evita consecințele unui astfel de pericol.</w:t>
       </w:r>
     </w:p>
     <w:p>
@@ -3395,7 +3395,7 @@
           <w:szCs w:val="20"/>
           <w:lang w:val="ro-RO"/>
         </w:rPr>
-        <w:t xml:space="preserve"> Lucrătorii nu trebuie să fie prejudiciați pentru cazurile prevăzute la alin. (3) de mai sus, cu excepția situațiilor în care aceștia acționează imprudent sau dau dovada de neglijența gravă.</w:t>
+        <w:t xml:space="preserve"> Lucrătorii nu trebuie să fie prejudiciați pentru cazurile prevăzute la alin. (3) de mai sus, cu excepția situațiilor în care aceștia acționează imprudent sau dau dovadă de neglijență gravă.</w:t>
       </w:r>
     </w:p>
     <w:p>
@@ -3960,7 +3960,7 @@
           <w:szCs w:val="20"/>
           <w:lang w:val="ro-RO"/>
         </w:rPr>
-        <w:t>să țină evidența zonelor cu risc ridicat și specific prevăzute la art. 7, alin. (4), lit. e) din legea 319/ 2006;</w:t>
+        <w:t xml:space="preserve">să țină evidența zonelor cu risc ridicat și specific prevăzute la art. 7, alin. (4), lit. e) din Legea 319/ 2006;</w:t>
       </w:r>
     </w:p>
     <w:p>
@@ -3991,7 +3991,7 @@
           <w:szCs w:val="20"/>
           <w:lang w:val="ro-RO"/>
         </w:rPr>
-        <w:t>să asigure funcționarea permanenta și corectă a sistemelor și dispozitivelor de protecție, a aparaturii de măsura și control, precum și a instalațiilor de captare, reținere și neutralizare a substanțelor nocive degajate în desfășurarea proceselor tehnologice;</w:t>
+        <w:t xml:space="preserve">să asigure funcționarea permanentă și corectă a sistemelor și dispozitivelor de protecție, a aparaturii de măsură și control, precum și a instalațiilor de captare, reținere și neutralizare a substanțelor nocive degajate în desfășurarea proceselor tehnologice;</w:t>
       </w:r>
     </w:p>
     <w:p>
@@ -5433,7 +5433,7 @@
           <w:szCs w:val="20"/>
           <w:lang w:val="ro-RO"/>
         </w:rPr>
-        <w:t>art. 12 alin. (1) lit. d) din Lege 319/ 2006</w:t>
+        <w:t xml:space="preserve">art. 12 alin. (1) lit. d) din Legea 319/ 2006</w:t>
       </w:r>
       <w:r>
         <w:rPr>
@@ -6147,7 +6147,7 @@
           <w:szCs w:val="20"/>
           <w:lang w:val="ro-RO"/>
         </w:rPr>
-        <w:t>să coopereze, atât timp cât este necesar, cu angajatorul și/ sau cu lucrătorii desemnați, pentru a permite angajatorului să se asigure ca mediul de muncă și condițiile de lucru sunt sigure și fără riscuri pentru securitate și sănătate, în domeniul său de activitate;</w:t>
+        <w:t xml:space="preserve">să coopereze, atât timp cât este necesar, cu angajatorul și/ sau cu lucrătorii desemnați, pentru a permite angajatorului să se asigure că mediul de muncă și condițiile de lucru sunt sigure și fără riscuri pentru securitate și sănătate, în domeniul său de activitate;</w:t>
       </w:r>
     </w:p>
     <w:p>
@@ -6687,7 +6687,7 @@
           <w:szCs w:val="20"/>
           <w:lang w:val="ro-RO"/>
         </w:rPr>
-        <w:t xml:space="preserve"> În cazul microintreprinderilor și al întreprinderilor mici, în care se desfășoară activități fără riscuri deosebite, angajatorul își poate asuma atribuțiile din domeniul securității și sănătății în muncă pentru realizarea măsurilor prevăzute de prezenta lege, dacă are capacitatea necesară în domeniu.</w:t>
+        <w:t xml:space="preserve"> În cazul microîntreprinderilor și al întreprinderilor mici, în care se desfășoară activități fără riscuri deosebite, angajatorul își poate asuma atribuțiile din domeniul securității și sănătății în muncă pentru realizarea măsurilor prevăzute de prezenta lege, dacă are capacitatea necesară în domeniu.</w:t>
       </w:r>
     </w:p>
     <w:p>
@@ -6943,7 +6943,7 @@
           <w:szCs w:val="20"/>
           <w:lang w:val="ro-RO"/>
         </w:rPr>
-        <w:t>angajatorul a urmat cel puțin un program de pregătire în domeniul securității și sănătății în muncă, cu o durată minimă de 40 de ore și conținutul prevăzut în anexa nr. 6 lit. A din H.G. 1425/ 2006, fapt care se atesta printr-un document de absolvire a programului de pregătire.</w:t>
+        <w:t xml:space="preserve">angajatorul a urmat cel puțin un program de pregătire în domeniul securității și sănătății în muncă, cu o durată minimă de 40 de ore și conținutul prevăzut în anexa nr. 6 lit. A din H.G. 1425/ 2006, fapt care se atestă printr-un document de absolvire a programului de pregătire.</w:t>
       </w:r>
     </w:p>
     <w:p>
@@ -7917,7 +7917,7 @@
           <w:szCs w:val="20"/>
           <w:lang w:val="ro-RO"/>
         </w:rPr>
-        <w:t>Angajatorul va desemna lucrătorul numai din rândul lucrătorilor cu care are încheiat contract individual de muncă cu norma întreaga.</w:t>
+        <w:t xml:space="preserve">Angajatorul va desemna lucrătorul numai din rândul lucrătorilor cu care are încheiat contract individual de muncă cu normă întreagă.</w:t>
       </w:r>
     </w:p>
     <w:p>
@@ -7961,7 +7961,7 @@
           <w:szCs w:val="20"/>
           <w:lang w:val="ro-RO"/>
         </w:rPr>
-        <w:t>Angajatorul va consemna în fișa postului activitățile de prevenire și protecție pe care lucrătorul desemnat are capacitatea, timpul necesar și mijloacele adecvate să le efectueze</w:t>
+        <w:t xml:space="preserve">Angajatorul va consemna în fișa postului activitățile de prevenire și protecție pe care lucrătorul desemnat are capacitatea, timpul necesar și mijloacele adecvate să le efectueze.</w:t>
       </w:r>
     </w:p>
     <w:p>
@@ -8538,7 +8538,7 @@
           <w:szCs w:val="20"/>
           <w:lang w:val="ro-RO"/>
         </w:rPr>
-        <w:t>clauze privind soluționarea litigiilor apărute între parti.</w:t>
+        <w:t xml:space="preserve">clauze privind soluționarea litigiilor apărute între părți.</w:t>
       </w:r>
     </w:p>
     <w:p>
@@ -8646,7 +8646,7 @@
           <w:szCs w:val="20"/>
           <w:lang w:val="ro-RO"/>
         </w:rPr>
-        <w:t>Reprezentanții lucrătorilor cu răspunderi specifice în domeniul securității și sănătății în muncă, definiți conform art. 5 lit. d) din legea 319/ 2006, sunt aleși de către și dintre lucrătorii din întreprindere și/sau unitate, conform celor stabilite prin contractul colectiv de muncă, regulamentul intern sau regulamentul de organizare și funcționare.</w:t>
+        <w:t xml:space="preserve">Reprezentanții lucrătorilor cu răspunderi specifice în domeniul securității și sănătății în muncă, definiți conform art. 5 lit. d) din Legea 319/ 2006, sunt aleși de către și dintre lucrătorii din întreprindere și/sau unitate, conform celor stabilite prin contractul colectiv de muncă, regulamentul intern sau regulamentul de organizare și funcționare.</w:t>
       </w:r>
     </w:p>
     <w:p>
@@ -8702,7 +8702,7 @@
           <w:szCs w:val="20"/>
           <w:lang w:val="ro-RO"/>
         </w:rPr>
-        <w:t>În sensul legii 319/ 2006, termenul de reprezentant al lucrătorilor cu răspunderi specifice în domeniul securității și sănătății lucrătorilor are următorul înțeles: persoana aleasă, selectată sau desemnată de lucrători, în conformitate cu prevederile legale, să îi reprezinte pe aceștia în ceea ce privește problemele referitoare la protecția securității și sănătății lucrătorilor în muncă;</w:t>
+        <w:t xml:space="preserve">În sensul Legii 319/ 2006, termenul de reprezentant al lucrătorilor cu răspunderi specifice în domeniul securității și sănătății lucrătorilor are următorul înțeles: persoana aleasă, selectată sau desemnată de lucrători, în conformitate cu prevederile legale, să îi reprezinte pe aceștia în ceea ce privește problemele referitoare la protecția securității și sănătății lucrătorilor în muncă.</w:t>
       </w:r>
     </w:p>
     <w:p>
@@ -9084,7 +9084,7 @@
           <w:szCs w:val="20"/>
           <w:lang w:val="ro-RO"/>
         </w:rPr>
-        <w:t>Reprezentanții lucrătorilor cu răspunderi specifice în domeniul securității și sănătății lucrătorilor trebuie să urmeze un program de pregătire în domeniul securității și sănătății în muncă, cu o durată de cel puțin 40 de ore, cu conținutul minim conform celui prevăzut în H.G. 1425/ 2006 anexa nr. 6 lit. A</w:t>
+        <w:t xml:space="preserve">Reprezentanții lucrătorilor cu răspunderi specifice în domeniul securității și sănătății lucrătorilor trebuie să urmeze un program de pregătire în domeniul securității și sănătății în muncă, cu o durată de cel puțin 40 de ore, cu conținutul minim conform celui prevăzut în anexa nr. 6 lit. A</w:t>
       </w:r>
       <w:r>
         <w:rPr>
@@ -9154,7 +9154,7 @@
           <w:szCs w:val="20"/>
           <w:lang w:val="ro-RO"/>
         </w:rPr>
-        <w:t>Îndeplinirea cerinței prevăzute la alin. (1) se atesta printr-un document de absolvire a programului de pregătire.</w:t>
+        <w:t xml:space="preserve">Îndeplinirea cerinței prevăzute la alin. (1) se atestă printr-un document de absolvire a programului de pregătire.</w:t>
       </w:r>
     </w:p>
     <w:p>
@@ -9276,7 +9276,7 @@
           <w:szCs w:val="20"/>
           <w:lang w:val="ro-RO"/>
         </w:rPr>
-        <w:t xml:space="preserve"> document cu caracter intern de reglementare al modului de instruire al lucrătorilor.</w:t>
+        <w:t xml:space="preserve"> document cu caracter intern de reglementare a modului de instruire a lucrătorilor.</w:t>
       </w:r>
     </w:p>
     <w:p>
@@ -9346,7 +9346,7 @@
           <w:szCs w:val="20"/>
           <w:lang w:val="ro-RO"/>
         </w:rPr>
-        <w:t>Angajatorul va asigura toate condițiile pentru ca fiecare lucrător să primească o instruire suficiența și adecvată în domeniul securității și sănătății în muncă, în special sub forma de informații și instrucțiuni de lucru, specifice locului de muncă și postului său:</w:t>
+        <w:t xml:space="preserve">Angajatorul va asigura toate condițiile pentru ca fiecare lucrător să primească o instruire suficientă și adecvată în domeniul securității și sănătății în muncă, în special sub formă de informații și instrucțiuni de lucru, specifice locului de muncă și postului său:</w:t>
       </w:r>
     </w:p>
     <w:p>
@@ -10503,7 +10503,7 @@
           <w:szCs w:val="20"/>
           <w:lang w:val="ro-RO"/>
         </w:rPr>
-        <w:t>(Preluare din H.G. 1425/ 2006 – Art. 87, alin (1) și (3))</w:t>
+        <w:t xml:space="preserve">(Preluare din H.G. 1425/ 2006 – Art. 87, alin. (1) și (3))</w:t>
       </w:r>
       <w:r>
         <w:rPr>
@@ -10644,7 +10644,7 @@
           <w:shd w:fill="FFFFFF" w:val="clear"/>
           <w:lang w:val="ro-RO"/>
         </w:rPr>
-        <w:t xml:space="preserve"> Persoanele prevăzute la art. 82 din HG 1425/ 2006 li se vor prezenta succint activitățile, riscurile și măsurile de prevenire și protecție din întreprindere și/sau unitate.</w:t>
+        <w:t xml:space="preserve"> Persoanelor prevăzute la art. 82 din HG 1425/ 2006 li se vor prezenta succint activitățile, riscurile și măsurile de prevenire și protecție din întreprindere și/sau unitate.</w:t>
       </w:r>
     </w:p>
     <w:p>
@@ -10689,7 +10689,7 @@
           <w:szCs w:val="20"/>
           <w:lang w:val="ro-RO"/>
         </w:rPr>
-        <w:t>și are denumire de « Material de instruire în domeniul securității și sănătății în muncă pentru instruirea introductiv – generală », fiind codificat MISSMIG.</w:t>
+        <w:t xml:space="preserve">și are denumirea de « Material de instruire în domeniul securității și sănătății în muncă pentru instruirea introductiv – generală », fiind codificat MISSMIG.</w:t>
       </w:r>
     </w:p>
     <w:p>
@@ -11109,7 +11109,7 @@
           <w:szCs w:val="20"/>
           <w:lang w:val="ro-RO"/>
         </w:rPr>
-        <w:t xml:space="preserve">și poarta denumire de « </w:t>
+        <w:t xml:space="preserve">și poartă denumirea de « </w:t>
       </w:r>
       <w:r>
         <w:rPr>
@@ -11940,7 +11940,7 @@
           <w:szCs w:val="20"/>
           <w:lang w:val="ro-RO"/>
         </w:rPr>
-        <w:t xml:space="preserve">Ținând cont ca instruirea în domeniul securității și sănătății în muncă cuprinde 3 (trei) faze, instruirea introductive-generală, instruirea la locul de muncă și instruirea periodică, va fi întocmită o « </w:t>
+        <w:t xml:space="preserve">Ținând cont că instruirea în domeniul securității și sănătății în muncă cuprinde 3 (trei) faze, instruirea introductiv-generală, instruirea la locul de muncă și instruirea periodică, va fi întocmită o « </w:t>
       </w:r>
       <w:r>
         <w:rPr>
@@ -11967,7 +11967,7 @@
           <w:szCs w:val="20"/>
           <w:lang w:val="ro-RO"/>
         </w:rPr>
-        <w:t xml:space="preserve"> », fiind codificat TISSM.</w:t>
+        <w:t xml:space="preserve"> », fiind codificată TISSM.</w:t>
       </w:r>
     </w:p>
     <w:p>
@@ -12010,7 +12010,7 @@
           <w:szCs w:val="20"/>
           <w:lang w:val="ro-RO"/>
         </w:rPr>
-        <w:t>în funcție de sarcinile de muncă desfășurată de executanți și va reieși din articolele prevăzute și specificate în tematica de instruire, articole din MISSMIG și IPSSM.</w:t>
+        <w:t xml:space="preserve">în funcție de sarcinile de muncă desfășurate de executanți și va reieși din articolele prevăzute și specificate în tematica de instruire, articole din MISSMIG și IPSSM.</w:t>
       </w:r>
     </w:p>
     <w:p>
@@ -12479,7 +12479,7 @@
           <w:szCs w:val="20"/>
           <w:lang w:val="ro-RO"/>
         </w:rPr>
-        <w:t>Capitolul VII. Comunicarea, cercetarea, înregistrarea și raportarea evenimentelor, accidente de muncă și boli profesionale</w:t>
+        <w:t xml:space="preserve">Capitolul VII. Comunicarea, cercetarea, înregistrarea și raportarea evenimentelor, accidentelor de muncă și bolilor profesionale</w:t>
       </w:r>
     </w:p>
     <w:p>
@@ -12653,7 +12653,7 @@
           <w:szCs w:val="20"/>
           <w:lang w:val="ro-RO"/>
         </w:rPr>
-        <w:t xml:space="preserve">În sensul legii 319/ 2006, termenul de </w:t>
+        <w:t xml:space="preserve">În sensul Legii 319/ 2006, termenul de </w:t>
       </w:r>
       <w:r>
         <w:rPr>
@@ -12678,7 +12678,7 @@
           <w:szCs w:val="20"/>
           <w:lang w:val="ro-RO"/>
         </w:rPr>
-        <w:t>are următorul înțeles: vătămarea violenta a organismului, precum și intoxicația acută profesională, care au loc în timpul procesului de muncă sau în îndeplinirea îndatoririlor de serviciu și care provoacă incapacitate temporară de muncă de cel puțin 3 zile calendaristice, invaliditate ori deces.</w:t>
+        <w:t xml:space="preserve">are următorul înțeles: vătămarea violentă a organismului, precum și intoxicația acută profesională, care au loc în timpul procesului de muncă sau în îndeplinirea îndatoririlor de serviciu și care provoacă incapacitate temporară de muncă de cel puțin 3 zile calendaristice, invaliditate ori deces.</w:t>
       </w:r>
     </w:p>
     <w:p>
@@ -12709,7 +12709,7 @@
           <w:szCs w:val="20"/>
           <w:lang w:val="ro-RO"/>
         </w:rPr>
-        <w:t>(Preluare din Legea 319/ 2006, Art. 5, lit. h) În sensul legii 319/ 2006, termenul de boală profesională</w:t>
+        <w:t xml:space="preserve">(Preluare din Legea 319/ 2006, Art. 5, lit. h) În sensul Legii 319/ 2006, termenul de boală profesională</w:t>
       </w:r>
       <w:r>
         <w:rPr>
@@ -13020,7 +13020,7 @@
           <w:szCs w:val="20"/>
           <w:lang w:val="ro-RO"/>
         </w:rPr>
-        <w:t xml:space="preserve"> Orice medic, inclusiv medicul de medicina a muncii aflat într-o relație contractuală cu angajatorul, conform prevederilor legale, va semnala obligatoriu suspiciunea de boala profesională sau legată de profesiune, depistată cu prilejul prestațiilor medicale.</w:t>
+        <w:t xml:space="preserve"> Orice medic, inclusiv medicul de medicina muncii aflat într-o relație contractuală cu angajatorul, conform prevederilor legale, va semnala obligatoriu suspiciunea de boală profesională sau legată de profesiune, depistată cu prilejul prestațiilor medicale.</w:t>
       </w:r>
     </w:p>
     <w:p>
@@ -13105,7 +13105,7 @@
           <w:szCs w:val="20"/>
           <w:lang w:val="ro-RO"/>
         </w:rPr>
-        <w:t xml:space="preserve"> În cazul accidentelor de circulație produse pe drumurile publice, în care printre victime sunt și persoane aflate în îndeplinirea unor sarcini de serviciu, organele de poliție rutieră competente vor trimite instituțiilor și/ sau persoanelor fizice/ juridice prevăzute la art. 29 alin. (1) lit. a) și b) din legea 319/ 2006, în termen de 5 zile de la data solicitării, un exemplar al procesului-verbal de cercetare la fața locului.</w:t>
+        <w:t xml:space="preserve"> În cazul accidentelor de circulație produse pe drumurile publice, în care printre victime sunt și persoane aflate în îndeplinirea unor sarcini de serviciu, organele de poliție rutieră competente vor trimite instituțiilor și/ sau persoanelor fizice/ juridice prevăzute la art. 29 alin. (1) lit. a) și b) din Legea 319/ 2006, în termen de 5 zile de la data solicitării, un exemplar al procesului-verbal de cercetare la fața locului.</w:t>
       </w:r>
     </w:p>
     <w:p>
@@ -13300,7 +13300,7 @@
           <w:szCs w:val="20"/>
           <w:lang w:val="ro-RO"/>
         </w:rPr>
-        <w:t>de către autoritățile de sănătate publică teritoriale, respectiv a municipiului București, în cazul suspiciunilor de boala profesională și a bolilor legate de profesiune.</w:t>
+        <w:t xml:space="preserve">de către autoritățile de sănătate publică teritoriale, respectiv a municipiului București, în cazul suspiciunilor de boală profesională și a bolilor legate de profesiune.</w:t>
       </w:r>
     </w:p>
     <w:p>
@@ -13482,7 +13482,7 @@
           <w:szCs w:val="20"/>
           <w:lang w:val="ro-RO"/>
         </w:rPr>
-        <w:t>accidentul suferit de persoane aflate în vizita în întreprindere și/sau unitate, cu permisiunea angajatorului;</w:t>
+        <w:t xml:space="preserve">accidentul suferit de persoane aflate în vizită în întreprindere și/sau unitate, cu permisiunea angajatorului;</w:t>
       </w:r>
     </w:p>
     <w:p>
@@ -13513,7 +13513,7 @@
           <w:szCs w:val="20"/>
           <w:lang w:val="ro-RO"/>
         </w:rPr>
-        <w:t>accidentul suferit de persoanele care îndeplinesc sarcini de stat sau de interes public, inclusiv în cadrul unor activități culturale, sportive, în țara sau în afara granițelor țării, în timpul și din cauza îndeplinirii acestor sarcini;</w:t>
+        <w:t xml:space="preserve">accidentul suferit de persoanele care îndeplinesc sarcini de stat sau de interes public, inclusiv în cadrul unor activități culturale, sportive, în țară sau în afara granițelor țării, în timpul și din cauza îndeplinirii acestor sarcini;</w:t>
       </w:r>
     </w:p>
     <w:p>
@@ -13575,7 +13575,7 @@
           <w:szCs w:val="20"/>
           <w:lang w:val="ro-RO"/>
         </w:rPr>
-        <w:t>accidentul suferit de orice persoană, ca urmare a unei acțiuni întreprinse din proprie inițiativa pentru salvarea de vieți omenești;</w:t>
+        <w:t xml:space="preserve">accidentul suferit de orice persoană, ca urmare a unei acțiuni întreprinse din proprie inițiativă pentru salvarea de vieți omenești;</w:t>
       </w:r>
     </w:p>
     <w:p>
@@ -13606,7 +13606,7 @@
           <w:szCs w:val="20"/>
           <w:lang w:val="ro-RO"/>
         </w:rPr>
-        <w:t>accidentul suferit de orice persoană, ca urmare a unei acțiuni întreprinse din proprie inițiativa pentru prevenirea ori înlăturarea unui pericol care ameninta avutul public și privat;</w:t>
+        <w:t xml:space="preserve">accidentul suferit de orice persoană, ca urmare a unei acțiuni întreprinse din proprie inițiativă pentru prevenirea ori înlăturarea unui pericol care amenință avutul public și privat;</w:t>
       </w:r>
     </w:p>
     <w:p>
@@ -13823,7 +13823,7 @@
           <w:szCs w:val="20"/>
           <w:lang w:val="ro-RO"/>
         </w:rPr>
-        <w:t>accidentul suferit de lucrători ai angajatorilor romani sau de persoane fizice romane, delegați pentru îndeplinirea îndatoririlor de serviciu în afara granițelor țării, pe durată și traseul prevăzute în documentul de deplasare;</w:t>
+        <w:t xml:space="preserve">accidentul suferit de lucrători ai angajatorilor români sau de persoane fizice române, delegați pentru îndeplinirea îndatoririlor de serviciu în afara granițelor țării, pe durată și traseul prevăzute în documentul de deplasare;</w:t>
       </w:r>
     </w:p>
     <w:p>
@@ -13854,7 +13854,7 @@
           <w:szCs w:val="20"/>
           <w:lang w:val="ro-RO"/>
         </w:rPr>
-        <w:t>accidentul suferit de personalul roman care efectuează lucrări și servicii pe teritoriul altor tari, în baza unor contracte, convenții sau în alte condiții prevăzute de lege, încheiate de persoane juridice romane cu parteneri străini, în timpul și din cauza îndeplinirii îndatoririlor de serviciu;</w:t>
+        <w:t xml:space="preserve">accidentul suferit de personalul român care efectuează lucrări și servicii pe teritoriul altor țări, în baza unor contracte, convenții sau în alte condiții prevăzute de lege, încheiate de persoane juridice române cu parteneri străini, în timpul și din cauza îndeplinirii îndatoririlor de serviciu;</w:t>
       </w:r>
     </w:p>
     <w:p>
@@ -13916,7 +13916,7 @@
           <w:szCs w:val="20"/>
           <w:lang w:val="ro-RO"/>
         </w:rPr>
-        <w:t>accidentul determinat de fenomene sau calamități naturale, cum ar fi furtuna, viscol, cutremur, inundație, alunecări de teren, trăsnet (electrocutare), dacă victima se află în timpul procesului de muncă sau în îndeplinirea îndatoririlor de serviciu;</w:t>
+        <w:t xml:space="preserve">accidentul determinat de fenomene sau calamități naturale, cum ar fi furtună, viscol, cutremur, inundație, alunecări de teren, trăsnet (electrocutare), dacă victima se află în timpul procesului de muncă sau în îndeplinirea îndatoririlor de serviciu;</w:t>
       </w:r>
     </w:p>
     <w:p>
@@ -14064,7 +14064,7 @@
           <w:szCs w:val="20"/>
           <w:lang w:val="ro-RO"/>
         </w:rPr>
-        <w:t>Accidentele de muncă se clasifica, în raport cu urmările produse și cu numărul persoanelor accidentate, în:</w:t>
+        <w:t xml:space="preserve">Accidentele de muncă se clasifică, în raport cu urmările produse și cu numărul persoanelor accidentate, în:</w:t>
       </w:r>
     </w:p>
     <w:p>
@@ -14518,7 +14518,7 @@
           <w:szCs w:val="20"/>
           <w:lang w:val="ro-RO"/>
         </w:rPr>
-        <w:t xml:space="preserve"> Bolile profesionale nou-declarate se raportează lunar de către autoritatea de sănătate publică teritorială și a municipiului București la Centrul național de coordonare metodologică și informare privind bolile profesionale din cadrul Institutului de Sănătate Publica București, la Centrul de Calcul și Statistica Sanitară București, precum și la structurile teritoriale ale asigurătorului stabilit conform legii.</w:t>
+        <w:t xml:space="preserve"> Bolile profesionale nou-declarate se raportează lunar de către autoritatea de sănătate publică teritorială și a municipiului București la Centrul național de coordonare metodologică și informare privind bolile profesionale din cadrul Institutului de Sănătate Publică București, la Centrul de Calcul și Statistică Sanitară București, precum și la structurile teritoriale ale asigurătorului stabilit conform legii.</w:t>
       </w:r>
     </w:p>
     <w:p>
@@ -14558,7 +14558,7 @@
           <w:szCs w:val="20"/>
           <w:lang w:val="ro-RO"/>
         </w:rPr>
-        <w:t xml:space="preserve"> Intoxicația acută profesională se declara, se cercetează și se înregistrează atât ca boala profesională, cât și ca accident de muncă.</w:t>
+        <w:t xml:space="preserve"> Intoxicația acută profesională se declară, se cercetează și se înregistrează atât ca boală profesională, cât și ca accident de muncă.</w:t>
       </w:r>
     </w:p>
     <w:p>
@@ -15673,7 +15673,7 @@
                 <w:szCs w:val="18"/>
                 <w:lang w:val="ro-RO"/>
               </w:rPr>
-              <w:t>Completarea măsurilor destinate să promoveze îmbunătățirea securității și sănătății la locul de muncă pentru salariații încadrați în baza unui contract individual de muncă pe durata determinată și pentru salariații temporari încadrați la agenți de muncă temporară</w:t>
+              <w:t xml:space="preserve">Completarea măsurilor destinate să promoveze îmbunătățirea securității și sănătății la locul de muncă pentru salariații încadrați în baza unui contract individual de muncă pe durată determinată și pentru salariații temporari încadrați la agenți de muncă temporară</w:t>
             </w:r>
           </w:p>
         </w:tc>
@@ -18546,7 +18546,7 @@
                 <w:szCs w:val="18"/>
                 <w:lang w:val="ro-RO"/>
               </w:rPr>
-              <w:t>Toate informațiile necesare cu privire la modul de utilizare, depozitarea, întreținerea și mentenanta, specificații tehnice și principii de funcționare și a sistemelor de control și securitate, obligații și atenționări specifice, pentru a putea obține maximum de eficiență, performante ridicate și evitarea producerii de accidente cauzate de mijlocul de producție pentru fiecare echipament de muncă din dotarea unității.</w:t>
+              <w:t xml:space="preserve">Toate informațiile necesare cu privire la modul de utilizare, depozitarea, întreținerea și mentenanța, specificații tehnice și principii de funcționare și a sistemelor de control și securitate, obligații și atenționări specifice, pentru a putea obține maximum de eficiență, performanțe ridicate și evitarea producerii de accidente cauzate de mijlocul de producție pentru fiecare echipament de muncă din dotarea unității.</w:t>
             </w:r>
           </w:p>
         </w:tc>
@@ -19250,7 +19250,7 @@
                 <w:szCs w:val="18"/>
                 <w:lang w:val="ro-RO"/>
               </w:rPr>
-              <w:t>Lista internă cu necesarul de dotare cu echipament individual de protecție (e.i.p.) a lucrătorilor</w:t>
+              <w:t xml:space="preserve">Lista internă cu necesarul de dotare cu echipament individual de protecție (E.I.P.) a lucrătorilor</w:t>
             </w:r>
           </w:p>
         </w:tc>
@@ -21269,7 +21269,7 @@
           <w:szCs w:val="20"/>
           <w:lang w:val="ro-RO"/>
         </w:rPr>
-        <w:t>Obligații, atribuții și răspunderi în domeniul securității și sănătății în muncă (conform legii 319/2006 și H.G. 1425/ 2006), valabile pentru lucrători:</w:t>
+        <w:t xml:space="preserve">Obligații, atribuții și răspunderi în domeniul securității și sănătății în muncă (conform Legii 319/2006 și H.G. 1425/ 2006), valabile pentru lucrători:</w:t>
       </w:r>
     </w:p>
     <w:p>
@@ -21547,7 +21547,7 @@
           <w:szCs w:val="20"/>
           <w:lang w:val="ro-RO"/>
         </w:rPr>
-        <w:t>să coopereze, atât timp cât este necesar, cu angajatorul și/ sau cu lucrătorii desemnați, pentru a permite angajatorului să se asigure ca mediul de muncă și condițiile de lucru sunt sigure și fără riscuri pentru securitate și sănătate, în domeniul său de activitate;</w:t>
+        <w:t xml:space="preserve">să coopereze, atât timp cât este necesar, cu angajatorul și/ sau cu lucrătorii desemnați, pentru a permite angajatorului să se asigure că mediul de muncă și condițiile de lucru sunt sigure și fără riscuri pentru securitate și sănătate, în domeniul său de activitate;</w:t>
       </w:r>
     </w:p>
     <w:p>
@@ -21702,7 +21702,7 @@
           <w:szCs w:val="20"/>
           <w:lang w:val="ro-RO"/>
         </w:rPr>
-        <w:t>să participe la instruirile periodice în domeniul securității și sănătății în muncă (atunci când acestea sunt programate) după ce au fost informați în prealabil de către șeful ierarhic (șeful locului de muncă)</w:t>
+        <w:t xml:space="preserve">să participe la instruirile periodice în domeniul securității și sănătății în muncă (atunci când acestea sunt programate) după ce au fost informați în prealabil de către șeful ierarhic (șeful locului de muncă);</w:t>
       </w:r>
     </w:p>
     <w:p>
@@ -21764,7 +21764,7 @@
           <w:szCs w:val="20"/>
           <w:lang w:val="ro-RO"/>
         </w:rPr>
-        <w:t xml:space="preserve">Fiecare lucrător se va prezenta la cabinetul de medicina a muncii pentru </w:t>
+        <w:t xml:space="preserve">Fiecare lucrător se va prezenta la cabinetul de medicina muncii pentru </w:t>
       </w:r>
       <w:r>
         <w:rPr>
@@ -21899,7 +21899,7 @@
           <w:szCs w:val="20"/>
           <w:lang w:val="ro-RO"/>
         </w:rPr>
-        <w:t xml:space="preserve">Obligații, atribuții și răspunderi în domeniul situațiilor de urgență (conform legii 307/2006), valabile pentru lucrători:</w:t>
+        <w:t xml:space="preserve">Obligații, atribuții și răspunderi în domeniul situațiilor de urgență (conform Legii 307/2006), valabile pentru lucrători:</w:t>
       </w:r>
     </w:p>
     <w:p>
@@ -22393,7 +22393,7 @@
           <w:szCs w:val="20"/>
           <w:lang w:val="ro-RO"/>
         </w:rPr>
-        <w:t>să furnizeze persoanelor abilitate toate datele și informațiile de care are cunoștința, referitoare la producerea incendiilor.</w:t>
+        <w:t xml:space="preserve">să furnizeze persoanelor abilitate toate datele și informațiile de care are cunoștință, referitoare la producerea incendiilor.</w:t>
       </w:r>
     </w:p>
     <w:p>
@@ -22424,7 +22424,7 @@
           <w:szCs w:val="20"/>
           <w:lang w:val="ro-RO"/>
         </w:rPr>
-        <w:t>De asemenea, în scopul realizării obiectivelor prevăzute la art. 3, lit. a) și c) din prezenta anexa, lucrătorii au următoarele obligații:</w:t>
+        <w:t xml:space="preserve">De asemenea, în scopul realizării obiectivelor prevăzute la art. 3, lit. a) și c) din prezenta anexă, lucrătorii au următoarele obligații:</w:t>
       </w:r>
     </w:p>
     <w:p>
@@ -22518,7 +22518,7 @@
           <w:szCs w:val="20"/>
           <w:lang w:val="ro-RO"/>
         </w:rPr>
-        <w:t xml:space="preserve">să participe la instruirile suplimentare în domeniul situațiilor de urgență (atunci când acestea sunt programate) după ce au fost informați în prealabil de către șeful ierarhic (șeful locului de muncă);</w:t>
+        <w:t xml:space="preserve">să participe la instruirile suplimentare în domeniul situațiilor de urgență (atunci când acestea sunt programate) după ce au fost informați în prealabil de către șeful ierarhic (șeful locului de muncă).</w:t>
       </w:r>
     </w:p>
     <w:p>
@@ -22549,7 +22549,7 @@
           <w:szCs w:val="20"/>
           <w:lang w:val="ro-RO"/>
         </w:rPr>
-        <w:t>Obligațiile, atribuțiile și răspunderile în domeniul securității și sănătății în muncă (conform legii 319/ 2006 și H.G. 1425/ 2006), valabile pentru șefii locurilor de muncă vor fi aceleași cu ale lucrătorilor doar ca se va suplimenta cu următoarea prevedere:</w:t>
+        <w:t xml:space="preserve">Obligațiile, atribuțiile și răspunderile în domeniul securității și sănătății în muncă (conform Legii 319/ 2006 și H.G. 1425/ 2006), valabile pentru șefii locurilor de muncă vor fi aceleași cu ale lucrătorilor doar că se va suplimenta cu următoarea prevedere:</w:t>
       </w:r>
       <w:r>
         <w:rPr>
@@ -22592,7 +22592,7 @@
           <w:szCs w:val="20"/>
           <w:lang w:val="ro-RO"/>
         </w:rPr>
-        <w:t xml:space="preserve">Obligațiile, atribuțiile și răspunderile în domeniul situațiilor de urgență (conform legii 307/ 2006), valabile pentru șefii locurilor de muncă vor fi aceleași cu ale lucrătorilor doar ca se va suplimenta cu următoarea prevedere:</w:t>
+        <w:t xml:space="preserve">Obligațiile, atribuțiile și răspunderile în domeniul situațiilor de urgență (conform Legii 307/ 2006), valabile pentru șefii locurilor de muncă vor fi aceleași cu ale lucrătorilor doar că se va suplimenta cu următoarea prevedere:</w:t>
       </w:r>
       <w:r>
         <w:rPr>
@@ -22689,7 +22689,7 @@
           <w:szCs w:val="20"/>
           <w:lang w:val="ro-RO"/>
         </w:rPr>
-        <w:t>vor fi suplimentate cu următoarea prevede</w:t>
+        <w:t xml:space="preserve">vor fi suplimentate cu următoarele prevederi</w:t>
       </w:r>
       <w:bookmarkEnd w:id="14"/>
       <w:r>
@@ -22703,7 +22703,7 @@
           <w:szCs w:val="20"/>
           <w:lang w:val="ro-RO"/>
         </w:rPr>
-        <w:t>ri</w:t>
+        <w:t xml:space="preserve"/>
       </w:r>
       <w:r>
         <w:rPr>
@@ -22999,7 +22999,7 @@
           <w:szCs w:val="20"/>
           <w:lang w:val="ro-RO"/>
         </w:rPr>
-        <w:t>vor fi suplimentate cu următoarea prevederi (aceste atribuții vor fi stabilite de comun acord între lucrătorul desemnat și angajator)</w:t>
+        <w:t xml:space="preserve">vor fi suplimentate cu următoarele prevederi (aceste atribuții vor fi stabilite de comun acord între lucrătorul desemnat și angajator)</w:t>
       </w:r>
       <w:r>
         <w:rPr>
@@ -24077,7 +24077,7 @@
           <w:szCs w:val="20"/>
           <w:lang w:val="ro-RO"/>
         </w:rPr>
-        <w:t>art. 12 alin. (1) lit. d) din Lege 319/ 2006</w:t>
+        <w:t xml:space="preserve">art. 12 alin. (1) lit. d) din Legea 319/ 2006</w:t>
       </w:r>
       <w:r>
         <w:rPr>
@@ -24739,7 +24739,7 @@
           <w:szCs w:val="20"/>
           <w:lang w:val="ro-RO"/>
         </w:rPr>
-        <w:t>să asigure evaluarea riscurilor pentru securitatea și sănătatea lucrătorilor în vedea stabilirii măsurilor de prevenire, incluzând echipamentul și amenajarea locului de muncă etc;</w:t>
+        <w:t xml:space="preserve">să asigure evaluarea riscurilor pentru securitatea și sănătatea lucrătorilor în vederea stabilirii măsurilor de prevenire, incluzând echipamentul și amenajarea locului de muncă etc.;</w:t>
       </w:r>
     </w:p>
     <w:p>
@@ -24826,7 +24826,7 @@
           <w:szCs w:val="20"/>
           <w:lang w:val="ro-RO"/>
         </w:rPr>
-        <w:t xml:space="preserve"> din punct de vedere al securității muncii, să mențină condițiile de lucru pentru care s-a obținut autorizație și să ceara revizuirea acesteia în cazul modificării condițiilor inițiale pentru care a fost emisa;</w:t>
+        <w:t xml:space="preserve"> din punct de vedere al securității muncii, să mențină condițiile de lucru pentru care s-a obținut autorizație și să ceară revizuirea acesteia în cazul modificării condițiilor inițiale pentru care a fost emisă;</w:t>
       </w:r>
     </w:p>
     <w:p>
@@ -24857,7 +24857,7 @@
           <w:szCs w:val="20"/>
           <w:lang w:val="ro-RO"/>
         </w:rPr>
-        <w:t>să stabilească măsurile tehnice și organizatorice de securitate a muncii, corespunzător condițiilor de muncă și factorilor de risc evaluați la locurile de muncă, pentru asigurarea securității și sănătății angajaților.</w:t>
+        <w:t xml:space="preserve">să stabilească măsurile tehnice și organizatorice de securitate a muncii, corespunzător condițiilor de muncă și factorilor de risc evaluați la locurile de muncă, pentru asigurarea securității și sănătății angajaților;</w:t>
       </w:r>
     </w:p>
     <w:p>
@@ -24968,7 +24968,7 @@
           <w:szCs w:val="20"/>
           <w:lang w:val="ro-RO"/>
         </w:rPr>
-        <w:t>lucrătorii care își schimbă locul de muncă sau felul muncii sau își reia activitatea după o întrerupere mai mare de 6 luni;</w:t>
+        <w:t xml:space="preserve">lucrătorii care își schimbă locul de muncă sau felul muncii sau își reiau activitatea după o întrerupere mai mare de 6 luni;</w:t>
       </w:r>
     </w:p>
     <w:p>
@@ -25098,7 +25098,7 @@
           <w:szCs w:val="20"/>
           <w:lang w:val="ro-RO"/>
         </w:rPr>
-        <w:t xml:space="preserve">Instruirea lucrătorilor este obligatorie și în situația în care intervin modificări ale legislației în domeniu, se introduce aparatura noua în domeniul tehnicii de calcul sau alte domenii noi de activitate în cadrul </w:t>
+        <w:t xml:space="preserve">Instruirea lucrătorilor este obligatorie și în situația în care intervin modificări ale legislației în domeniu, se introduce aparatura nouă în domeniul tehnicii de calcul sau alte domenii noi de activitate în cadrul </w:t>
       </w:r>
       <w:r>
         <w:rPr>
@@ -25231,7 +25231,7 @@
           <w:szCs w:val="20"/>
           <w:lang w:val="ro-RO"/>
         </w:rPr>
-        <w:t>să elaboreze instrucțiuni proprii de securitatea a muncii, care să detalieze și să particularizeze normele specifice securității și sănătății muncii;</w:t>
+        <w:t xml:space="preserve">să elaboreze instrucțiuni proprii de securitate a muncii, care să detalieze și să particularizeze normele specifice securității și sănătății muncii;</w:t>
       </w:r>
     </w:p>
     <w:p>
@@ -25262,7 +25262,7 @@
           <w:szCs w:val="20"/>
           <w:lang w:val="ro-RO"/>
         </w:rPr>
-        <w:t>să asigure și să controleze, prin personal propriu cunoașterea și aplicarea de către toți angajații a măsurilor tehnice și organizatorice stabilite, precum și a prevederilor legale în domeniul securității muncii;</w:t>
+        <w:t xml:space="preserve">să asigure și să controleze, prin personal propriu, cunoașterea și aplicarea de către toți angajații a măsurilor tehnice și organizatorice stabilite, precum și a prevederilor legale în domeniul securității muncii;</w:t>
       </w:r>
     </w:p>
     <w:p>
@@ -25293,7 +25293,7 @@
           <w:szCs w:val="20"/>
           <w:lang w:val="ro-RO"/>
         </w:rPr>
-        <w:t>să asigure pentru angajații cu contract de muncă pe durata determinată același nivel de protecție de care beneficiază ceilalți angajați ai unității;</w:t>
+        <w:t xml:space="preserve">să asigure pentru angajații cu contract de muncă pe durată determinată același nivel de protecție de care beneficiază ceilalți angajați ai unității;</w:t>
       </w:r>
     </w:p>
     <w:p>
@@ -25324,7 +25324,7 @@
           <w:szCs w:val="20"/>
           <w:lang w:val="ro-RO"/>
         </w:rPr>
-        <w:t>să ia măsuri pentru asigurarea de materiale necesare informării și educării angajaților: afișe, filme, cărți, broșuri, pliante, acte normative, manuale, teste, fișe tehnice de securitate etc;</w:t>
+        <w:t xml:space="preserve">să ia măsuri pentru asigurarea de materiale necesare informării și educării angajaților: afișe, filme, cărți, broșuri, pliante, acte normative, manuale, teste, fișe tehnice de securitate etc.;</w:t>
       </w:r>
     </w:p>
     <w:p>
@@ -25355,7 +25355,7 @@
           <w:szCs w:val="20"/>
           <w:lang w:val="ro-RO"/>
         </w:rPr>
-        <w:t>să asigure informarea fiecărei persoane, anterior angajării, asupra riscurilor la care acesta va fi expus, precum și asupra măsurilor tehnice și organizatorice de prevenire necesare;</w:t>
+        <w:t xml:space="preserve">să asigure informarea fiecărei persoane, anterior angajării, asupra riscurilor la care aceasta va fi expusă, precum și asupra măsurilor tehnice și organizatorice de prevenire necesare;</w:t>
       </w:r>
     </w:p>
     <w:p>
@@ -25386,7 +25386,7 @@
           <w:szCs w:val="20"/>
           <w:lang w:val="ro-RO"/>
         </w:rPr>
-        <w:t>să asigure măsurile necesare pentru informarea angajatorilor din orice unitate exterioară, ai căror angajați lucrează în unitatea sa, referitor la riscurile pentru securitate și sănătate la care aceștia pot fi expuși, precum și măsurile de prevenire și protecție adoptate la nivel de unitate și loc de muncă, inclusive cele referitoare la primul ajutor, prevenirea și stingerea incendiilor și evacuarea în caz de urgență;</w:t>
+        <w:t xml:space="preserve">să asigure măsurile necesare pentru informarea angajatorilor din orice unitate exterioară, ai căror angajați lucrează în unitatea sa, referitor la riscurile pentru securitate și sănătate la care aceștia pot fi expuși, precum și măsurile de prevenire și protecție adoptate la nivel de unitate și loc de muncă, inclusiv cele referitoare la primul ajutor, prevenirea și stingerea incendiilor și evacuarea în caz de urgență;</w:t>
       </w:r>
     </w:p>
     <w:p>
@@ -25450,7 +25450,7 @@
           <w:szCs w:val="20"/>
           <w:lang w:val="ro-RO"/>
         </w:rPr>
-        <w:t>să asigure efectuare și plata contravalorii:</w:t>
+        <w:t xml:space="preserve">să asigure efectuarea și plata contravalorii:</w:t>
       </w:r>
     </w:p>
     <w:p>
@@ -25579,7 +25579,7 @@
           <w:szCs w:val="20"/>
           <w:lang w:val="ro-RO"/>
         </w:rPr>
-        <w:t>să ia măsurile necesare informării compartimentului de securitate a muncii sau lucrătorului desemnat despre angajații care au relatii de muncă cu durata determinată sau cu caracter interimar, pentru ca aceștia să fie incluși în programul de activitate care are ca scop asigurarea condițiilor de securitate și sănătate în muncă;</w:t>
+        <w:t xml:space="preserve">să ia măsurile necesare informării compartimentului de securitate a muncii sau lucrătorului desemnat despre angajații care au relații de muncă cu durată determinată sau cu caracter interimar, pentru ca aceștia să fie incluși în programul de activitate care are ca scop asigurarea condițiilor de securitate și sănătate în muncă;</w:t>
       </w:r>
     </w:p>
     <w:p>
@@ -25610,7 +25610,7 @@
           <w:szCs w:val="20"/>
           <w:lang w:val="ro-RO"/>
         </w:rPr>
-        <w:t>să se asigure ca sunt consultați angajații și/sau reprezentanții lor în problemele referitoare la măsurile și consecințele privind securitatea și sănătatea în muncă la introducerea de noi tehnologii, alegerea echipamentului tehnic, îmbunătățirea condițiilor și mediului de muncă, la desemnarea persoanelor cu atribuții privind primul ajutor, prevenirea și stingerea incendiilor, evacuarea angajaților, precum și la modul de desfășurare a activității de prevenire și protecție împotriva riscurilor profesionale, inclusiv a celei de instruire în domeniu;</w:t>
+        <w:t xml:space="preserve">să se asigure că sunt consultați angajații și/sau reprezentanții lor în problemele referitoare la măsurile și consecințele privind securitatea și sănătatea în muncă la introducerea de noi tehnologii, alegerea echipamentului tehnic, îmbunătățirea condițiilor și mediului de muncă, la desemnarea persoanelor cu atribuții privind primul ajutor, prevenirea și stingerea incendiilor, evacuarea angajaților, precum și la modul de desfășurare a activității de prevenire și protecție împotriva riscurilor profesionale, inclusiv a celei de instruire în domeniu;</w:t>
       </w:r>
     </w:p>
     <w:p>
@@ -25641,7 +25641,7 @@
           <w:szCs w:val="20"/>
           <w:lang w:val="ro-RO"/>
         </w:rPr>
-        <w:t>să asigure periodic sau ori de câte ori este cazul, verificarea încadrării nivelului noxelor în limitele admise, prin măsurători efectuate de către organismele abilitate(dacă este cazul);</w:t>
+        <w:t xml:space="preserve">să asigure periodic sau ori de câte ori este cazul, verificarea încadrării nivelului noxelor în limitele admise, prin măsurători efectuate de către organismele abilitate (dacă este cazul);</w:t>
       </w:r>
     </w:p>
     <w:p>
@@ -25672,7 +25672,7 @@
           <w:szCs w:val="20"/>
           <w:lang w:val="ro-RO"/>
         </w:rPr>
-        <w:t>să comunice, cerceteze, înregistreze, declare și să tina evidența accidentelor de muncă, a bolilor profesionale, a accidentelor tehnice și avariilor;</w:t>
+        <w:t xml:space="preserve">să comunice, cerceteze, înregistreze, declare și să țină evidența accidentelor de muncă, a bolilor profesionale, a accidentelor tehnice și avariilor;</w:t>
       </w:r>
     </w:p>
     <w:p>
@@ -25765,7 +25765,7 @@
           <w:szCs w:val="20"/>
           <w:lang w:val="ro-RO"/>
         </w:rPr>
-        <w:t>să asigure echipamentul de lucru și protecție conform normativelor interne aprobate.</w:t>
+        <w:t xml:space="preserve">să asigure echipamentul de lucru și protecție conform normativelor interne aprobate;</w:t>
       </w:r>
     </w:p>
     <w:p>
@@ -25796,7 +25796,7 @@
           <w:szCs w:val="20"/>
           <w:lang w:val="ro-RO"/>
         </w:rPr>
-        <w:t>să anunțe imediat producerea de avarii tehnice, evenimente, accidente de muncă sau îmbolnăviri profesionale la inspectoratul teritorial de muncă și organele de urmărire penale competente, potrivit legii;</w:t>
+        <w:t xml:space="preserve">să anunțe imediat producerea de avarii tehnice, evenimente, accidente de muncă sau îmbolnăviri profesionale la inspectoratul teritorial de muncă și organele de urmărire penală competente, potrivit legii;</w:t>
       </w:r>
     </w:p>
     <w:p>
@@ -25840,7 +25840,7 @@
           <w:szCs w:val="20"/>
           <w:lang w:val="ro-RO"/>
         </w:rPr>
-        <w:t>în cazul în care temperaturile atmosferice sau cele din spațiul de lucru sunt ridicate și pot afecta sănătatea (peste 30</w:t>
+        <w:t xml:space="preserve">în cazul în care temperaturile atmosferice sau cele din spațiul de lucru sunt ridicate și pot afecta sănătatea (peste 30 °C)</w:t>
       </w:r>
       <w:r>
         <w:rPr>
@@ -25851,23 +25851,9 @@
           <w:w w:val="100"/>
           <w:sz w:val="20"/>
           <w:szCs w:val="20"/>
-          <w:vertAlign w:val="superscript"/>
-          <w:lang w:val="ro-RO"/>
-        </w:rPr>
-        <w:t>0</w:t>
-      </w:r>
-      <w:r>
-        <w:rPr>
-          <w:rFonts w:eastAsia="Arial" w:cs="Arial" w:ascii="Arial" w:hAnsi="Arial"/>
-          <w:bCs/>
-          <w:color w:val="auto"/>
-          <w:spacing w:val="0"/>
-          <w:w w:val="100"/>
-          <w:sz w:val="20"/>
-          <w:szCs w:val="20"/>
-          <w:lang w:val="ro-RO"/>
-        </w:rPr>
-        <w:t>C), în funcție de posibilități, aer condiționat sau ventilație. În cazul în care acest lucru nu este posibil se va asigura un litru de apa minerală pe zi pentru fiecare salariat și/sau în raport cu timpul lucrat.</w:t>
+          <w:lang w:val="ro-RO"/>
+        </w:rPr>
+        <w:t xml:space="preserve">, în funcție de posibilități, aer condiționat sau ventilație. În cazul în care acest lucru nu este posibil se va asigura un litru de apă minerală pe zi pentru fiecare salariat și/sau în raport cu timpul lucrat;</w:t>
       </w:r>
     </w:p>
     <w:p>
@@ -25898,7 +25884,7 @@
           <w:szCs w:val="20"/>
           <w:lang w:val="ro-RO"/>
         </w:rPr>
-        <w:t>să întocmească evidența nominală a angajaților cu handicap și a celor cu vârsta sub 18 ani.</w:t>
+        <w:t xml:space="preserve">să întocmească evidența nominală a angajaților cu handicap și a celor cu vârsta sub 18 ani;</w:t>
       </w:r>
     </w:p>
     <w:p>
@@ -25929,7 +25915,7 @@
           <w:szCs w:val="20"/>
           <w:lang w:val="ro-RO"/>
         </w:rPr>
-        <w:t>să asigure securitatea și sănătatea în muncă a salariatelor gravide și/sau mame, lăuze sau care alăptează conform OUG nr 96/2003 privind protecția maternității la locurile de muncă conform prevederilor capitolului 12</w:t>
+        <w:t xml:space="preserve">să asigure securitatea și sănătatea în muncă a salariatelor gravide și/sau mame, lăuze sau care alăptează conform OUG nr. 96/2003 privind protecția maternității la locurile de muncă conform prevederilor capitolului 12.</w:t>
       </w:r>
     </w:p>
     <w:p>
@@ -26030,7 +26016,7 @@
           <w:szCs w:val="20"/>
           <w:lang w:val="ro-RO"/>
         </w:rPr>
-        <w:t>să participe la evaluarea riscurilor privind îmbolnăvirilor</w:t>
+        <w:t xml:space="preserve">să participe la evaluarea riscurilor privind îmbolnăvirile;</w:t>
       </w:r>
     </w:p>
     <w:p>
@@ -26367,7 +26353,7 @@
           <w:szCs w:val="20"/>
           <w:lang w:val="ro-RO"/>
         </w:rPr>
-        <w:t>Pentru asigurarea atribuțiilor ce revin structurilor medicale de medicina muncii, angajatorul vor lua următoarele măsuri:</w:t>
+        <w:t xml:space="preserve">Pentru asigurarea atribuțiilor ce revin structurilor medicale de medicina muncii, angajatorul va lua următoarele măsuri:</w:t>
       </w:r>
     </w:p>
     <w:p>
@@ -26490,7 +26476,7 @@
           <w:szCs w:val="20"/>
           <w:lang w:val="ro-RO"/>
         </w:rPr>
-        <w:t>Angajatorii nu au dreptul să intervină prin nici un mijloc în influențarea activității medicale, a conținutului acesteia, a concluziilor și măsurilor medicale stabilite.</w:t>
+        <w:t xml:space="preserve">Angajatorii nu au dreptul să intervină prin niciun mijloc în influențarea activității medicale, a conținutului acesteia, a concluziilor și măsurilor medicale stabilite.</w:t>
       </w:r>
     </w:p>
     <w:p>
@@ -26576,7 +26562,7 @@
           <w:szCs w:val="20"/>
           <w:lang w:val="ro-RO"/>
         </w:rPr>
-        <w:t>Angajatorul va cere medicului de medicină a muncii să evaluează aptitudinea pentru muncă în relație cu starea de sănătate și să propună adaptarea muncii la posibilitățile lucrătorilor, asigurând:</w:t>
+        <w:t xml:space="preserve">Angajatorul va cere medicului de medicină a muncii să evalueze aptitudinea pentru muncă în relație cu starea de sănătate și să propună adaptarea muncii la posibilitățile lucrătorilor, asigurând:</w:t>
       </w:r>
     </w:p>
     <w:p>
@@ -27008,7 +26994,7 @@
           <w:szCs w:val="20"/>
           <w:lang w:val="ro-RO"/>
         </w:rPr>
-        <w:t>angajatul va păstra concluzia examinării medicale;</w:t>
+        <w:t xml:space="preserve">angajatul va păstra concluzia examinării medicale.</w:t>
       </w:r>
     </w:p>
     <w:p>
@@ -27070,7 +27056,7 @@
           <w:szCs w:val="20"/>
           <w:lang w:val="ro-RO"/>
         </w:rPr>
-        <w:t>confirmarea sau infirmarea aptitudinii în muncă pentru profesia/funcția și locul de muncă pentru care s-a făcut angajarea.</w:t>
+        <w:t xml:space="preserve">confirmarea sau infirmarea aptitudinii în muncă pentru profesia/funcția și locul de muncă pentru care s-a făcut angajarea;</w:t>
       </w:r>
     </w:p>
     <w:p>
@@ -27101,7 +27087,7 @@
           <w:szCs w:val="20"/>
           <w:lang w:val="ro-RO"/>
         </w:rPr>
-        <w:t>diagnosticarea bolilor profesionale</w:t>
+        <w:t xml:space="preserve">diagnosticarea bolilor profesionale;</w:t>
       </w:r>
     </w:p>
     <w:p>
@@ -27132,7 +27118,7 @@
           <w:szCs w:val="20"/>
           <w:lang w:val="ro-RO"/>
         </w:rPr>
-        <w:t>diagnosticarea bolilor legate de profesie</w:t>
+        <w:t xml:space="preserve">diagnosticarea bolilor legate de profesie;</w:t>
       </w:r>
     </w:p>
     <w:p>
@@ -27163,7 +27149,7 @@
           <w:szCs w:val="20"/>
           <w:lang w:val="ro-RO"/>
         </w:rPr>
-        <w:t>depistarea bolilor care ar constitui risc pentru viață și sănătatea celorlalți angajați la același loc de muncă depistarea bolilor care ar constitui risc pentru securitatea unității, pentru calitatea produselor sau pentru populația cu care angajatul vine în contact prin natura activității sale</w:t>
+        <w:t xml:space="preserve">depistarea bolilor care ar constitui risc pentru viață și sănătatea celorlalți angajați la același loc de muncă; depistarea bolilor care ar constitui risc pentru securitatea unității, pentru calitatea produselor sau pentru populația cu care angajatul vine în contact prin natura activității sale.</w:t>
       </w:r>
     </w:p>
     <w:p>
@@ -27255,7 +27241,7 @@
           <w:szCs w:val="20"/>
           <w:lang w:val="ro-RO"/>
         </w:rPr>
-        <w:t>instruirea introductiv general</w:t>
+        <w:t xml:space="preserve">instruirea introductiv-generală</w:t>
       </w:r>
     </w:p>
     <w:p>
@@ -27377,7 +27363,7 @@
           <w:szCs w:val="20"/>
           <w:lang w:val="ro-RO"/>
         </w:rPr>
-        <w:t>Instruirea introductiv generală se face tuturor lucrătorilor care au raporturi de muncă cu societatea fie prin angajare, fie prin detașare de la altă societate, la intrarea în societate.</w:t>
+        <w:t xml:space="preserve">Instruirea introductiv-generală se face tuturor lucrătorilor care au raporturi de muncă cu societatea fie prin angajare, fie prin detașare de la altă societate, la intrarea în societate.</w:t>
       </w:r>
     </w:p>
     <w:p>
@@ -27802,7 +27788,7 @@
           <w:szCs w:val="20"/>
           <w:lang w:val="ro-RO"/>
         </w:rPr>
-        <w:t>Prezentul capitol se completează cu prevederile legii 319/ 2006 și H.G. 1425/ 2006.</w:t>
+        <w:t xml:space="preserve">Prezentul capitol se completează cu prevederile Legii 319/ 2006 și H.G. 1425/ 2006.</w:t>
       </w:r>
     </w:p>
     <w:p>
@@ -27845,7 +27831,7 @@
           <w:szCs w:val="20"/>
           <w:lang w:val="ro-RO"/>
         </w:rPr>
-        <w:t xml:space="preserve"> are obligația de întocmire și actualizare a documentelor de organizare a activității de apărare împotriva incendiilor conform legii 307.</w:t>
+        <w:t xml:space="preserve"> are obligația de întocmire și actualizare a documentelor de organizare a activității de apărare împotriva incendiilor conform Legii 307.</w:t>
       </w:r>
     </w:p>
     <w:p>
@@ -27963,7 +27949,7 @@
           <w:szCs w:val="20"/>
           <w:lang w:val="ro-RO"/>
         </w:rPr>
-        <w:t>Asigurarea inscripționării cu indicatoare de avertizare a locurilor periculoase și surselor de alimentare cu apă, locului pentru fumat, căilor de evacuare, etc.</w:t>
+        <w:t xml:space="preserve">Asigurarea inscripționării cu indicatoare de avertizare a locurilor periculoase și surselor de alimentare cu apă, locului pentru fumat, căilor de evacuare etc.</w:t>
       </w:r>
     </w:p>
     <w:p>
@@ -27993,7 +27979,7 @@
           <w:szCs w:val="20"/>
           <w:lang w:val="ro-RO"/>
         </w:rPr>
-        <w:t>Asigurarea mijloacelor tehnice, echipamentelor de protecție, substanțelor chimice de stingere care sunt specifice riscurilor care decurg din existența și funcționarea unității, precum și a medicamentelor și antidotului necesare acordării primului ajutor, conform art. 19, litera n din Legea nr.307 din 12.07.2006.</w:t>
+        <w:t xml:space="preserve">Asigurarea mijloacelor tehnice, echipamentelor de protecție, substanțelor chimice de stingere care sunt specifice riscurilor care decurg din existența și funcționarea unității, precum și a medicamentelor și antidotului necesare acordării primului ajutor, conform art. 19, litera n din Legea nr. 307 din 12.07.2006.</w:t>
       </w:r>
     </w:p>
     <w:p>
@@ -28023,7 +28009,7 @@
           <w:szCs w:val="20"/>
           <w:lang w:val="ro-RO"/>
         </w:rPr>
-        <w:t>Prelucrarea actelor normative noi apărute care reglementează activitatea de apărare împotriva incendiilor, a legii nr. 307/2006 și a altor acte normative subsecvente acesteia.</w:t>
+        <w:t xml:space="preserve">Prelucrarea actelor normative noi apărute care reglementează activitatea de apărare împotriva incendiilor, a Legii nr. 307/2006 și a altor acte normative subsecvente acesteia.</w:t>
       </w:r>
     </w:p>
     <w:p>
@@ -28147,7 +28133,7 @@
           <w:szCs w:val="20"/>
           <w:lang w:val="ro-RO"/>
         </w:rPr>
-        <w:t>să aducă la cunoștința conducătorului locului de muncă orice defecțiune sau altă situație care constituie un pericol de accidentare sau îmbolnăvire profesională.</w:t>
+        <w:t xml:space="preserve">să aducă la cunoștința conducătorului locului de muncă orice defecțiune sau altă situație care constituie un pericol de accidentare sau îmbolnăvire profesională;</w:t>
       </w:r>
     </w:p>
     <w:p>
@@ -28178,7 +28164,7 @@
           <w:szCs w:val="20"/>
           <w:lang w:val="ro-RO"/>
         </w:rPr>
-        <w:t>să oprească lucru la apariția unui pericol iminent de producere a unui accident și să informeze imediat conducătorul locului de muncă;</w:t>
+        <w:t xml:space="preserve">să oprească lucrul la apariția unui pericol iminent de producere a unui accident și să informeze imediat conducătorul locului de muncă;</w:t>
       </w:r>
     </w:p>
     <w:p>
@@ -28209,7 +28195,7 @@
           <w:szCs w:val="20"/>
           <w:lang w:val="ro-RO"/>
         </w:rPr>
-        <w:t>să refuze întemeiat executarea unei sarcini de muncă dacă acesta ar pune în pericol de accidentare sau îmbolnăvire profesională persoana sa sau a celorlalți participanți în procesul de producție;</w:t>
+        <w:t xml:space="preserve">să refuze întemeiat executarea unei sarcini de muncă dacă aceasta ar pune în pericol de accidentare sau îmbolnăvire profesională persoana sa sau a celorlalți participanți în procesul de producție;</w:t>
       </w:r>
     </w:p>
     <w:p>
@@ -28271,7 +28257,7 @@
           <w:szCs w:val="20"/>
           <w:lang w:val="ro-RO"/>
         </w:rPr>
-        <w:t>au dreptul să ceara angajatorului să ia măsurile cele mai potrivite și să prezinte acestuia propunerile lor de măsuri pentru eliminarea sau reducerea riscurilor de accidente și îmbolnăvire profesională.</w:t>
+        <w:t xml:space="preserve">au dreptul să ceară angajatorului să ia măsurile cele mai potrivite și să prezinte acestuia propunerile lor de măsuri pentru eliminarea sau reducerea riscurilor de accidente și îmbolnăvire profesională.</w:t>
       </w:r>
     </w:p>
     <w:p>
@@ -28872,7 +28858,7 @@
           <w:szCs w:val="20"/>
           <w:lang w:val="ro-RO"/>
         </w:rPr>
-        <w:t>cu răspunderi specifice în domeniul securității și sănătății în muncă, potrivit listei de semnături ce constituie anexa la Procesul – verbal de întrunire a adunării generale a salariaților;</w:t>
+        <w:t xml:space="preserve">cu răspunderi specifice în domeniul securității și sănătății în muncă, potrivit listei de semnături ce constituie anexa la procesul-verbal de întrunire a adunării generale a salariaților;</w:t>
       </w:r>
     </w:p>
     <w:p>
@@ -28904,7 +28890,7 @@
           <w:szCs w:val="20"/>
           <w:lang w:val="ro-RO"/>
         </w:rPr>
-        <w:t>procesul – verbal de întrunire a adunării generale a salariaților va fi încheiat în 3 (trei) exemplare, din care un exemplar pentru reprezentanții salariaților, un exemplar la Departamentul Resurse umane și un exemplar la Departamentul SSM-SU-PM;</w:t>
+        <w:t xml:space="preserve">procesul-verbal de întrunire a adunării generale a salariaților va fi încheiat în 3 (trei) exemplare, din care un exemplar pentru reprezentanții salariaților, un exemplar la Departamentul Resurse umane și un exemplar la Departamentul SSM-SU-PM;</w:t>
       </w:r>
     </w:p>
     <w:p>
@@ -29251,7 +29237,7 @@
           <w:szCs w:val="20"/>
           <w:lang w:val="ro-RO"/>
         </w:rPr>
-        <w:t>Comitetul de securitate și sănătate în muncă este constituit din reprezentanții lucrătorilor cu răspunderi specifice în domeniul securității și sănătății lucrătorilor, pe de o parte, și angajator sau reprezentantul său legal și/ sau reprezentanții săi în număr egal cu cel al reprezentanților lucrătorilor și medicul de medicina muncii, pe de altă parte.</w:t>
+        <w:t xml:space="preserve">Comitetul de securitate și sănătate în muncă este constituit din reprezentanții lucrătorilor cu răspunderi specifice în domeniul securității și sănătății lucrătorilor, pe de o parte, și angajatorul sau reprezentantul său legal și/ sau reprezentanții săi în număr egal cu cel al reprezentanților lucrătorilor și medicul de medicina muncii, pe de altă parte.</w:t>
       </w:r>
     </w:p>
     <w:p>
@@ -29693,7 +29679,7 @@
           <w:szCs w:val="20"/>
           <w:lang w:val="ro-RO"/>
         </w:rPr>
-        <w:t>să elaboreze instrucțiuni proprii de securitatea a muncii, care să detalieze și să particularizeze normele specifice securității și sănătății muncii;</w:t>
+        <w:t xml:space="preserve">să elaboreze instrucțiuni proprii de securitate a muncii, care să detalieze și să particularizeze normele specifice securității și sănătății muncii;</w:t>
       </w:r>
     </w:p>
     <w:p>
@@ -29724,7 +29710,7 @@
           <w:szCs w:val="20"/>
           <w:lang w:val="ro-RO"/>
         </w:rPr>
-        <w:t>să asigure și să controleze, cunoașterea și aplicarea de către toți angajații, a măsurilor tehnice și organizatorice stabilite, precum și a prevederilor legale în domeniul securității muncii;</w:t>
+        <w:t xml:space="preserve">să asigure și să controleze cunoașterea și aplicarea de către toți angajații, a măsurilor tehnice și organizatorice stabilite, precum și a prevederilor legale în domeniul securității muncii;</w:t>
       </w:r>
     </w:p>
     <w:p>
@@ -29755,7 +29741,7 @@
           <w:szCs w:val="20"/>
           <w:lang w:val="ro-RO"/>
         </w:rPr>
-        <w:t>să asigure materiale necesare informării și educării angajaților: afișe, pliante, teste, fișe tehnice de securitate, carto, etc.;</w:t>
+        <w:t xml:space="preserve">să asigure materiale necesare informării și educării angajaților: afișe, pliante, teste, fișe tehnice de securitate, carto etc.;</w:t>
       </w:r>
     </w:p>
     <w:p>
@@ -29786,7 +29772,7 @@
           <w:szCs w:val="20"/>
           <w:lang w:val="ro-RO"/>
         </w:rPr>
-        <w:t>să asigure informarea fiecărei persoane, anterior angajării, asupra riscurilor la care acesta va fi expus, precum și asupra măsurilor tehnice și organizatorice de prevenire necesare;</w:t>
+        <w:t xml:space="preserve">să asigure informarea fiecărei persoane, anterior angajării, asupra riscurilor la care aceasta va fi expusă, precum și asupra măsurilor tehnice și organizatorice de prevenire necesare;</w:t>
       </w:r>
     </w:p>
     <w:p>
@@ -29817,7 +29803,7 @@
           <w:szCs w:val="20"/>
           <w:lang w:val="ro-RO"/>
         </w:rPr>
-        <w:t>să asigure materialul necesar pentru informarea angajatorilor din orice unitate exterioară, ai căror angajați lucrează în unitatea sa, referitor la riscurile pentru securitate și sănătate la care aceștia pot fi expuși, precum și măsurile de prevenire și protecție adoptate la nivel de unitate și loc de muncă, inclusive cele referitoare la primul ajutor, prevenirea și stingerea incendiilor și evacuarea în caz de urgență;</w:t>
+        <w:t xml:space="preserve">să asigure materialul necesar pentru informarea angajatorilor din orice unitate exterioară, ai căror angajați lucrează în unitatea sa, referitor la riscurile pentru securitate și sănătate la care aceștia pot fi expuși, precum și măsurile de prevenire și protecție adoptate la nivel de unitate și loc de muncă, inclusiv cele referitoare la primul ajutor, prevenirea și stingerea incendiilor și evacuarea în caz de urgență.</w:t>
       </w:r>
     </w:p>
     <w:p>
@@ -29890,7 +29876,7 @@
           <w:szCs w:val="20"/>
           <w:lang w:val="ro-RO"/>
         </w:rPr>
-        <w:t>În cadrul relațiilor de muncă funcționează principiul egalității de tratament față de toți LUCRĂTORII și angajatorii orice discriminare este interzisă.</w:t>
+        <w:t xml:space="preserve">În cadrul relațiilor de muncă funcționează principiul egalității de tratament față de toți lucrătorii și angajatorii; orice discriminare este interzisă.</w:t>
       </w:r>
     </w:p>
     <w:p>
@@ -29922,7 +29908,7 @@
           <w:szCs w:val="20"/>
           <w:lang w:val="ro-RO"/>
         </w:rPr>
-        <w:t>Prin discriminare se înțelege orice deosebire, excludere, restricție sau preferinta, pe baza de rasa, naționalitate, etnie, limba, religie, categorie socială, convingeri, gen, orientare sexuală, vârsta, dizabilitate, boala cronica necontagioasă, infectare HIV ori apartenenta la o categorie defavorizată sau orice alt criteriu care are ca scop sau efect restrângerea sau înlăturarea recunoașterii, folosinței sau exercitării, în condiții egale, a drepturilor omului și libertăților fundamentale sau a drepturilor recunoscute de lege, în domeniul politic, economic, social și cultural.</w:t>
+        <w:t xml:space="preserve">Prin discriminare se înțelege orice deosebire, excludere, restricție sau preferință, pe bază de rasă, naționalitate, etnie, limbă, religie, categorie socială, convingeri, gen, orientare sexuală, vârstă, dizabilitate, boală cronică necontagioasă, infectare HIV ori apartenență la o categorie defavorizată sau orice alt criteriu care are ca scop sau efect restrângerea sau înlăturarea recunoașterii, folosinței sau exercitării, în condiții egale, a drepturilor omului și libertăților fundamentale sau a drepturilor recunoscute de lege, în domeniul politic, economic, social și cultural.</w:t>
       </w:r>
     </w:p>
     <w:p>
@@ -30361,7 +30347,7 @@
           <w:szCs w:val="20"/>
           <w:lang w:val="ro-RO"/>
         </w:rPr>
-        <w:t>evaluarea performantelor profesionale individuale;</w:t>
+        <w:t xml:space="preserve">evaluarea performanțelor profesionale individuale;</w:t>
       </w:r>
     </w:p>
     <w:p>
@@ -30454,7 +30440,7 @@
           <w:szCs w:val="20"/>
           <w:lang w:val="ro-RO"/>
         </w:rPr>
-        <w:t>formarea, perfecționarea, reconversia, și promovarea profesională;</w:t>
+        <w:t xml:space="preserve">formarea, perfecționarea, reconversia și promovarea profesională;</w:t>
       </w:r>
     </w:p>
     <w:p>
@@ -30695,7 +30681,7 @@
           <w:szCs w:val="20"/>
           <w:lang w:val="ro-RO"/>
         </w:rPr>
-        <w:t>influențarea negativă a situației lucrătorului în ceea ce privește promovarea profesională, remunerația sau veniturile de orice natură ori accesul la formarea și perfecționarea profesională, în cazul refuzului acestuia de a accepta un comportament nedorit, ce tine de viața sexuală.</w:t>
+        <w:t xml:space="preserve">influențarea negativă a situației lucrătorului în ceea ce privește promovarea profesională, remunerația sau veniturile de orice natură ori accesul la formarea și perfecționarea profesională, în cazul refuzului acestuia de a accepta un comportament nedorit, ce ține de viața sexuală.</w:t>
       </w:r>
     </w:p>
     <w:p>
@@ -31123,7 +31109,7 @@
           <w:szCs w:val="20"/>
           <w:lang w:val="ro-RO"/>
         </w:rPr>
-        <w:t>Angajatorii sunt obligați ca, în termen de 5 zile lucrătoare de la data întocmirii raportului, să înmâneze o copie a acestuia către reprezentanții salariaților (dacă este cazul);</w:t>
+        <w:t xml:space="preserve">Angajatorii sunt obligați ca, în termen de 5 zile lucrătoare de la data întocmirii raportului, să înmâneze o copie a acestuia către reprezentanții salariaților (dacă este cazul).</w:t>
       </w:r>
     </w:p>
     <w:p>

</xml_diff>

<commit_message>
fix(templates): the employer briefing quotes and cites the legislation in force
Art. 81 of H.G. 1425 (paper or electronic training record) and art. 21 and
30(1) d) of Legea 319 re-quoted from the current consolidated text; the
repealed art. 91(2) and the repealed "nivel de bază" (art. 47 a), 48) gone,
pt 40 now states art. 55's 40-hour programme; art. 14's missing letter c);
corrected article, paragraph and letter numbers (art. 14, 15(1) pt 18,
20(4), 23(2), Legea 307 art. 19(1) o)).

Claude-Session: https://claude.ai/code/session_01A9qjCHVH6kcDAEKFiJoShR
</commit_message>
<xml_diff>
--- a/packages/document-engine/templates/11_employer_briefing.docx
+++ b/packages/document-engine/templates/11_employer_briefing.docx
@@ -5112,7 +5112,7 @@
           <w:szCs w:val="20"/>
           <w:lang w:val="ro-RO"/>
         </w:rPr>
-        <w:t>întocmirea rapoartelor și/ sau a listelor prevăzute de hotărârile Guvernului emise în temeiul, inclusiv cele referitoare la azbest, vibrații, zgomot și șantiere temporare și mobile;</w:t>
+        <w:t xml:space="preserve">întocmirea rapoartelor și/ sau a listelor prevăzute de hotărârile Guvernului emise în temeiul art. 51 alin. (1) lit. b) din Legea 319/ 2006, inclusiv cele referitoare la azbest, vibrații, zgomot și șantiere temporare și mobile;</w:t>
       </w:r>
     </w:p>
     <w:p>
@@ -6247,7 +6247,7 @@
           <w:szCs w:val="20"/>
           <w:lang w:val="ro-RO"/>
         </w:rPr>
-        <w:t xml:space="preserve"> Obligațiile prevăzute la art. 22, alin. (1) din Legea 319/ 2006 se aplică, după caz, și celorlalți participanți la procesul de muncă, potrivit activităților pe care aceștia le desfășoară.</w:t>
+        <w:t xml:space="preserve"> Obligațiile prevăzute la art. 23, alin. (1) din Legea 319/ 2006 se aplică, după caz, și celorlalți participanți la procesul de muncă, potrivit activităților pe care aceștia le desfășoară.</w:t>
       </w:r>
     </w:p>
     <w:p>
@@ -6312,7 +6312,7 @@
           <w:szCs w:val="20"/>
           <w:lang w:val="ro-RO"/>
         </w:rPr>
-        <w:t xml:space="preserve">(H.G. 1425/ 2006, Art. 14, alin. 6) </w:t>
+        <w:t xml:space="preserve">(H.G. 1425/ 2006, Art. 14) </w:t>
       </w:r>
       <w:r>
         <w:rPr>
@@ -6390,6 +6390,37 @@
           <w:lang w:val="ro-RO"/>
         </w:rPr>
         <w:t>prin desemnarea unuia sau mai multor lucrători pentru a se ocupa de activitățile de prevenire și protecție;</w:t>
+      </w:r>
+    </w:p>
+    <w:p>
+      <w:pPr>
+        <w:pStyle w:val="Normal"/>
+        <w:widowControl/>
+        <w:numPr>
+          <w:ilvl w:val="2"/>
+          <w:numId w:val="9"/>
+        </w:numPr>
+        <w:spacing w:before="0" w:after="40"/>
+        <w:jc w:val="left"/>
+        <w:rPr>
+          <w:rFonts w:ascii="Arial" w:hAnsi="Arial" w:cs="Arial"/>
+          <w:sz w:val="18"/>
+          <w:szCs w:val="18"/>
+          <w:lang w:val="fr-FR"/>
+        </w:rPr>
+      </w:pPr>
+      <w:r>
+        <w:rPr>
+          <w:rStyle w:val="tli1"/>
+          <w:rFonts w:eastAsia="Arial" w:cs="Arial" w:ascii="Arial" w:hAnsi="Arial"/>
+          <w:color w:val="auto"/>
+          <w:spacing w:val="0"/>
+          <w:w w:val="100"/>
+          <w:sz w:val="20"/>
+          <w:szCs w:val="20"/>
+          <w:lang w:val="ro-RO"/>
+        </w:rPr>
+        <w:t xml:space="preserve">prin înființarea unuia sau mai multor servicii interne de prevenire și protecție;</w:t>
       </w:r>
     </w:p>
     <w:p>
@@ -9625,7 +9656,7 @@
           <w:szCs w:val="20"/>
           <w:lang w:val="ro-RO"/>
         </w:rPr>
-        <w:t>(3)</w:t>
+        <w:t xml:space="preserve">(4)</w:t>
       </w:r>
       <w:r>
         <w:rPr>
@@ -9669,7 +9700,7 @@
           <w:szCs w:val="20"/>
           <w:lang w:val="ro-RO"/>
         </w:rPr>
-        <w:t>(Preluare din Legea 319/ 2006 – Art. 21, alin. 1, 2, 3)</w:t>
+        <w:t xml:space="preserve">(Preluare din Legea 319/ 2006 – Art. 21)</w:t>
       </w:r>
       <w:r>
         <w:rPr>
@@ -9787,7 +9818,113 @@
           <w:szCs w:val="20"/>
           <w:lang w:val="ro-RO"/>
         </w:rPr>
-        <w:t xml:space="preserve"> Instruirea lucrătorilor în domeniul securității și sănătății în muncă se va efectua în timpul programului de lucru, fie în interiorul, fie în afara întreprinderii și/ sau unității.</w:t>
+        <w:t xml:space="preserve"> Instruirea prevăzută la art. 20 alin. (4) trebuie să se efectueze în timpul programului de lucru, fie în interiorul, fie în afara întreprinderii și/sau unității, fie online.</w:t>
+      </w:r>
+    </w:p>
+    <w:p>
+      <w:pPr>
+        <w:pStyle w:val="Normal"/>
+        <w:widowControl/>
+        <w:spacing w:before="0" w:after="120"/>
+        <w:ind w:hanging="0"/>
+        <w:jc w:val="left"/>
+        <w:rPr>
+          <w:rFonts w:ascii="Arial" w:hAnsi="Arial" w:cs="Arial"/>
+          <w:sz w:val="18"/>
+          <w:szCs w:val="18"/>
+          <w:lang w:val="ro-RO"/>
+        </w:rPr>
+      </w:pPr>
+      <w:r>
+        <w:rPr>
+          <w:rFonts w:eastAsia="Arial" w:cs="Arial" w:ascii="Arial" w:hAnsi="Arial"/>
+          <w:b/>
+          <w:color w:val="auto"/>
+          <w:spacing w:val="0"/>
+          <w:w w:val="100"/>
+          <w:sz w:val="20"/>
+          <w:szCs w:val="20"/>
+          <w:lang w:val="ro-RO"/>
+        </w:rPr>
+        <w:t xml:space="preserve">(4)</w:t>
+      </w:r>
+      <w:r>
+        <w:rPr>
+          <w:rFonts w:eastAsia="Arial" w:cs="Arial" w:ascii="Arial" w:hAnsi="Arial"/>
+          <w:b/>
+          <w:color w:val="auto"/>
+          <w:spacing w:val="0"/>
+          <w:w w:val="100"/>
+          <w:sz w:val="20"/>
+          <w:szCs w:val="20"/>
+          <w:lang w:val="ro-RO"/>
+        </w:rPr>
+        <w:t xml:space="preserve"> </w:t>
+      </w:r>
+      <w:r>
+        <w:rPr>
+          <w:rFonts w:eastAsia="Arial" w:cs="Arial" w:ascii="Arial" w:hAnsi="Arial"/>
+          <w:color w:val="auto"/>
+          <w:spacing w:val="0"/>
+          <w:w w:val="100"/>
+          <w:sz w:val="20"/>
+          <w:szCs w:val="20"/>
+          <w:lang w:val="ro-RO"/>
+        </w:rPr>
+        <w:t xml:space="preserve">Dovada instruirii prevăzută la art. 20 poate fi realizată în format electronic sau pe suport hârtie în funcție de modalitatea aleasă de către angajator, stabilită prin regulamentul intern.</w:t>
+      </w:r>
+    </w:p>
+    <w:p>
+      <w:pPr>
+        <w:pStyle w:val="Normal"/>
+        <w:widowControl/>
+        <w:spacing w:before="0" w:after="120"/>
+        <w:ind w:hanging="0"/>
+        <w:jc w:val="left"/>
+        <w:rPr>
+          <w:rFonts w:ascii="Arial" w:hAnsi="Arial" w:cs="Arial"/>
+          <w:sz w:val="18"/>
+          <w:szCs w:val="18"/>
+          <w:lang w:val="ro-RO"/>
+        </w:rPr>
+      </w:pPr>
+      <w:r>
+        <w:rPr>
+          <w:rFonts w:eastAsia="Arial" w:cs="Arial" w:ascii="Arial" w:hAnsi="Arial"/>
+          <w:b/>
+          <w:color w:val="auto"/>
+          <w:spacing w:val="0"/>
+          <w:w w:val="100"/>
+          <w:sz w:val="20"/>
+          <w:szCs w:val="20"/>
+          <w:lang w:val="ro-RO"/>
+        </w:rPr>
+        <w:t xml:space="preserve">(5)</w:t>
+      </w:r>
+      <w:r>
+        <w:rPr>
+          <w:rFonts w:eastAsia="Arial" w:cs="Arial" w:ascii="Arial" w:hAnsi="Arial"/>
+          <w:b/>
+          <w:color w:val="auto"/>
+          <w:spacing w:val="0"/>
+          <w:w w:val="100"/>
+          <w:sz w:val="20"/>
+          <w:szCs w:val="20"/>
+          <w:lang w:val="ro-RO"/>
+        </w:rPr>
+        <w:t xml:space="preserve"> </w:t>
+      </w:r>
+      <w:r>
+        <w:rPr>
+          <w:rFonts w:eastAsia="Arial" w:cs="Arial" w:ascii="Arial" w:hAnsi="Arial"/>
+          <w:color w:val="auto"/>
+          <w:spacing w:val="0"/>
+          <w:w w:val="100"/>
+          <w:sz w:val="20"/>
+          <w:szCs w:val="20"/>
+          <w:lang w:val="ro-RO"/>
+        </w:rPr>
+        <w:t xml:space="preserve">În cazul folosirii variantei în format electronic prevăzute la alin. (4), dovada instruirii trebuie să fie semnată cu semnătură electronică, semnătură electronică avansată sau semnătură electronică calificată.</w:t>
       </w:r>
     </w:p>
     <w:p>
@@ -10153,7 +10290,7 @@
           <w:szCs w:val="20"/>
           <w:lang w:val="ro-RO"/>
         </w:rPr>
-        <w:t>ezultatul instruirii lucrătorilor în domeniul securității și sănătății în muncă se consemnează în mod obligatoriu în fișa de instruire individuală, cu indicarea materialului predat, a duratei și datei instruirii.</w:t>
+        <w:t xml:space="preserve">ezultatul instruirii lucrătorilor în domeniul securității și sănătății în muncă se consemnează în mod obligatoriu în fișa de instruire individuală, întocmită pe suport hârtie sau în format electronic, conform informațiilor prevăzute în anexa nr. 11, cu indicarea materialului predat, a duratei și datei instruirii.</w:t>
       </w:r>
     </w:p>
     <w:p>
@@ -10208,7 +10345,7 @@
           <w:szCs w:val="20"/>
           <w:lang w:val="ro-RO"/>
         </w:rPr>
-        <w:t>Completarea fișei de instruire individuală se va face cu pix cu pastă sau cu stilou, imediat după verificarea instruirii.</w:t>
+        <w:t xml:space="preserve">Completarea fișei de instruire individuală se va face în format electronic sau olograf, în funcție de varianta de instruire aleasă, imediat după verificarea instruirii.</w:t>
       </w:r>
     </w:p>
     <w:p>
@@ -10274,7 +10411,87 @@
         <w:ind w:hanging="0"/>
         <w:jc w:val="left"/>
         <w:rPr>
+          <w:rFonts w:ascii="Arial" w:hAnsi="Arial" w:cs="Arial"/>
+          <w:sz w:val="18"/>
+          <w:szCs w:val="18"/>
+          <w:lang w:val="ro-RO"/>
+        </w:rPr>
+      </w:pPr>
+      <w:r>
+        <w:rPr>
+          <w:rStyle w:val="al1"/>
+          <w:rFonts w:eastAsia="Arial" w:cs="Arial" w:ascii="Arial" w:hAnsi="Arial"/>
+          <w:color w:val="auto"/>
+          <w:spacing w:val="0"/>
+          <w:w w:val="100"/>
+          <w:sz w:val="20"/>
+          <w:szCs w:val="20"/>
+          <w:lang w:val="ro-RO"/>
+        </w:rPr>
+        <w:t xml:space="preserve">(3</w:t>
+      </w:r>
+      <w:r>
+        <w:rPr>
+          <w:rStyle w:val="al1"/>
+          <w:rFonts w:eastAsia="Arial" w:cs="Arial" w:ascii="Arial" w:hAnsi="Arial"/>
+          <w:color w:val="auto"/>
+          <w:spacing w:val="0"/>
+          <w:w w:val="100"/>
+          <w:sz w:val="20"/>
+          <w:szCs w:val="20"/>
+          <w:vertAlign w:val="superscript"/>
+          <w:lang w:val="ro-RO"/>
+        </w:rPr>
+        <w:t xml:space="preserve">1</w:t>
+      </w:r>
+      <w:r>
+        <w:rPr>
+          <w:rStyle w:val="al1"/>
+          <w:rFonts w:eastAsia="Arial" w:cs="Arial" w:ascii="Arial" w:hAnsi="Arial"/>
+          <w:color w:val="auto"/>
+          <w:spacing w:val="0"/>
+          <w:w w:val="100"/>
+          <w:sz w:val="20"/>
+          <w:szCs w:val="20"/>
+          <w:lang w:val="ro-RO"/>
+        </w:rPr>
+        <w:t xml:space="preserve">)</w:t>
+      </w:r>
+      <w:r>
+        <w:rPr>
+          <w:rStyle w:val="al1"/>
+          <w:rFonts w:eastAsia="Arial" w:cs="Arial" w:ascii="Arial" w:hAnsi="Arial"/>
+          <w:color w:val="auto"/>
+          <w:spacing w:val="0"/>
+          <w:w w:val="100"/>
+          <w:sz w:val="20"/>
+          <w:szCs w:val="20"/>
+          <w:lang w:val="ro-RO"/>
+        </w:rPr>
+        <w:t xml:space="preserve"> </w:t>
+      </w:r>
+      <w:r>
+        <w:rPr>
           <w:rStyle w:val="tal1"/>
+          <w:rFonts w:eastAsia="Arial" w:cs="Arial" w:ascii="Arial" w:hAnsi="Arial"/>
+          <w:color w:val="auto"/>
+          <w:spacing w:val="0"/>
+          <w:w w:val="100"/>
+          <w:sz w:val="20"/>
+          <w:szCs w:val="20"/>
+          <w:lang w:val="ro-RO"/>
+        </w:rPr>
+        <w:t xml:space="preserve">În funcție de modalitatea stabilită de angajator prin regulamentul intern, fișa de instruire individuală se semnează olograf sau cu semnătură electronică, semnătură electronică avansată sau semnătură electronică calificată.</w:t>
+      </w:r>
+    </w:p>
+    <w:p>
+      <w:pPr>
+        <w:pStyle w:val="Normal"/>
+        <w:widowControl/>
+        <w:spacing w:before="0" w:after="120"/>
+        <w:ind w:hanging="0"/>
+        <w:jc w:val="left"/>
+        <w:rPr>
           <w:rFonts w:ascii="Arial" w:hAnsi="Arial" w:cs="Arial"/>
           <w:sz w:val="18"/>
           <w:szCs w:val="18"/>
@@ -10292,6 +10509,169 @@
           <w:szCs w:val="20"/>
           <w:lang w:val="ro-RO"/>
         </w:rPr>
+        <w:t xml:space="preserve">(3</w:t>
+      </w:r>
+      <w:r>
+        <w:rPr>
+          <w:rStyle w:val="al1"/>
+          <w:rFonts w:eastAsia="Arial" w:cs="Arial" w:ascii="Arial" w:hAnsi="Arial"/>
+          <w:color w:val="auto"/>
+          <w:spacing w:val="0"/>
+          <w:w w:val="100"/>
+          <w:sz w:val="20"/>
+          <w:szCs w:val="20"/>
+          <w:vertAlign w:val="superscript"/>
+          <w:lang w:val="ro-RO"/>
+        </w:rPr>
+        <w:t xml:space="preserve">2</w:t>
+      </w:r>
+      <w:r>
+        <w:rPr>
+          <w:rStyle w:val="al1"/>
+          <w:rFonts w:eastAsia="Arial" w:cs="Arial" w:ascii="Arial" w:hAnsi="Arial"/>
+          <w:color w:val="auto"/>
+          <w:spacing w:val="0"/>
+          <w:w w:val="100"/>
+          <w:sz w:val="20"/>
+          <w:szCs w:val="20"/>
+          <w:lang w:val="ro-RO"/>
+        </w:rPr>
+        <w:t xml:space="preserve">)</w:t>
+      </w:r>
+      <w:r>
+        <w:rPr>
+          <w:rStyle w:val="al1"/>
+          <w:rFonts w:eastAsia="Arial" w:cs="Arial" w:ascii="Arial" w:hAnsi="Arial"/>
+          <w:color w:val="auto"/>
+          <w:spacing w:val="0"/>
+          <w:w w:val="100"/>
+          <w:sz w:val="20"/>
+          <w:szCs w:val="20"/>
+          <w:lang w:val="ro-RO"/>
+        </w:rPr>
+        <w:t xml:space="preserve"> </w:t>
+      </w:r>
+      <w:r>
+        <w:rPr>
+          <w:rStyle w:val="tal1"/>
+          <w:rFonts w:eastAsia="Arial" w:cs="Arial" w:ascii="Arial" w:hAnsi="Arial"/>
+          <w:color w:val="auto"/>
+          <w:spacing w:val="0"/>
+          <w:w w:val="100"/>
+          <w:sz w:val="20"/>
+          <w:szCs w:val="20"/>
+          <w:lang w:val="ro-RO"/>
+        </w:rPr>
+        <w:t xml:space="preserve">În conformitate cu prevederile art. 17 alin. (3) lit. o) și alin. (4) din Legea nr. 53/2003 - Codul muncii, republicată, cu modificările și completările ulterioare, procedurile privind utilizarea semnăturii electronice, semnăturii electronice avansate sau semnăturii electronice calificate pentru semnarea fișei de instruire individuală se regăsesc în contractul individual de muncă.</w:t>
+      </w:r>
+    </w:p>
+    <w:p>
+      <w:pPr>
+        <w:pStyle w:val="Normal"/>
+        <w:widowControl/>
+        <w:spacing w:before="0" w:after="120"/>
+        <w:ind w:hanging="0"/>
+        <w:jc w:val="left"/>
+        <w:rPr>
+          <w:rFonts w:ascii="Arial" w:hAnsi="Arial" w:cs="Arial"/>
+          <w:sz w:val="18"/>
+          <w:szCs w:val="18"/>
+          <w:lang w:val="ro-RO"/>
+        </w:rPr>
+      </w:pPr>
+      <w:r>
+        <w:rPr>
+          <w:rStyle w:val="al1"/>
+          <w:rFonts w:eastAsia="Arial" w:cs="Arial" w:ascii="Arial" w:hAnsi="Arial"/>
+          <w:color w:val="auto"/>
+          <w:spacing w:val="0"/>
+          <w:w w:val="100"/>
+          <w:sz w:val="20"/>
+          <w:szCs w:val="20"/>
+          <w:lang w:val="ro-RO"/>
+        </w:rPr>
+        <w:t xml:space="preserve">(3</w:t>
+      </w:r>
+      <w:r>
+        <w:rPr>
+          <w:rStyle w:val="al1"/>
+          <w:rFonts w:eastAsia="Arial" w:cs="Arial" w:ascii="Arial" w:hAnsi="Arial"/>
+          <w:color w:val="auto"/>
+          <w:spacing w:val="0"/>
+          <w:w w:val="100"/>
+          <w:sz w:val="20"/>
+          <w:szCs w:val="20"/>
+          <w:vertAlign w:val="superscript"/>
+          <w:lang w:val="ro-RO"/>
+        </w:rPr>
+        <w:t xml:space="preserve">3</w:t>
+      </w:r>
+      <w:r>
+        <w:rPr>
+          <w:rStyle w:val="al1"/>
+          <w:rFonts w:eastAsia="Arial" w:cs="Arial" w:ascii="Arial" w:hAnsi="Arial"/>
+          <w:color w:val="auto"/>
+          <w:spacing w:val="0"/>
+          <w:w w:val="100"/>
+          <w:sz w:val="20"/>
+          <w:szCs w:val="20"/>
+          <w:lang w:val="ro-RO"/>
+        </w:rPr>
+        <w:t xml:space="preserve">)</w:t>
+      </w:r>
+      <w:r>
+        <w:rPr>
+          <w:rStyle w:val="al1"/>
+          <w:rFonts w:eastAsia="Arial" w:cs="Arial" w:ascii="Arial" w:hAnsi="Arial"/>
+          <w:color w:val="auto"/>
+          <w:spacing w:val="0"/>
+          <w:w w:val="100"/>
+          <w:sz w:val="20"/>
+          <w:szCs w:val="20"/>
+          <w:lang w:val="ro-RO"/>
+        </w:rPr>
+        <w:t xml:space="preserve"> </w:t>
+      </w:r>
+      <w:r>
+        <w:rPr>
+          <w:rStyle w:val="tal1"/>
+          <w:rFonts w:eastAsia="Arial" w:cs="Arial" w:ascii="Arial" w:hAnsi="Arial"/>
+          <w:color w:val="auto"/>
+          <w:spacing w:val="0"/>
+          <w:w w:val="100"/>
+          <w:sz w:val="20"/>
+          <w:szCs w:val="20"/>
+          <w:lang w:val="ro-RO"/>
+        </w:rPr>
+        <w:t xml:space="preserve">Angajatorul are obligația de a asigura trasabilitatea și integritatea materialelor utilizate în cadrul fiecărei instruiri în format electronic a lucrătorului.</w:t>
+      </w:r>
+    </w:p>
+    <w:p>
+      <w:pPr>
+        <w:pStyle w:val="Normal"/>
+        <w:widowControl/>
+        <w:spacing w:before="0" w:after="120"/>
+        <w:ind w:hanging="0"/>
+        <w:jc w:val="left"/>
+        <w:rPr>
+          <w:rStyle w:val="tal1"/>
+          <w:rFonts w:ascii="Arial" w:hAnsi="Arial" w:cs="Arial"/>
+          <w:sz w:val="18"/>
+          <w:szCs w:val="18"/>
+          <w:lang w:val="ro-RO"/>
+        </w:rPr>
+      </w:pPr>
+      <w:r>
+        <w:rPr>
+          <w:rStyle w:val="al1"/>
+          <w:rFonts w:eastAsia="Arial" w:cs="Arial" w:ascii="Arial" w:hAnsi="Arial"/>
+          <w:color w:val="auto"/>
+          <w:spacing w:val="0"/>
+          <w:w w:val="100"/>
+          <w:sz w:val="20"/>
+          <w:szCs w:val="20"/>
+          <w:lang w:val="ro-RO"/>
+        </w:rPr>
         <w:t>(4)</w:t>
       </w:r>
       <w:r>
@@ -10319,7 +10699,62 @@
           <w:szCs w:val="20"/>
           <w:lang w:val="ro-RO"/>
         </w:rPr>
-        <w:t>Fișa de instruire individuală va fi păstrată de către conducătorul locului de muncă și va fi însoțită de o copie a fișei de aptitudini, completată de către medicul de medicina muncii în urma examenului medical la angajare.</w:t>
+        <w:t xml:space="preserve">Fișa de instruire individuală va fi păstrată de către conducătorul locului de muncă, pe suport hârtie sau în format electronic, după caz, și va fi însoțită de o copie a ultimei fișe de aptitudini completate de către medicul de medicina muncii.</w:t>
+      </w:r>
+    </w:p>
+    <w:p>
+      <w:pPr>
+        <w:pStyle w:val="Normal"/>
+        <w:widowControl/>
+        <w:spacing w:before="0" w:after="120"/>
+        <w:ind w:hanging="0"/>
+        <w:jc w:val="left"/>
+        <w:rPr>
+          <w:rStyle w:val="tal1"/>
+          <w:rFonts w:ascii="Arial" w:hAnsi="Arial" w:cs="Arial"/>
+          <w:sz w:val="18"/>
+          <w:szCs w:val="18"/>
+          <w:lang w:val="ro-RO"/>
+        </w:rPr>
+      </w:pPr>
+      <w:r>
+        <w:rPr>
+          <w:rStyle w:val="al1"/>
+          <w:rFonts w:eastAsia="Arial" w:cs="Arial" w:ascii="Arial" w:hAnsi="Arial"/>
+          <w:color w:val="auto"/>
+          <w:spacing w:val="0"/>
+          <w:w w:val="100"/>
+          <w:sz w:val="20"/>
+          <w:szCs w:val="20"/>
+          <w:lang w:val="ro-RO"/>
+        </w:rPr>
+        <w:t xml:space="preserve">(5)</w:t>
+      </w:r>
+      <w:r>
+        <w:rPr>
+          <w:rStyle w:val="al1"/>
+          <w:rFonts w:eastAsia="Arial" w:cs="Arial" w:ascii="Arial" w:hAnsi="Arial"/>
+          <w:color w:val="auto"/>
+          <w:spacing w:val="0"/>
+          <w:w w:val="100"/>
+          <w:sz w:val="20"/>
+          <w:szCs w:val="20"/>
+          <w:lang w:val="ro-RO"/>
+        </w:rPr>
+        <w:t xml:space="preserve"> </w:t>
+      </w:r>
+      <w:r>
+        <w:rPr>
+          <w:rStyle w:val="tal1"/>
+          <w:rFonts w:eastAsia="Arial" w:cs="Arial" w:ascii="Arial" w:hAnsi="Arial"/>
+          <w:color w:val="auto"/>
+          <w:spacing w:val="0"/>
+          <w:w w:val="100"/>
+          <w:sz w:val="20"/>
+          <w:szCs w:val="20"/>
+          <w:lang w:val="ro-RO"/>
+        </w:rPr>
+        <w:t xml:space="preserve">Fișa de instruire individuală se păstrează în întreprindere/unitate, pe suport hârtie sau în format electronic, după caz, de la angajare până la data încetării raporturilor de muncă.</w:t>
       </w:r>
     </w:p>
     <w:p>
@@ -10650,6 +11085,7 @@
     <w:p>
       <w:pPr>
         <w:pStyle w:val="Heading1"/>
+        <w:keepNext w:val="false"/>
         <w:widowControl/>
         <w:numPr>
           <w:ilvl w:val="0"/>
@@ -10782,64 +11218,6 @@
           <w:lang w:val="ro-RO"/>
         </w:rPr>
         <w:t>Instruirea la locul de muncă se face de către conducătorul direct al fiecărui loc de muncă, în grupe de maximum 20 de persoane.</w:t>
-      </w:r>
-    </w:p>
-    <w:p>
-      <w:pPr>
-        <w:pStyle w:val="Normal"/>
-        <w:widowControl/>
-        <w:spacing w:before="0" w:after="120"/>
-        <w:ind w:hanging="0"/>
-        <w:jc w:val="left"/>
-        <w:rPr>
-          <w:rStyle w:val="tal1"/>
-          <w:rFonts w:ascii="Arial" w:hAnsi="Arial" w:cs="Arial"/>
-          <w:sz w:val="18"/>
-          <w:szCs w:val="18"/>
-          <w:lang w:val="fr-FR"/>
-        </w:rPr>
-      </w:pPr>
-      <w:bookmarkStart w:id="13" w:name="do|caV|si3|ar91|al2"/>
-      <w:bookmarkEnd w:id="13"/>
-      <w:r>
-        <w:rPr>
-          <w:rStyle w:val="al1"/>
-          <w:rFonts w:eastAsia="Arial" w:cs="Arial" w:ascii="Arial" w:hAnsi="Arial"/>
-          <w:color w:val="auto"/>
-          <w:spacing w:val="0"/>
-          <w:w w:val="100"/>
-          <w:sz w:val="20"/>
-          <w:szCs w:val="20"/>
-          <w:lang w:val="ro-RO"/>
-        </w:rPr>
-        <w:t>(2)</w:t>
-      </w:r>
-      <w:r>
-        <w:rPr>
-          <w:rStyle w:val="al1"/>
-          <w:rFonts w:eastAsia="Arial" w:cs="Arial" w:ascii="Arial" w:hAnsi="Arial"/>
-          <w:b w:val="false"/>
-          <w:color w:val="auto"/>
-          <w:spacing w:val="0"/>
-          <w:w w:val="100"/>
-          <w:sz w:val="20"/>
-          <w:szCs w:val="20"/>
-          <w:lang w:val="ro-RO"/>
-        </w:rPr>
-        <w:t xml:space="preserve"> </w:t>
-      </w:r>
-      <w:r>
-        <w:rPr>
-          <w:rStyle w:val="tal1"/>
-          <w:rFonts w:eastAsia="Arial" w:cs="Arial" w:ascii="Arial" w:hAnsi="Arial"/>
-          <w:color w:val="auto"/>
-          <w:spacing w:val="0"/>
-          <w:w w:val="100"/>
-          <w:sz w:val="20"/>
-          <w:szCs w:val="20"/>
-          <w:lang w:val="ro-RO"/>
-        </w:rPr>
-        <w:t>Fișa de instruire se păstrează de către conducătorul locului de muncă.</w:t>
       </w:r>
     </w:p>
     <w:p>
@@ -13575,7 +13953,7 @@
           <w:szCs w:val="20"/>
           <w:lang w:val="ro-RO"/>
         </w:rPr>
-        <w:t xml:space="preserve">accidentul suferit de orice persoană, ca urmare a unei acțiuni întreprinse din proprie inițiativă pentru salvarea de vieți omenești;</w:t>
+        <w:t xml:space="preserve">accidentul suferit de orice persoană ca urmare a unei acțiuni întreprinse din propria inițiativă pentru salvarea de vieți omenești, precum și accidentul suferit în timpul intervenției de urgență sau al pregătirii în vederea participării la aceasta, pe durata efectuării serviciului de voluntariat organizat conform prevederilor legale;</w:t>
       </w:r>
     </w:p>
     <w:p>
@@ -22947,7 +23325,7 @@
           <w:szCs w:val="20"/>
           <w:lang w:val="ro-RO"/>
         </w:rPr>
-        <w:t>(Preluare din H.G. 1425/ 2006, Art. 56)</w:t>
+        <w:t xml:space="preserve">(Preluare din H.G. 1425/ 2006, Art. 15)</w:t>
       </w:r>
       <w:r>
         <w:rPr>
@@ -23744,7 +24122,7 @@
           <w:szCs w:val="20"/>
           <w:lang w:val="ro-RO"/>
         </w:rPr>
-        <w:t>întocmirea rapoartelor și/ sau a listelor prevăzute de hotărârile Guvernului emise în temeiul, inclusiv cele referitoare la azbest, vibrații, zgomot și șantiere temporare și mobile;</w:t>
+        <w:t xml:space="preserve">întocmirea rapoartelor și/ sau a listelor prevăzute de hotărârile Guvernului emise în temeiul art. 51 alin. (1) lit. b) din Legea 319/ 2006, inclusiv cele referitoare la azbest, vibrații, zgomot și șantiere temporare și mobile;</w:t>
       </w:r>
     </w:p>
     <w:p>
@@ -27979,7 +28357,7 @@
           <w:szCs w:val="20"/>
           <w:lang w:val="ro-RO"/>
         </w:rPr>
-        <w:t xml:space="preserve">Asigurarea mijloacelor tehnice, echipamentelor de protecție, substanțelor chimice de stingere care sunt specifice riscurilor care decurg din existența și funcționarea unității, precum și a medicamentelor și antidotului necesare acordării primului ajutor, conform art. 19, litera n din Legea nr. 307 din 12.07.2006.</w:t>
+        <w:t xml:space="preserve">Asigurarea mijloacelor tehnice, echipamentelor de protecție, substanțelor chimice de stingere care sunt specifice riscurilor care decurg din existența și funcționarea unității, precum și a medicamentelor și antidotului necesare acordării primului ajutor, conform art. 19, alin. (1), litera o din Legea nr. 307 din 12.07.2006.</w:t>
       </w:r>
     </w:p>
     <w:p>
@@ -28510,7 +28888,6 @@
     <w:p>
       <w:pPr>
         <w:pStyle w:val="Normal"/>
-        <w:keepNext/>
         <w:widowControl/>
         <w:numPr>
           <w:ilvl w:val="0"/>
@@ -28527,19 +28904,6 @@
       </w:pPr>
       <w:r>
         <w:rPr>
-          <w:rStyle w:val="tpa1"/>
-          <w:rFonts w:eastAsia="Arial" w:cs="Arial" w:ascii="Arial" w:hAnsi="Arial"/>
-          <w:color w:val="auto"/>
-          <w:spacing w:val="0"/>
-          <w:w w:val="100"/>
-          <w:sz w:val="20"/>
-          <w:szCs w:val="20"/>
-          <w:lang w:val="ro-RO"/>
-        </w:rPr>
-        <w:t>Reprezentanții lucrătorilor cu răspunderi specifice în domeniul securității și sănătății în muncă vor trebui să îndeplinească c</w:t>
-      </w:r>
-      <w:r>
-        <w:rPr>
           <w:rStyle w:val="tal1"/>
           <w:rFonts w:eastAsia="Arial" w:cs="Arial" w:ascii="Arial" w:hAnsi="Arial"/>
           <w:color w:val="auto"/>
@@ -28549,112 +28913,7 @@
           <w:szCs w:val="20"/>
           <w:lang w:val="ro-RO"/>
         </w:rPr>
-        <w:t>erințele minime de pregătire în domeniul securității și sănătății în muncă corespunzătoare nivelului de bază (conform HG 1425/ 2006, art. 48, 55), astfel:</w:t>
-      </w:r>
-    </w:p>
-    <w:p>
-      <w:pPr>
-        <w:pStyle w:val="Normal"/>
-        <w:widowControl/>
-        <w:numPr>
-          <w:ilvl w:val="0"/>
-          <w:numId w:val="41"/>
-        </w:numPr>
-        <w:spacing w:before="0" w:after="40"/>
-        <w:ind w:hanging="360" w:left="1080"/>
-        <w:jc w:val="left"/>
-        <w:rPr>
-          <w:rFonts w:ascii="Arial" w:hAnsi="Arial" w:cs="Arial"/>
-          <w:sz w:val="18"/>
-          <w:szCs w:val="18"/>
-        </w:rPr>
-      </w:pPr>
-      <w:r>
-        <w:rPr>
-          <w:rStyle w:val="tli1"/>
-          <w:rFonts w:eastAsia="Arial" w:cs="Arial" w:ascii="Arial" w:hAnsi="Arial"/>
-          <w:color w:val="auto"/>
-          <w:spacing w:val="0"/>
-          <w:w w:val="100"/>
-          <w:sz w:val="20"/>
-          <w:szCs w:val="20"/>
-          <w:lang w:val="ro-RO"/>
-        </w:rPr>
-        <w:t>studii în învățământul liceal filiera teoretică în profil real sau filiera tehnologică în profil tehnic;</w:t>
-      </w:r>
-    </w:p>
-    <w:p>
-      <w:pPr>
-        <w:pStyle w:val="Normal"/>
-        <w:widowControl/>
-        <w:numPr>
-          <w:ilvl w:val="0"/>
-          <w:numId w:val="41"/>
-        </w:numPr>
-        <w:spacing w:before="0" w:after="40"/>
-        <w:ind w:hanging="360" w:left="1080"/>
-        <w:jc w:val="left"/>
-        <w:rPr>
-          <w:rFonts w:ascii="Arial" w:hAnsi="Arial" w:cs="Arial"/>
-          <w:sz w:val="18"/>
-          <w:szCs w:val="18"/>
-        </w:rPr>
-      </w:pPr>
-      <w:r>
-        <w:rPr>
-          <w:rStyle w:val="tli1"/>
-          <w:rFonts w:eastAsia="Arial" w:cs="Arial" w:ascii="Arial" w:hAnsi="Arial"/>
-          <w:color w:val="auto"/>
-          <w:spacing w:val="0"/>
-          <w:w w:val="100"/>
-          <w:sz w:val="20"/>
-          <w:szCs w:val="20"/>
-          <w:lang w:val="ro-RO"/>
-        </w:rPr>
-        <w:t>curs în domeniul securității și sănătății în muncă, cu conținut minim conform celui prevăzut în anexa nr. 6 lit. A din HG 1425/ 2006, cu o durată de cel puțin 40 de ore;</w:t>
-      </w:r>
-    </w:p>
-    <w:p>
-      <w:pPr>
-        <w:pStyle w:val="Normal"/>
-        <w:widowControl/>
-        <w:numPr>
-          <w:ilvl w:val="0"/>
-          <w:numId w:val="41"/>
-        </w:numPr>
-        <w:spacing w:before="0" w:after="40"/>
-        <w:ind w:hanging="360" w:left="1080"/>
-        <w:jc w:val="left"/>
-        <w:rPr>
-          <w:rFonts w:ascii="Arial" w:hAnsi="Arial" w:cs="Arial"/>
-          <w:sz w:val="18"/>
-          <w:szCs w:val="18"/>
-        </w:rPr>
-      </w:pPr>
-      <w:r>
-        <w:rPr>
-          <w:rFonts w:eastAsia="Arial" w:cs="Arial" w:ascii="Arial" w:hAnsi="Arial"/>
-          <w:color w:val="auto"/>
-          <w:spacing w:val="0"/>
-          <w:w w:val="100"/>
-          <w:sz w:val="20"/>
-          <w:szCs w:val="20"/>
-          <w:lang w:val="ro-RO"/>
-        </w:rPr>
-        <w:t>n</w:t>
-      </w:r>
-      <w:r>
-        <w:rPr>
-          <w:rStyle w:val="tal1"/>
-          <w:rFonts w:eastAsia="Arial" w:cs="Arial" w:ascii="Arial" w:hAnsi="Arial"/>
-          <w:color w:val="auto"/>
-          <w:spacing w:val="0"/>
-          <w:w w:val="100"/>
-          <w:sz w:val="20"/>
-          <w:szCs w:val="20"/>
-          <w:lang w:val="ro-RO"/>
-        </w:rPr>
-        <w:t>ivelul de bază se atestă prin diploma de studii și certificatul de absolvire a cursului.</w:t>
+        <w:t xml:space="preserve">Conform HG 1425/ 2006, art. 55, reprezentanții lucrătorilor cu răspunderi specifice în domeniul securității și sănătății în muncă trebuie să urmeze un program de pregătire în domeniul securității și sănătății în muncă, cu o durată de cel puțin 40 de ore, cu conținutul minim conform celui prevăzut în anexa nr. 6 lit. A; îndeplinirea cerinței se atestă printr-un document de absolvire a programului de pregătire.</w:t>
       </w:r>
     </w:p>
     <w:p>

</xml_diff>

<commit_message>
fix(templates): the employer briefing's act table drops H.G. 261/2001
H.G. 261/2001 (classifying workplaces "în condiții deosebite") was repealed by H.G. 246/2007 art. 16, itself repealed by H.G. 1014/2015; no act in force has that subject. Its row 3 goes and the typed numbers 4–22 become 3–21.

Claude-Session: https://claude.ai/code/session_01A9qjCHVH6kcDAEKFiJoShR
</commit_message>
<xml_diff>
--- a/packages/document-engine/templates/11_employer_briefing.docx
+++ b/packages/document-engine/templates/11_employer_briefing.docx
@@ -15864,147 +15864,6 @@
                 <w:szCs w:val="18"/>
                 <w:lang w:val="ro-RO"/>
               </w:rPr>
-              <w:t>H.G. 261/ 2001</w:t>
-            </w:r>
-          </w:p>
-        </w:tc>
-        <w:tc>
-          <w:tcPr>
-            <w:tcW w:w="6549" w:type="dxa"/>
-            <w:tcBorders>
-              <w:left w:val="single" w:sz="4" w:space="0" w:color="000000"/>
-              <w:bottom w:val="single" w:sz="4" w:space="0" w:color="000000"/>
-              <w:right w:val="single" w:sz="4" w:space="0" w:color="000000"/>
-            </w:tcBorders>
-            <w:vAlign w:val="center"/>
-          </w:tcPr>
-          <w:p>
-            <w:pPr>
-              <w:pStyle w:val="TableContents"/>
-              <w:keepNext w:val="false"/>
-              <w:widowControl/>
-              <w:spacing w:before="0" w:after="0"/>
-              <w:ind w:hanging="0" w:left="0"/>
-              <w:jc w:val="left"/>
-              <w:rPr>
-                <w:rFonts w:ascii="Arial" w:hAnsi="Arial" w:eastAsia="Arial" w:cs="Arial"/>
-                <w:b w:val="false"/>
-                <w:i w:val="false"/>
-                <w:color w:val="auto"/>
-                <w:spacing w:val="0"/>
-                <w:w w:val="100"/>
-                <w:sz w:val="18"/>
-                <w:szCs w:val="18"/>
-                <w:lang w:val="ro-RO"/>
-              </w:rPr>
-            </w:pPr>
-            <w:r>
-              <w:rPr>
-                <w:rFonts w:eastAsia="Arial" w:cs="Arial" w:ascii="Arial" w:hAnsi="Arial"/>
-                <w:b w:val="false"/>
-                <w:i w:val="false"/>
-                <w:color w:val="auto"/>
-                <w:spacing w:val="0"/>
-                <w:w w:val="100"/>
-                <w:sz w:val="18"/>
-                <w:szCs w:val="18"/>
-                <w:lang w:val="ro-RO"/>
-              </w:rPr>
-              <w:t>Privind criteriile și metodologia de încadrare a locurilor de muncă în condiții deosebite</w:t>
-            </w:r>
-          </w:p>
-        </w:tc>
-      </w:tr>
-      <w:tr>
-        <w:trPr>
-          <w:cantSplit/>
-        </w:trPr>
-        <w:tc>
-          <w:tcPr>
-            <w:tcW w:w="654" w:type="dxa"/>
-            <w:tcBorders>
-              <w:left w:val="single" w:sz="4" w:space="0" w:color="000000"/>
-              <w:bottom w:val="single" w:sz="4" w:space="0" w:color="000000"/>
-            </w:tcBorders>
-            <w:vAlign w:val="center"/>
-          </w:tcPr>
-          <w:p>
-            <w:pPr>
-              <w:pStyle w:val="TableContents"/>
-              <w:keepNext w:val="false"/>
-              <w:widowControl/>
-              <w:spacing w:before="0" w:after="0"/>
-              <w:ind w:hanging="0" w:left="0"/>
-              <w:jc w:val="center"/>
-              <w:rPr>
-                <w:rFonts w:ascii="Arial" w:hAnsi="Arial" w:eastAsia="Arial" w:cs="Arial"/>
-                <w:b w:val="false"/>
-                <w:i w:val="false"/>
-                <w:color w:val="auto"/>
-                <w:spacing w:val="0"/>
-                <w:w w:val="100"/>
-                <w:sz w:val="18"/>
-                <w:szCs w:val="18"/>
-                <w:lang w:val="ro-RO"/>
-              </w:rPr>
-            </w:pPr>
-            <w:r>
-              <w:rPr>
-                <w:rFonts w:eastAsia="Arial" w:cs="Arial" w:ascii="Arial" w:hAnsi="Arial"/>
-                <w:b w:val="false"/>
-                <w:i w:val="false"/>
-                <w:color w:val="auto"/>
-                <w:spacing w:val="0"/>
-                <w:w w:val="100"/>
-                <w:sz w:val="18"/>
-                <w:szCs w:val="18"/>
-                <w:lang w:val="ro-RO"/>
-              </w:rPr>
-              <w:t>4.</w:t>
-            </w:r>
-          </w:p>
-        </w:tc>
-        <w:tc>
-          <w:tcPr>
-            <w:tcW w:w="2152" w:type="dxa"/>
-            <w:tcBorders>
-              <w:left w:val="single" w:sz="4" w:space="0" w:color="000000"/>
-              <w:bottom w:val="single" w:sz="4" w:space="0" w:color="000000"/>
-            </w:tcBorders>
-            <w:vAlign w:val="center"/>
-          </w:tcPr>
-          <w:p>
-            <w:pPr>
-              <w:pStyle w:val="TableContents"/>
-              <w:keepNext w:val="false"/>
-              <w:widowControl/>
-              <w:spacing w:before="0" w:after="0"/>
-              <w:ind w:hanging="0" w:left="0"/>
-              <w:jc w:val="center"/>
-              <w:rPr>
-                <w:rFonts w:ascii="Arial" w:hAnsi="Arial" w:eastAsia="Arial" w:cs="Arial"/>
-                <w:b w:val="false"/>
-                <w:i w:val="false"/>
-                <w:color w:val="auto"/>
-                <w:spacing w:val="0"/>
-                <w:w w:val="100"/>
-                <w:sz w:val="18"/>
-                <w:szCs w:val="18"/>
-                <w:lang w:val="ro-RO"/>
-              </w:rPr>
-            </w:pPr>
-            <w:r>
-              <w:rPr>
-                <w:rFonts w:eastAsia="Arial" w:cs="Arial" w:ascii="Arial" w:hAnsi="Arial"/>
-                <w:b w:val="false"/>
-                <w:i w:val="false"/>
-                <w:color w:val="auto"/>
-                <w:spacing w:val="0"/>
-                <w:w w:val="100"/>
-                <w:sz w:val="18"/>
-                <w:szCs w:val="18"/>
-                <w:lang w:val="ro-RO"/>
-              </w:rPr>
               <w:t>H.G. 557/ 2007</w:t>
             </w:r>
           </w:p>
@@ -16101,7 +15960,7 @@
                 <w:szCs w:val="18"/>
                 <w:lang w:val="ro-RO"/>
               </w:rPr>
-              <w:t>5.</w:t>
+              <w:t>4.</w:t>
             </w:r>
           </w:p>
         </w:tc>
@@ -16242,7 +16101,7 @@
                 <w:szCs w:val="18"/>
                 <w:lang w:val="ro-RO"/>
               </w:rPr>
-              <w:t>6.</w:t>
+              <w:t>5.</w:t>
             </w:r>
           </w:p>
         </w:tc>
@@ -16383,7 +16242,7 @@
                 <w:szCs w:val="18"/>
                 <w:lang w:val="ro-RO"/>
               </w:rPr>
-              <w:t>7.</w:t>
+              <w:t>6.</w:t>
             </w:r>
           </w:p>
         </w:tc>
@@ -16524,7 +16383,7 @@
                 <w:szCs w:val="18"/>
                 <w:lang w:val="ro-RO"/>
               </w:rPr>
-              <w:t>8.</w:t>
+              <w:t>7.</w:t>
             </w:r>
           </w:p>
         </w:tc>
@@ -16665,7 +16524,7 @@
                 <w:szCs w:val="18"/>
                 <w:lang w:val="ro-RO"/>
               </w:rPr>
-              <w:t>9.</w:t>
+              <w:t>8.</w:t>
             </w:r>
           </w:p>
         </w:tc>
@@ -16806,7 +16665,7 @@
                 <w:szCs w:val="18"/>
                 <w:lang w:val="ro-RO"/>
               </w:rPr>
-              <w:t>10.</w:t>
+              <w:t>9.</w:t>
             </w:r>
           </w:p>
         </w:tc>
@@ -16947,7 +16806,7 @@
                 <w:szCs w:val="18"/>
                 <w:lang w:val="ro-RO"/>
               </w:rPr>
-              <w:t>11.</w:t>
+              <w:t>10.</w:t>
             </w:r>
           </w:p>
         </w:tc>
@@ -17088,7 +16947,7 @@
                 <w:szCs w:val="18"/>
                 <w:lang w:val="ro-RO"/>
               </w:rPr>
-              <w:t>12.</w:t>
+              <w:t>11.</w:t>
             </w:r>
           </w:p>
         </w:tc>
@@ -17229,7 +17088,7 @@
                 <w:szCs w:val="18"/>
                 <w:lang w:val="ro-RO"/>
               </w:rPr>
-              <w:t>13.</w:t>
+              <w:t>12.</w:t>
             </w:r>
           </w:p>
         </w:tc>
@@ -17370,7 +17229,7 @@
                 <w:szCs w:val="18"/>
                 <w:lang w:val="ro-RO"/>
               </w:rPr>
-              <w:t>14.</w:t>
+              <w:t>13.</w:t>
             </w:r>
           </w:p>
         </w:tc>
@@ -17511,7 +17370,7 @@
                 <w:szCs w:val="18"/>
                 <w:lang w:val="ro-RO"/>
               </w:rPr>
-              <w:t>15.</w:t>
+              <w:t>14.</w:t>
             </w:r>
           </w:p>
         </w:tc>
@@ -17652,7 +17511,7 @@
                 <w:szCs w:val="18"/>
                 <w:lang w:val="ro-RO"/>
               </w:rPr>
-              <w:t>16.</w:t>
+              <w:t>15.</w:t>
             </w:r>
           </w:p>
         </w:tc>
@@ -17793,7 +17652,7 @@
                 <w:szCs w:val="18"/>
                 <w:lang w:val="ro-RO"/>
               </w:rPr>
-              <w:t>17.</w:t>
+              <w:t>16.</w:t>
             </w:r>
           </w:p>
         </w:tc>
@@ -17934,7 +17793,7 @@
                 <w:szCs w:val="18"/>
                 <w:lang w:val="ro-RO"/>
               </w:rPr>
-              <w:t>18.</w:t>
+              <w:t>17.</w:t>
             </w:r>
           </w:p>
         </w:tc>
@@ -18075,7 +17934,7 @@
                 <w:szCs w:val="18"/>
                 <w:lang w:val="ro-RO"/>
               </w:rPr>
-              <w:t>19.</w:t>
+              <w:t>18.</w:t>
             </w:r>
           </w:p>
         </w:tc>
@@ -18216,7 +18075,7 @@
                 <w:szCs w:val="18"/>
                 <w:lang w:val="ro-RO"/>
               </w:rPr>
-              <w:t>20.</w:t>
+              <w:t>19.</w:t>
             </w:r>
           </w:p>
         </w:tc>
@@ -18357,7 +18216,7 @@
                 <w:szCs w:val="18"/>
                 <w:lang w:val="ro-RO"/>
               </w:rPr>
-              <w:t>21.</w:t>
+              <w:t>20.</w:t>
             </w:r>
           </w:p>
         </w:tc>
@@ -18498,7 +18357,7 @@
                 <w:szCs w:val="18"/>
                 <w:lang w:val="ro-RO"/>
               </w:rPr>
-              <w:t>22.</w:t>
+              <w:t>21.</w:t>
             </w:r>
           </w:p>
         </w:tc>

</xml_diff>

<commit_message>
fix(templates): the briefing and the control regulation name the employer, not departments
"Departamentul Resurse umane", "Departamentul SSM-SU-PM", "Cadrul tehnic PSI - SU" and the SSM
officer become the employer or the person the employer designates; the maintenance and technical
departments become the person responsible for maintenance. The client's data has none of them.

Claude-Session: https://claude.ai/code/session_01A9qjCHVH6kcDAEKFiJoShR
</commit_message>
<xml_diff>
--- a/packages/document-engine/templates/11_employer_briefing.docx
+++ b/packages/document-engine/templates/11_employer_briefing.docx
@@ -28098,7 +28098,7 @@
           <w:szCs w:val="20"/>
           <w:lang w:val="ro-RO"/>
         </w:rPr>
-        <w:t>Cadrul tehnic PSI - SU are obligația de întocmire a tematicilor anuale de instruire a lucrătorilor și instruirea acestora în domeniul prevenirii și stingerii incendiilor conform Dispoziției MAI privind instruirea salariaților în domeniul situațiilor de urgență.</w:t>
+        <w:t xml:space="preserve">Angajatorul sau persoana desemnată de acesta are obligația de întocmire a tematicilor anuale de instruire a lucrătorilor și instruirea acestora în domeniul prevenirii și stingerii incendiilor conform Dispoziției MAI privind instruirea salariaților în domeniul situațiilor de urgență.</w:t>
       </w:r>
     </w:p>
     <w:p>
@@ -29156,7 +29156,7 @@
           <w:szCs w:val="20"/>
           <w:lang w:val="ro-RO"/>
         </w:rPr>
-        <w:t xml:space="preserve">procesul-verbal de întrunire a adunării generale a salariaților va fi încheiat în 3 (trei) exemplare, din care un exemplar pentru reprezentanții salariaților, un exemplar la Departamentul Resurse umane și un exemplar la Departamentul SSM-SU-PM;</w:t>
+        <w:t xml:space="preserve">procesul-verbal de întrunire a adunării generale a salariaților va fi încheiat în 3 (trei) exemplare, din care un exemplar pentru reprezentanții salariaților și două exemplare la angajator sau la persoana desemnată de acesta;</w:t>
       </w:r>
     </w:p>
     <w:p>

</xml_diff>

<commit_message>
fix(templates): the employer briefing's Art. 32 does not call itself the own instructions
The sentence, copied from 3.2, said "s-au întocmit prezentele instrucțiuni proprii" in the
briefing; it now says the own instructions were drawn up.

Claude-Session: https://claude.ai/code/session_01A9qjCHVH6kcDAEKFiJoShR
</commit_message>
<xml_diff>
--- a/packages/document-engine/templates/11_employer_briefing.docx
+++ b/packages/document-engine/templates/11_employer_briefing.docx
@@ -9280,7 +9280,7 @@
           <w:szCs w:val="20"/>
           <w:lang w:val="ro-RO"/>
         </w:rPr>
-        <w:t xml:space="preserve">Având în vedere prevederile Legii 319/ 2006, Art. 7, alin. (1), lit. c), Art. 13, lit. e), H.G. 1425/ 2006 Art. 15, alin. (1), punctul 3, Art. 92, s-au întocmit prezentele </w:t>
+        <w:t xml:space="preserve">Având în vedere prevederile Legii 319/ 2006, Art. 7, alin. (1), lit. c), Art. 13, lit. e), H.G. 1425/ 2006 Art. 15, alin. (1), punctul 3, Art. 92, s-au întocmit instrucțiunile proprii privind instruirea lucrătorilor</w:t>
       </w:r>
       <w:r>
         <w:rPr>
@@ -9294,7 +9294,7 @@
           <w:szCs w:val="20"/>
           <w:lang w:val="ro-RO"/>
         </w:rPr>
-        <w:t>instrucțiuni proprii privind instruirea lucrătorilor în domeniul securității și sănătății în muncă,</w:t>
+        <w:t xml:space="preserve"> în domeniul securității și sănătății în muncă,</w:t>
       </w:r>
       <w:r>
         <w:rPr>

</xml_diff>

<commit_message>
fix(templates): the briefing and the own instructions call the own instructions by 3.2's title
"Instrucțiuni proprii în domeniul securității și sănătății în muncă" in the briefing's list of
documents and in the article naming the workplace training material, in 11 and 3.2, instead of
"…privind instruirea lucrătorilor…" and "…pentru locurile de muncă".

Claude-Session: https://claude.ai/code/session_01A9qjCHVH6kcDAEKFiJoShR
</commit_message>
<xml_diff>
--- a/packages/document-engine/templates/11_employer_briefing.docx
+++ b/packages/document-engine/templates/11_employer_briefing.docx
@@ -696,7 +696,7 @@
           <w:szCs w:val="20"/>
           <w:lang w:val="ro-RO"/>
         </w:rPr>
-        <w:t>Instrucțiuni proprii privind instruirea lucrătorilor în domeniul securității și sănătății în muncă (cod IPSSM)</w:t>
+        <w:t xml:space="preserve">Instrucțiuni proprii în domeniul securității și sănătății în muncă (cod IPSSM)</w:t>
       </w:r>
     </w:p>
     <w:p>
@@ -11487,21 +11487,7 @@
           <w:szCs w:val="20"/>
           <w:lang w:val="ro-RO"/>
         </w:rPr>
-        <w:t xml:space="preserve">și poartă denumirea de « </w:t>
-      </w:r>
-      <w:r>
-        <w:rPr>
-          <w:rStyle w:val="tpt1"/>
-          <w:rFonts w:eastAsia="Arial" w:cs="Arial" w:ascii="Arial" w:hAnsi="Arial"/>
-          <w:b/>
-          <w:color w:val="auto"/>
-          <w:spacing w:val="0"/>
-          <w:w w:val="100"/>
-          <w:sz w:val="20"/>
-          <w:szCs w:val="20"/>
-          <w:lang w:val="ro-RO"/>
-        </w:rPr>
-        <w:t>Instrucțiuni proprii în domeniul securității și sănătății în muncă pentru locurile de muncă</w:t>
+        <w:t xml:space="preserve">și poartă denumirea de « Instrucțiuni proprii în domeniul securității și sănătății în muncă »</w:t>
       </w:r>
       <w:r>
         <w:rPr>
@@ -11514,7 +11500,7 @@
           <w:szCs w:val="20"/>
           <w:lang w:val="ro-RO"/>
         </w:rPr>
-        <w:t xml:space="preserve"> », fiind codificat IPSSM.</w:t>
+        <w:t xml:space="preserve">, fiind codificat IPSSM.</w:t>
       </w:r>
     </w:p>
     <w:p>

</xml_diff>

<commit_message>
fix(templates): the employer briefing drops the articles that repeat Art. 6
Arts 3-5 quoted Legea 319/2006 art. 7 alin. (3), (5) and (6), which the next article quotes whole;
only the lead-in citations and "și/sau" spacing differed. Art. 76 pt 23 listed the safety
legislation twice (b and e); e) goes. The briefing's articles from Art. 3 on move up by three.

Claude-Session: https://claude.ai/code/session_01A9qjCHVH6kcDAEKFiJoShR
</commit_message>
<xml_diff>
--- a/packages/document-engine/templates/11_employer_briefing.docx
+++ b/packages/document-engine/templates/11_employer_briefing.docx
@@ -1676,488 +1676,6 @@
           <w:lang w:val="ro-RO"/>
         </w:rPr>
         <w:t xml:space="preserve"> Obligațiile lucrătorilor în domeniul securității și sănătății în muncă nu aduc atingere principiului responsabilității angajatorului.</w:t>
-      </w:r>
-    </w:p>
-    <w:p>
-      <w:pPr>
-        <w:pStyle w:val="Heading1"/>
-        <w:widowControl/>
-        <w:numPr>
-          <w:ilvl w:val="0"/>
-          <w:numId w:val="9"/>
-        </w:numPr>
-        <w:spacing w:before="120" w:after="60"/>
-        <w:jc w:val="left"/>
-        <w:rPr>
-          <w:b w:val="false"/>
-          <w:sz w:val="18"/>
-          <w:szCs w:val="18"/>
-          <w:lang w:val="ro-RO"/>
-        </w:rPr>
-      </w:pPr>
-      <w:r>
-        <w:rPr>
-          <w:rFonts w:eastAsia="Arial" w:cs="Arial" w:ascii="Arial" w:hAnsi="Arial"/>
-          <w:b w:val="false"/>
-          <w:color w:val="auto"/>
-          <w:spacing w:val="0"/>
-          <w:w w:val="100"/>
-          <w:sz w:val="20"/>
-          <w:szCs w:val="20"/>
-          <w:lang w:val="ro-RO"/>
-        </w:rPr>
-        <w:t xml:space="preserve">(Legea 319/ 2006, Art. 7, alin. 3) Angajatorul are obligația să implementeze măsurile prevăzute de Legea 319/ 2006 pe baza următoarelor principii generale de prevenire:</w:t>
-      </w:r>
-    </w:p>
-    <w:p>
-      <w:pPr>
-        <w:pStyle w:val="Normal"/>
-        <w:widowControl/>
-        <w:numPr>
-          <w:ilvl w:val="2"/>
-          <w:numId w:val="9"/>
-        </w:numPr>
-        <w:spacing w:before="0" w:after="40"/>
-        <w:jc w:val="left"/>
-        <w:rPr>
-          <w:rFonts w:ascii="Arial" w:hAnsi="Arial" w:cs="Arial"/>
-          <w:sz w:val="18"/>
-          <w:szCs w:val="18"/>
-          <w:lang w:val="es-ES_tradnl"/>
-        </w:rPr>
-      </w:pPr>
-      <w:r>
-        <w:rPr>
-          <w:rFonts w:eastAsia="Arial" w:cs="Arial" w:ascii="Arial" w:hAnsi="Arial"/>
-          <w:color w:val="auto"/>
-          <w:spacing w:val="0"/>
-          <w:w w:val="100"/>
-          <w:sz w:val="20"/>
-          <w:szCs w:val="20"/>
-          <w:lang w:val="ro-RO"/>
-        </w:rPr>
-        <w:t>evitarea riscurilor;</w:t>
-      </w:r>
-    </w:p>
-    <w:p>
-      <w:pPr>
-        <w:pStyle w:val="Normal"/>
-        <w:widowControl/>
-        <w:numPr>
-          <w:ilvl w:val="2"/>
-          <w:numId w:val="9"/>
-        </w:numPr>
-        <w:spacing w:before="0" w:after="40"/>
-        <w:jc w:val="left"/>
-        <w:rPr>
-          <w:rFonts w:ascii="Arial" w:hAnsi="Arial" w:cs="Arial"/>
-          <w:sz w:val="18"/>
-          <w:szCs w:val="18"/>
-        </w:rPr>
-      </w:pPr>
-      <w:r>
-        <w:rPr>
-          <w:rFonts w:eastAsia="Arial" w:cs="Arial" w:ascii="Arial" w:hAnsi="Arial"/>
-          <w:color w:val="auto"/>
-          <w:spacing w:val="0"/>
-          <w:w w:val="100"/>
-          <w:sz w:val="20"/>
-          <w:szCs w:val="20"/>
-          <w:lang w:val="ro-RO"/>
-        </w:rPr>
-        <w:t>evaluarea riscurilor care nu pot fi evitate;</w:t>
-      </w:r>
-    </w:p>
-    <w:p>
-      <w:pPr>
-        <w:pStyle w:val="Normal"/>
-        <w:widowControl/>
-        <w:numPr>
-          <w:ilvl w:val="2"/>
-          <w:numId w:val="9"/>
-        </w:numPr>
-        <w:spacing w:before="0" w:after="40"/>
-        <w:jc w:val="left"/>
-        <w:rPr>
-          <w:rFonts w:ascii="Arial" w:hAnsi="Arial" w:cs="Arial"/>
-          <w:sz w:val="18"/>
-          <w:szCs w:val="18"/>
-          <w:lang w:val="es-ES_tradnl"/>
-        </w:rPr>
-      </w:pPr>
-      <w:r>
-        <w:rPr>
-          <w:rFonts w:eastAsia="Arial" w:cs="Arial" w:ascii="Arial" w:hAnsi="Arial"/>
-          <w:color w:val="auto"/>
-          <w:spacing w:val="0"/>
-          <w:w w:val="100"/>
-          <w:sz w:val="20"/>
-          <w:szCs w:val="20"/>
-          <w:lang w:val="ro-RO"/>
-        </w:rPr>
-        <w:t>combaterea riscurilor la sursă;</w:t>
-      </w:r>
-    </w:p>
-    <w:p>
-      <w:pPr>
-        <w:pStyle w:val="Normal"/>
-        <w:widowControl/>
-        <w:numPr>
-          <w:ilvl w:val="2"/>
-          <w:numId w:val="9"/>
-        </w:numPr>
-        <w:spacing w:before="0" w:after="40"/>
-        <w:jc w:val="left"/>
-        <w:rPr>
-          <w:rFonts w:ascii="Arial" w:hAnsi="Arial" w:cs="Arial"/>
-          <w:sz w:val="18"/>
-          <w:szCs w:val="18"/>
-          <w:lang w:val="es-ES_tradnl"/>
-        </w:rPr>
-      </w:pPr>
-      <w:r>
-        <w:rPr>
-          <w:rFonts w:eastAsia="Arial" w:cs="Arial" w:ascii="Arial" w:hAnsi="Arial"/>
-          <w:color w:val="auto"/>
-          <w:spacing w:val="0"/>
-          <w:w w:val="100"/>
-          <w:sz w:val="20"/>
-          <w:szCs w:val="20"/>
-          <w:lang w:val="ro-RO"/>
-        </w:rPr>
-        <w:t>adaptarea muncii la om, în special în ceea ce privește proiectarea posturilor de muncă, alegerea echipamentelor de muncă, a metodelor de muncă și de producție, în vederea reducerii monotoniei muncii, a muncii cu ritm predeterminat și a diminuării efectelor acestora asupra sănătății;</w:t>
-      </w:r>
-    </w:p>
-    <w:p>
-      <w:pPr>
-        <w:pStyle w:val="Normal"/>
-        <w:widowControl/>
-        <w:numPr>
-          <w:ilvl w:val="2"/>
-          <w:numId w:val="9"/>
-        </w:numPr>
-        <w:spacing w:before="0" w:after="40"/>
-        <w:jc w:val="left"/>
-        <w:rPr>
-          <w:rFonts w:ascii="Arial" w:hAnsi="Arial" w:cs="Arial"/>
-          <w:sz w:val="18"/>
-          <w:szCs w:val="18"/>
-          <w:lang w:val="es-ES_tradnl"/>
-        </w:rPr>
-      </w:pPr>
-      <w:r>
-        <w:rPr>
-          <w:rFonts w:eastAsia="Arial" w:cs="Arial" w:ascii="Arial" w:hAnsi="Arial"/>
-          <w:color w:val="auto"/>
-          <w:spacing w:val="0"/>
-          <w:w w:val="100"/>
-          <w:sz w:val="20"/>
-          <w:szCs w:val="20"/>
-          <w:lang w:val="ro-RO"/>
-        </w:rPr>
-        <w:t>adaptarea la progresul tehnic;</w:t>
-      </w:r>
-    </w:p>
-    <w:p>
-      <w:pPr>
-        <w:pStyle w:val="Normal"/>
-        <w:widowControl/>
-        <w:numPr>
-          <w:ilvl w:val="2"/>
-          <w:numId w:val="9"/>
-        </w:numPr>
-        <w:spacing w:before="0" w:after="40"/>
-        <w:jc w:val="left"/>
-        <w:rPr>
-          <w:rFonts w:ascii="Arial" w:hAnsi="Arial" w:cs="Arial"/>
-          <w:sz w:val="18"/>
-          <w:szCs w:val="18"/>
-          <w:lang w:val="es-ES_tradnl"/>
-        </w:rPr>
-      </w:pPr>
-      <w:r>
-        <w:rPr>
-          <w:rFonts w:eastAsia="Arial" w:cs="Arial" w:ascii="Arial" w:hAnsi="Arial"/>
-          <w:color w:val="auto"/>
-          <w:spacing w:val="0"/>
-          <w:w w:val="100"/>
-          <w:sz w:val="20"/>
-          <w:szCs w:val="20"/>
-          <w:lang w:val="ro-RO"/>
-        </w:rPr>
-        <w:t>înlocuirea a ceea ce este periculos cu ceea ce nu este periculos sau cu ceea ce este mai puțin periculos;</w:t>
-      </w:r>
-    </w:p>
-    <w:p>
-      <w:pPr>
-        <w:pStyle w:val="Normal"/>
-        <w:widowControl/>
-        <w:numPr>
-          <w:ilvl w:val="2"/>
-          <w:numId w:val="9"/>
-        </w:numPr>
-        <w:spacing w:before="0" w:after="40"/>
-        <w:jc w:val="left"/>
-        <w:rPr>
-          <w:rFonts w:ascii="Arial" w:hAnsi="Arial" w:cs="Arial"/>
-          <w:sz w:val="18"/>
-          <w:szCs w:val="18"/>
-          <w:lang w:val="es-ES_tradnl"/>
-        </w:rPr>
-      </w:pPr>
-      <w:r>
-        <w:rPr>
-          <w:rFonts w:eastAsia="Arial" w:cs="Arial" w:ascii="Arial" w:hAnsi="Arial"/>
-          <w:color w:val="auto"/>
-          <w:spacing w:val="0"/>
-          <w:w w:val="100"/>
-          <w:sz w:val="20"/>
-          <w:szCs w:val="20"/>
-          <w:lang w:val="ro-RO"/>
-        </w:rPr>
-        <w:t>dezvoltarea unei politici de prevenire coerente care să cuprindă tehnologiile, organizarea muncii, condițiile de muncă, relațiile sociale și influența factorilor din mediul de muncă;</w:t>
-      </w:r>
-    </w:p>
-    <w:p>
-      <w:pPr>
-        <w:pStyle w:val="Normal"/>
-        <w:widowControl/>
-        <w:numPr>
-          <w:ilvl w:val="2"/>
-          <w:numId w:val="9"/>
-        </w:numPr>
-        <w:spacing w:before="0" w:after="40"/>
-        <w:jc w:val="left"/>
-        <w:rPr>
-          <w:rFonts w:ascii="Arial" w:hAnsi="Arial" w:cs="Arial"/>
-          <w:sz w:val="18"/>
-          <w:szCs w:val="18"/>
-          <w:lang w:val="es-ES_tradnl"/>
-        </w:rPr>
-      </w:pPr>
-      <w:r>
-        <w:rPr>
-          <w:rFonts w:eastAsia="Arial" w:cs="Arial" w:ascii="Arial" w:hAnsi="Arial"/>
-          <w:color w:val="auto"/>
-          <w:spacing w:val="0"/>
-          <w:w w:val="100"/>
-          <w:sz w:val="20"/>
-          <w:szCs w:val="20"/>
-          <w:lang w:val="ro-RO"/>
-        </w:rPr>
-        <w:t>adoptarea, în mod prioritar, a măsurilor de protecție colectivă față de măsurile de protecție individuală;</w:t>
-      </w:r>
-    </w:p>
-    <w:p>
-      <w:pPr>
-        <w:pStyle w:val="Normal"/>
-        <w:widowControl/>
-        <w:numPr>
-          <w:ilvl w:val="2"/>
-          <w:numId w:val="9"/>
-        </w:numPr>
-        <w:spacing w:before="0" w:after="120"/>
-        <w:jc w:val="left"/>
-        <w:rPr>
-          <w:rFonts w:ascii="Arial" w:hAnsi="Arial" w:cs="Arial"/>
-          <w:sz w:val="18"/>
-          <w:szCs w:val="18"/>
-          <w:lang w:val="es-ES_tradnl"/>
-        </w:rPr>
-      </w:pPr>
-      <w:r>
-        <w:rPr>
-          <w:rFonts w:eastAsia="Arial" w:cs="Arial" w:ascii="Arial" w:hAnsi="Arial"/>
-          <w:color w:val="auto"/>
-          <w:spacing w:val="0"/>
-          <w:w w:val="100"/>
-          <w:sz w:val="20"/>
-          <w:szCs w:val="20"/>
-          <w:lang w:val="ro-RO"/>
-        </w:rPr>
-        <w:t>furnizarea de instrucțiuni corespunzătoare lucrătorilor.</w:t>
-      </w:r>
-    </w:p>
-    <w:p>
-      <w:pPr>
-        <w:pStyle w:val="Heading1"/>
-        <w:widowControl/>
-        <w:numPr>
-          <w:ilvl w:val="0"/>
-          <w:numId w:val="9"/>
-        </w:numPr>
-        <w:spacing w:before="120" w:after="60"/>
-        <w:jc w:val="left"/>
-        <w:rPr>
-          <w:b w:val="false"/>
-          <w:sz w:val="18"/>
-          <w:szCs w:val="18"/>
-          <w:lang w:val="ro-RO"/>
-        </w:rPr>
-      </w:pPr>
-      <w:r>
-        <w:rPr>
-          <w:rFonts w:eastAsia="Arial" w:cs="Arial" w:ascii="Arial" w:hAnsi="Arial"/>
-          <w:b w:val="false"/>
-          <w:color w:val="auto"/>
-          <w:spacing w:val="0"/>
-          <w:w w:val="100"/>
-          <w:sz w:val="20"/>
-          <w:szCs w:val="20"/>
-          <w:lang w:val="ro-RO"/>
-        </w:rPr>
-        <w:t>(Legea 319/ 2006, Art. 7, alin. 5) Fără a aduce atingere altor prevederi ale prezentei legi, atunci când în același loc de muncă își desfășoară activitatea lucrători din mai multe întreprinderi și/sau unități, angajatorii acestora au următoarele obligații:</w:t>
-      </w:r>
-    </w:p>
-    <w:p>
-      <w:pPr>
-        <w:pStyle w:val="Normal"/>
-        <w:widowControl/>
-        <w:numPr>
-          <w:ilvl w:val="2"/>
-          <w:numId w:val="9"/>
-        </w:numPr>
-        <w:spacing w:before="0" w:after="40"/>
-        <w:jc w:val="left"/>
-        <w:rPr>
-          <w:rFonts w:ascii="Arial" w:hAnsi="Arial" w:cs="Arial"/>
-          <w:sz w:val="18"/>
-          <w:szCs w:val="18"/>
-          <w:lang w:val="es-ES_tradnl"/>
-        </w:rPr>
-      </w:pPr>
-      <w:r>
-        <w:rPr>
-          <w:rFonts w:eastAsia="Arial" w:cs="Arial" w:ascii="Arial" w:hAnsi="Arial"/>
-          <w:color w:val="auto"/>
-          <w:spacing w:val="0"/>
-          <w:w w:val="100"/>
-          <w:sz w:val="20"/>
-          <w:szCs w:val="20"/>
-          <w:lang w:val="ro-RO"/>
-        </w:rPr>
-        <w:t>să coopereze în vederea implementării prevederilor privind securitatea, sănătatea și igiena în muncă, luând în considerare natura activităților;</w:t>
-      </w:r>
-    </w:p>
-    <w:p>
-      <w:pPr>
-        <w:pStyle w:val="Normal"/>
-        <w:widowControl/>
-        <w:numPr>
-          <w:ilvl w:val="2"/>
-          <w:numId w:val="9"/>
-        </w:numPr>
-        <w:spacing w:before="0" w:after="40"/>
-        <w:jc w:val="left"/>
-        <w:rPr>
-          <w:rFonts w:ascii="Arial" w:hAnsi="Arial" w:cs="Arial"/>
-          <w:sz w:val="18"/>
-          <w:szCs w:val="18"/>
-          <w:lang w:val="es-ES_tradnl"/>
-        </w:rPr>
-      </w:pPr>
-      <w:r>
-        <w:rPr>
-          <w:rFonts w:eastAsia="Arial" w:cs="Arial" w:ascii="Arial" w:hAnsi="Arial"/>
-          <w:color w:val="auto"/>
-          <w:spacing w:val="0"/>
-          <w:w w:val="100"/>
-          <w:sz w:val="20"/>
-          <w:szCs w:val="20"/>
-          <w:lang w:val="ro-RO"/>
-        </w:rPr>
-        <w:t>să își coordoneze acțiunile în vederea protecției lucrătorilor și prevenirii riscurilor profesionale, luând în considerare natura activităților;</w:t>
-      </w:r>
-    </w:p>
-    <w:p>
-      <w:pPr>
-        <w:pStyle w:val="Normal"/>
-        <w:widowControl/>
-        <w:numPr>
-          <w:ilvl w:val="2"/>
-          <w:numId w:val="9"/>
-        </w:numPr>
-        <w:spacing w:before="0" w:after="40"/>
-        <w:jc w:val="left"/>
-        <w:rPr>
-          <w:rFonts w:ascii="Arial" w:hAnsi="Arial" w:cs="Arial"/>
-          <w:sz w:val="18"/>
-          <w:szCs w:val="18"/>
-          <w:lang w:val="es-ES_tradnl"/>
-        </w:rPr>
-      </w:pPr>
-      <w:r>
-        <w:rPr>
-          <w:rFonts w:eastAsia="Arial" w:cs="Arial" w:ascii="Arial" w:hAnsi="Arial"/>
-          <w:color w:val="auto"/>
-          <w:spacing w:val="0"/>
-          <w:w w:val="100"/>
-          <w:sz w:val="20"/>
-          <w:szCs w:val="20"/>
-          <w:lang w:val="ro-RO"/>
-        </w:rPr>
-        <w:t>să se informeze reciproc despre riscurile profesionale;</w:t>
-      </w:r>
-    </w:p>
-    <w:p>
-      <w:pPr>
-        <w:pStyle w:val="Normal"/>
-        <w:widowControl/>
-        <w:numPr>
-          <w:ilvl w:val="2"/>
-          <w:numId w:val="9"/>
-        </w:numPr>
-        <w:spacing w:before="0" w:after="120"/>
-        <w:jc w:val="left"/>
-        <w:rPr>
-          <w:rFonts w:ascii="Arial" w:hAnsi="Arial" w:cs="Arial"/>
-          <w:sz w:val="18"/>
-          <w:szCs w:val="18"/>
-          <w:lang w:val="es-ES_tradnl"/>
-        </w:rPr>
-      </w:pPr>
-      <w:r>
-        <w:rPr>
-          <w:rFonts w:eastAsia="Arial" w:cs="Arial" w:ascii="Arial" w:hAnsi="Arial"/>
-          <w:color w:val="auto"/>
-          <w:spacing w:val="0"/>
-          <w:w w:val="100"/>
-          <w:sz w:val="20"/>
-          <w:szCs w:val="20"/>
-          <w:lang w:val="ro-RO"/>
-        </w:rPr>
-        <w:t>să informeze lucrătorii și/sau reprezentanții acestora despre riscurile profesionale.</w:t>
-      </w:r>
-    </w:p>
-    <w:p>
-      <w:pPr>
-        <w:pStyle w:val="Heading1"/>
-        <w:widowControl/>
-        <w:numPr>
-          <w:ilvl w:val="0"/>
-          <w:numId w:val="9"/>
-        </w:numPr>
-        <w:spacing w:before="120" w:after="60"/>
-        <w:jc w:val="left"/>
-        <w:rPr>
-          <w:b w:val="false"/>
-          <w:sz w:val="18"/>
-          <w:szCs w:val="18"/>
-          <w:lang w:val="ro-RO"/>
-        </w:rPr>
-      </w:pPr>
-      <w:r>
-        <w:rPr>
-          <w:rFonts w:eastAsia="Arial" w:cs="Arial" w:ascii="Arial" w:hAnsi="Arial"/>
-          <w:b w:val="false"/>
-          <w:color w:val="auto"/>
-          <w:spacing w:val="0"/>
-          <w:w w:val="100"/>
-          <w:sz w:val="20"/>
-          <w:szCs w:val="20"/>
-          <w:lang w:val="ro-RO"/>
-        </w:rPr>
-        <w:t>(Legea 319/ 2006, Art. 7, alin. 6) Măsurile privind securitatea, sănătatea și igiena în muncă nu trebuie să comporte în nicio situație obligații financiare pentru lucrători.</w:t>
       </w:r>
     </w:p>
     <w:p>
@@ -27801,36 +27319,6 @@
           <w:szCs w:val="20"/>
           <w:lang w:val="ro-RO"/>
         </w:rPr>
-        <w:t>legislația de sănătate și securitate în muncă;</w:t>
-      </w:r>
-    </w:p>
-    <w:p>
-      <w:pPr>
-        <w:pStyle w:val="Normal"/>
-        <w:widowControl/>
-        <w:numPr>
-          <w:ilvl w:val="0"/>
-          <w:numId w:val="45"/>
-        </w:numPr>
-        <w:spacing w:before="0" w:after="40"/>
-        <w:ind w:hanging="360" w:left="1080"/>
-        <w:jc w:val="left"/>
-        <w:rPr>
-          <w:rFonts w:ascii="Arial" w:hAnsi="Arial" w:cs="Arial"/>
-          <w:sz w:val="18"/>
-          <w:szCs w:val="18"/>
-        </w:rPr>
-      </w:pPr>
-      <w:r>
-        <w:rPr>
-          <w:rFonts w:eastAsia="Arial" w:cs="Arial" w:ascii="Arial" w:hAnsi="Arial"/>
-          <w:color w:val="auto"/>
-          <w:spacing w:val="0"/>
-          <w:w w:val="100"/>
-          <w:sz w:val="20"/>
-          <w:szCs w:val="20"/>
-          <w:lang w:val="ro-RO"/>
-        </w:rPr>
         <w:t>instrucțiunile proprii la nivelul societății;</w:t>
       </w:r>
     </w:p>

</xml_diff>

<commit_message>
fix(templates): the employer briefing drops a legal portal's link markup
"<LLNK 12002 346 10 201 0 18>" was printed before "Legii nr. 346/ 2002".

Claude-Session: https://claude.ai/code/session_01A9qjCHVH6kcDAEKFiJoShR
</commit_message>
<xml_diff>
--- a/packages/document-engine/templates/11_employer_briefing.docx
+++ b/packages/document-engine/templates/11_employer_briefing.docx
@@ -12806,32 +12806,19 @@
           <w:szCs w:val="20"/>
           <w:lang w:val="ro-RO"/>
         </w:rPr>
-        <w:t xml:space="preserve">asigurătorului, potrivit </w:t>
-      </w:r>
-      <w:r>
-        <w:rPr>
-          <w:rFonts w:eastAsia="Arial" w:cs="Arial" w:ascii="Arial" w:hAnsi="Arial"/>
-          <w:vanish/>
-          <w:color w:val="auto"/>
-          <w:spacing w:val="0"/>
-          <w:w w:val="100"/>
-          <w:sz w:val="20"/>
-          <w:szCs w:val="20"/>
-          <w:lang w:val="ro-RO"/>
-        </w:rPr>
-        <w:t>&lt;LLNK 12002 346 10 201 0 18&gt;</w:t>
-      </w:r>
-      <w:r>
-        <w:rPr>
-          <w:rFonts w:eastAsia="Arial" w:cs="Arial" w:ascii="Arial" w:hAnsi="Arial"/>
-          <w:color w:val="auto"/>
-          <w:spacing w:val="0"/>
-          <w:w w:val="100"/>
-          <w:sz w:val="20"/>
-          <w:szCs w:val="20"/>
-          <w:lang w:val="ro-RO"/>
-        </w:rPr>
-        <w:t>Legii nr. 346/ 2002 privind asigurarea pentru accidente de muncă și boli profesionale, cu modificările și completările ulterioare, evenimentele urmate de incapacitate temporară de muncă, invaliditate sau deces, la confirmarea acestora;</w:t>
+        <w:t xml:space="preserve">asigurătorului, potrivit Legii nr. 346/ 2002</w:t>
+      </w:r>
+      <w:r>
+        <w:rPr>
+          <w:rFonts w:eastAsia="Arial" w:cs="Arial" w:ascii="Arial" w:hAnsi="Arial"/>
+          <w:color w:val="auto"/>
+          <w:spacing w:val="0"/>
+          <w:w w:val="100"/>
+          <w:sz w:val="20"/>
+          <w:szCs w:val="20"/>
+          <w:lang w:val="ro-RO"/>
+        </w:rPr>
+        <w:t xml:space="preserve"> privind asigurarea pentru accidente de muncă și boli profesionale, cu modificările și completările ulterioare, evenimentele urmate de incapacitate temporară de muncă, invaliditate sau deces, la confirmarea acestora;</w:t>
       </w:r>
     </w:p>
     <w:p>

</xml_diff>

<commit_message>
fix(templates): the employer briefing's maternity points name the employees instead of another regulation's articles
Claude-Session: https://claude.ai/code/session_01A9qjCHVH6kcDAEKFiJoShR
</commit_message>
<xml_diff>
--- a/packages/document-engine/templates/11_employer_briefing.docx
+++ b/packages/document-engine/templates/11_employer_briefing.docx
@@ -22152,7 +22152,7 @@
           <w:szCs w:val="20"/>
           <w:lang w:val="ro-RO"/>
         </w:rPr>
-        <w:t xml:space="preserve">De asemenea, în scopul realizării obiectivelor prevăzute la art. 3, lit. a) și c) din prezenta anexă, lucrătorii au următoarele obligații:</w:t>
+        <w:t xml:space="preserve">De asemenea, pentru realizarea instruirii în domeniul situațiilor de urgență, lucrătorii au următoarele obligații:</w:t>
       </w:r>
     </w:p>
     <w:p>
@@ -25643,7 +25643,7 @@
           <w:szCs w:val="20"/>
           <w:lang w:val="ro-RO"/>
         </w:rPr>
-        <w:t xml:space="preserve">să asigure securitatea și sănătatea în muncă a salariatelor gravide și/sau mame, lăuze sau care alăptează conform OUG nr. 96/2003 privind protecția maternității la locurile de muncă conform prevederilor capitolului 12.</w:t>
+        <w:t xml:space="preserve">să asigure securitatea și sănătatea în muncă a salariatelor gravide și/sau mame, lăuze sau care alăptează conform OUG nr. 96/2003 privind protecția maternității la locurile de muncă.</w:t>
       </w:r>
     </w:p>
     <w:p>
@@ -30811,7 +30811,7 @@
           <w:szCs w:val="20"/>
           <w:lang w:val="ro-RO"/>
         </w:rPr>
-        <w:t>Salariatele prevăzute la Art. 54 lit. a, b, c, din prezentul regulament au următoarele obligații:</w:t>
+        <w:t xml:space="preserve">Salariatele gravide, lăuze sau care alăptează au următoarele obligații:</w:t>
       </w:r>
     </w:p>
     <w:p>
@@ -31024,7 +31024,7 @@
           <w:szCs w:val="20"/>
           <w:lang w:val="ro-RO"/>
         </w:rPr>
-        <w:t>În termen de 10 zile lucrătoare de la data la care angajatorul a fost anunțat în scris de către o salariată că se află în una dintre situațiile prevăzute la Art.</w:t>
+        <w:t xml:space="preserve">În termen de 10 zile lucrătoare de la data la care angajatorul a fost anunțat în scris de către o salariată că se află în una dintre situațiile prevăzute la art. 2 lit. c)–e) din O.U.G. nr. 96/ 2003, acesta</w:t>
       </w:r>
       <w:r>
         <w:rPr>
@@ -31037,7 +31037,7 @@
           <w:szCs w:val="20"/>
           <w:lang w:val="ro-RO"/>
         </w:rPr>
-        <w:t xml:space="preserve"> 54 lit. a, b, c, din prezentul regulament</w:t>
+        <w:t xml:space="preserve"/>
       </w:r>
       <w:r>
         <w:rPr>
@@ -31050,7 +31050,7 @@
           <w:szCs w:val="20"/>
           <w:lang w:val="ro-RO"/>
         </w:rPr>
-        <w:t>, acesta are obligația să înștiințeze medicul de medicina muncii, precum și inspectoratul teritorial de muncă pe a cărui rază își desfășoară activitatea.</w:t>
+        <w:t xml:space="preserve"> are obligația să înștiințeze medicul de medicina muncii, precum și inspectoratul teritorial de muncă pe a cărui rază își desfășoară activitatea.</w:t>
       </w:r>
     </w:p>
     <w:p>
@@ -31118,7 +31118,7 @@
           <w:szCs w:val="20"/>
           <w:lang w:val="ro-RO"/>
         </w:rPr>
-        <w:t>să prevină expunerea salariatelor prevăzute la Art.</w:t>
+        <w:t xml:space="preserve">să prevină expunerea salariatelor gravide, lăuze sau care alăptează la riscuri</w:t>
       </w:r>
       <w:r>
         <w:rPr>
@@ -31131,7 +31131,7 @@
           <w:szCs w:val="20"/>
           <w:lang w:val="ro-RO"/>
         </w:rPr>
-        <w:t xml:space="preserve"> 54 lit. a, b, c, din prezentul regulament</w:t>
+        <w:t xml:space="preserve"/>
       </w:r>
       <w:r>
         <w:rPr>
@@ -31144,7 +31144,7 @@
           <w:szCs w:val="20"/>
           <w:lang w:val="ro-RO"/>
         </w:rPr>
-        <w:t xml:space="preserve"> </w:t>
+        <w:t xml:space="preserve"/>
       </w:r>
       <w:r>
         <w:rPr>
@@ -31157,7 +31157,7 @@
           <w:szCs w:val="20"/>
           <w:lang w:val="ro-RO"/>
         </w:rPr>
-        <w:t>la riscuri ce le pot afecta sănătatea și securitatea, în situația în care rezultatele evaluării evidențiază astfel de riscuri;</w:t>
+        <w:t xml:space="preserve"> ce le pot afecta sănătatea și securitatea, în situația în care rezultatele evaluării evidențiază astfel de riscuri;</w:t>
       </w:r>
     </w:p>
     <w:p>
@@ -31257,7 +31257,7 @@
           <w:szCs w:val="20"/>
           <w:lang w:val="ro-RO"/>
         </w:rPr>
-        <w:t xml:space="preserve">să modifice locul de muncă al salariatelor prevăzute la </w:t>
+        <w:t xml:space="preserve">să modifice locul de muncă al salariatelor gravide, lăuze sau care alăptează, care își</w:t>
       </w:r>
       <w:r>
         <w:rPr>
@@ -31270,7 +31270,7 @@
           <w:szCs w:val="20"/>
           <w:lang w:val="ro-RO"/>
         </w:rPr>
-        <w:t>Art.</w:t>
+        <w:t xml:space="preserve"/>
       </w:r>
       <w:r>
         <w:rPr>
@@ -31283,7 +31283,7 @@
           <w:szCs w:val="20"/>
           <w:lang w:val="ro-RO"/>
         </w:rPr>
-        <w:t xml:space="preserve"> 54 lit. a, b, c, din prezentul regulament</w:t>
+        <w:t xml:space="preserve"/>
       </w:r>
       <w:r>
         <w:rPr>
@@ -31296,7 +31296,7 @@
           <w:szCs w:val="20"/>
           <w:lang w:val="ro-RO"/>
         </w:rPr>
-        <w:t xml:space="preserve"> care </w:t>
+        <w:t xml:space="preserve"/>
       </w:r>
       <w:r>
         <w:rPr>
@@ -31309,7 +31309,7 @@
           <w:szCs w:val="20"/>
           <w:lang w:val="ro-RO"/>
         </w:rPr>
-        <w:t>își desfășoară activitatea numai în poziția ortostatică sau în poziția așezat, astfel încât să li se asigure, la intervale regulate de timp, pauze și amenajări pentru repaus în poziție șezândă sau, respectiv, pentru mișcare, la recomandarea medicului de medicina muncii;</w:t>
+        <w:t xml:space="preserve"> desfășoară activitatea numai în poziția ortostatică sau în poziția așezat, astfel încât să li se asigure, la intervale regulate de timp, pauze și amenajări pentru repaus în poziție șezândă sau, respectiv, pentru mișcare, la recomandarea medicului de medicina muncii;</w:t>
       </w:r>
     </w:p>
     <w:p>
@@ -31408,7 +31408,7 @@
           <w:szCs w:val="20"/>
           <w:lang w:val="ro-RO"/>
         </w:rPr>
-        <w:t>să transfere la un alt loc de muncă, cu menținerea salariului de bază brut lunar, salariatele prevăzute la Art.</w:t>
+        <w:t xml:space="preserve">să transfere la un alt loc de muncă, cu menținerea salariului de bază brut lunar, salariatele gravide, lăuze sau care alăptează, care desfășoară</w:t>
       </w:r>
       <w:r>
         <w:rPr>
@@ -31421,7 +31421,7 @@
           <w:szCs w:val="20"/>
           <w:lang w:val="ro-RO"/>
         </w:rPr>
-        <w:t xml:space="preserve"> 54 lit. a, b, c, </w:t>
+        <w:t xml:space="preserve"/>
       </w:r>
       <w:r>
         <w:rPr>
@@ -31434,7 +31434,7 @@
           <w:szCs w:val="20"/>
           <w:lang w:val="ro-RO"/>
         </w:rPr>
-        <w:t>care desfășoară în mod curent muncă cu caracter insalubru sau greu de suportat.</w:t>
+        <w:t xml:space="preserve"> în mod curent muncă cu caracter insalubru sau greu de suportat.</w:t>
       </w:r>
     </w:p>
     <w:p>
@@ -31466,7 +31466,7 @@
           <w:szCs w:val="20"/>
           <w:lang w:val="ro-RO"/>
         </w:rPr>
-        <w:t xml:space="preserve">Pentru salariatele prevăzute la </w:t>
+        <w:t xml:space="preserve">Pentru salariatele gravide, lăuze sau care alăptează, care desfășoară</w:t>
       </w:r>
       <w:r>
         <w:rPr>
@@ -31479,7 +31479,7 @@
           <w:szCs w:val="20"/>
           <w:lang w:val="ro-RO"/>
         </w:rPr>
-        <w:t>Art.</w:t>
+        <w:t xml:space="preserve"/>
       </w:r>
       <w:r>
         <w:rPr>
@@ -31492,7 +31492,7 @@
           <w:szCs w:val="20"/>
           <w:lang w:val="ro-RO"/>
         </w:rPr>
-        <w:t xml:space="preserve"> 54 lit. a, b, c, din prezentul regulament</w:t>
+        <w:t xml:space="preserve"/>
       </w:r>
       <w:r>
         <w:rPr>
@@ -31505,7 +31505,7 @@
           <w:szCs w:val="20"/>
           <w:lang w:val="ro-RO"/>
         </w:rPr>
-        <w:t xml:space="preserve"> care desfășoară activitate care </w:t>
+        <w:t xml:space="preserve"> activitate care </w:t>
       </w:r>
       <w:r>
         <w:rPr>
@@ -31562,7 +31562,7 @@
           <w:szCs w:val="20"/>
           <w:lang w:val="ro-RO"/>
         </w:rPr>
-        <w:t>În cazul în care angajatorul, din motive justificate în mod obiectiv, nu poate să îndeplinească obligația prevăzută la Art. 60, salariatele prevăzute la Art.</w:t>
+        <w:t xml:space="preserve">În cazul în care angajatorul, din motive justificate în mod obiectiv, nu poate să îndeplinească obligația prevăzută la art. 9 alin. (2) din O.U.G. nr. 96/ 2003 (punctul 9 de mai sus), salariatele gravide, lăuze sau care alăptează au dreptul</w:t>
       </w:r>
       <w:r>
         <w:rPr>
@@ -31575,7 +31575,7 @@
           <w:szCs w:val="20"/>
           <w:lang w:val="ro-RO"/>
         </w:rPr>
-        <w:t xml:space="preserve"> 54 lit. a, b, c, din prezentul regulament</w:t>
+        <w:t xml:space="preserve"/>
       </w:r>
       <w:r>
         <w:rPr>
@@ -31588,7 +31588,7 @@
           <w:szCs w:val="20"/>
           <w:lang w:val="ro-RO"/>
         </w:rPr>
-        <w:t xml:space="preserve"> au dreptul la concediu de risc maternal, numai dacă solicitarea este însoțită de documentul medical, astfel:</w:t>
+        <w:t xml:space="preserve"> la concediu de risc maternal, numai dacă solicitarea este însoțită de documentul medical, astfel:</w:t>
       </w:r>
     </w:p>
     <w:p>

</xml_diff>

<commit_message>
fix(templates): the employer briefing prints the representatives' hours scale once
Art. 73 printed H.G. 1425/2006 art. 61(2)'s scale ("2 ore pe lună … 20 de ore
pe lună") twice: in pt 39, "Angajatorul va acorda fiecărui reprezentant al
lucrătorilor în comitetele de securitate și sănătate în muncă timpul
necesar…", and in pt 46, "Fiecărui reprezentant al lucrătorilor în
comitetele de securitate și sănătate în muncă i se va acorda timpul necesar
exercitării atribuțiilor specifice în domeniul securității și sănătății în
muncă. Conform H.G. 1425/ 2006, art. 61 alin. (2), …". Pt 46 said nothing
pt 39 does not, so it is gone with its scale; the points after it renumber
(47–50) and nothing in the document refers to them by number.

Claude-Session: https://claude.ai/code/session_01A9qjCHVH6kcDAEKFiJoShR
</commit_message>
<xml_diff>
--- a/packages/document-engine/templates/11_employer_briefing.docx
+++ b/packages/document-engine/templates/11_employer_briefing.docx
@@ -28950,199 +28950,6 @@
     <w:p>
       <w:pPr>
         <w:pStyle w:val="Normal"/>
-        <w:keepNext/>
-        <w:widowControl/>
-        <w:numPr>
-          <w:ilvl w:val="0"/>
-          <w:numId w:val="7"/>
-        </w:numPr>
-        <w:spacing w:before="0" w:after="40"/>
-        <w:jc w:val="left"/>
-        <w:rPr>
-          <w:rFonts w:ascii="Arial" w:hAnsi="Arial" w:cs="Arial"/>
-          <w:sz w:val="18"/>
-          <w:szCs w:val="18"/>
-          <w:lang w:val="it-IT"/>
-        </w:rPr>
-      </w:pPr>
-      <w:r>
-        <w:rPr>
-          <w:rStyle w:val="al1"/>
-          <w:rFonts w:eastAsia="Arial" w:cs="Arial" w:ascii="Arial" w:hAnsi="Arial"/>
-          <w:b w:val="false"/>
-          <w:color w:val="auto"/>
-          <w:spacing w:val="0"/>
-          <w:w w:val="100"/>
-          <w:sz w:val="20"/>
-          <w:szCs w:val="20"/>
-          <w:lang w:val="ro-RO"/>
-        </w:rPr>
-        <w:t xml:space="preserve">Fiecărui reprezentant al lucrătorilor în comitetele de securitate și sănătate în muncă i se va acorda timpul necesar exercitării atribuțiilor specifice în domeniul securității și sănătății în muncă. Conform H.G. 1425/ 2006, art. 61 alin. (2), timpul alocat acestei activități va fi considerat timp de muncă și va fi de cel puțin:</w:t>
-      </w:r>
-    </w:p>
-    <w:p>
-      <w:pPr>
-        <w:pStyle w:val="Normal"/>
-        <w:widowControl/>
-        <w:numPr>
-          <w:ilvl w:val="3"/>
-          <w:numId w:val="7"/>
-        </w:numPr>
-        <w:spacing w:before="0" w:after="40"/>
-        <w:ind w:hanging="360" w:left="1080"/>
-        <w:jc w:val="left"/>
-        <w:rPr>
-          <w:rStyle w:val="tpa1"/>
-          <w:rFonts w:ascii="Arial" w:hAnsi="Arial" w:cs="Arial"/>
-          <w:sz w:val="18"/>
-          <w:szCs w:val="18"/>
-        </w:rPr>
-      </w:pPr>
-      <w:r>
-        <w:rPr>
-          <w:rStyle w:val="tpa1"/>
-          <w:rFonts w:eastAsia="Arial" w:cs="Arial" w:ascii="Arial" w:hAnsi="Arial"/>
-          <w:color w:val="auto"/>
-          <w:spacing w:val="0"/>
-          <w:w w:val="100"/>
-          <w:sz w:val="20"/>
-          <w:szCs w:val="20"/>
-          <w:lang w:val="ro-RO"/>
-        </w:rPr>
-        <w:t xml:space="preserve">2 ore pe lună în unitățile având un efectiv de până la 99 de lucrători;</w:t>
-      </w:r>
-    </w:p>
-    <w:p>
-      <w:pPr>
-        <w:pStyle w:val="Normal"/>
-        <w:widowControl/>
-        <w:numPr>
-          <w:ilvl w:val="3"/>
-          <w:numId w:val="7"/>
-        </w:numPr>
-        <w:spacing w:before="0" w:after="40"/>
-        <w:ind w:hanging="360" w:left="1080"/>
-        <w:jc w:val="left"/>
-        <w:rPr>
-          <w:rStyle w:val="tpa1"/>
-          <w:rFonts w:ascii="Arial" w:hAnsi="Arial" w:cs="Arial"/>
-          <w:sz w:val="18"/>
-          <w:szCs w:val="18"/>
-        </w:rPr>
-      </w:pPr>
-      <w:r>
-        <w:rPr>
-          <w:rStyle w:val="tpa1"/>
-          <w:rFonts w:eastAsia="Arial" w:cs="Arial" w:ascii="Arial" w:hAnsi="Arial"/>
-          <w:color w:val="auto"/>
-          <w:spacing w:val="0"/>
-          <w:w w:val="100"/>
-          <w:sz w:val="20"/>
-          <w:szCs w:val="20"/>
-          <w:lang w:val="ro-RO"/>
-        </w:rPr>
-        <w:t xml:space="preserve">5 ore pe lună în unitățile având un efectiv între 100 și 299 de lucrători;</w:t>
-      </w:r>
-    </w:p>
-    <w:p>
-      <w:pPr>
-        <w:pStyle w:val="Normal"/>
-        <w:widowControl/>
-        <w:numPr>
-          <w:ilvl w:val="3"/>
-          <w:numId w:val="7"/>
-        </w:numPr>
-        <w:spacing w:before="0" w:after="40"/>
-        <w:ind w:hanging="360" w:left="1080"/>
-        <w:jc w:val="left"/>
-        <w:rPr>
-          <w:rStyle w:val="tpa1"/>
-          <w:rFonts w:ascii="Arial" w:hAnsi="Arial" w:cs="Arial"/>
-          <w:sz w:val="18"/>
-          <w:szCs w:val="18"/>
-        </w:rPr>
-      </w:pPr>
-      <w:r>
-        <w:rPr>
-          <w:rStyle w:val="tpa1"/>
-          <w:rFonts w:eastAsia="Arial" w:cs="Arial" w:ascii="Arial" w:hAnsi="Arial"/>
-          <w:color w:val="auto"/>
-          <w:spacing w:val="0"/>
-          <w:w w:val="100"/>
-          <w:sz w:val="20"/>
-          <w:szCs w:val="20"/>
-          <w:lang w:val="ro-RO"/>
-        </w:rPr>
-        <w:t xml:space="preserve">10 ore pe lună în unitățile având un efectiv între 300 și 499 de lucrători;</w:t>
-      </w:r>
-    </w:p>
-    <w:p>
-      <w:pPr>
-        <w:pStyle w:val="Normal"/>
-        <w:widowControl/>
-        <w:numPr>
-          <w:ilvl w:val="3"/>
-          <w:numId w:val="7"/>
-        </w:numPr>
-        <w:spacing w:before="0" w:after="40"/>
-        <w:ind w:hanging="360" w:left="1080"/>
-        <w:jc w:val="left"/>
-        <w:rPr>
-          <w:rStyle w:val="tpa1"/>
-          <w:rFonts w:ascii="Arial" w:hAnsi="Arial" w:cs="Arial"/>
-          <w:sz w:val="18"/>
-          <w:szCs w:val="18"/>
-        </w:rPr>
-      </w:pPr>
-      <w:r>
-        <w:rPr>
-          <w:rStyle w:val="tpa1"/>
-          <w:rFonts w:eastAsia="Arial" w:cs="Arial" w:ascii="Arial" w:hAnsi="Arial"/>
-          <w:color w:val="auto"/>
-          <w:spacing w:val="0"/>
-          <w:w w:val="100"/>
-          <w:sz w:val="20"/>
-          <w:szCs w:val="20"/>
-          <w:lang w:val="ro-RO"/>
-        </w:rPr>
-        <w:t xml:space="preserve">15 ore pe lună în unitățile având un efectiv între 500 și 1.499 de lucrători;</w:t>
-      </w:r>
-    </w:p>
-    <w:p>
-      <w:pPr>
-        <w:pStyle w:val="Normal"/>
-        <w:widowControl/>
-        <w:numPr>
-          <w:ilvl w:val="3"/>
-          <w:numId w:val="7"/>
-        </w:numPr>
-        <w:spacing w:before="0" w:after="40"/>
-        <w:ind w:hanging="360" w:left="1080"/>
-        <w:jc w:val="left"/>
-        <w:rPr>
-          <w:rStyle w:val="tpa1"/>
-          <w:rFonts w:ascii="Arial" w:hAnsi="Arial" w:cs="Arial"/>
-          <w:sz w:val="18"/>
-          <w:szCs w:val="18"/>
-        </w:rPr>
-      </w:pPr>
-      <w:r>
-        <w:rPr>
-          <w:rStyle w:val="tpa1"/>
-          <w:rFonts w:eastAsia="Arial" w:cs="Arial" w:ascii="Arial" w:hAnsi="Arial"/>
-          <w:color w:val="auto"/>
-          <w:spacing w:val="0"/>
-          <w:w w:val="100"/>
-          <w:sz w:val="20"/>
-          <w:szCs w:val="20"/>
-          <w:lang w:val="ro-RO"/>
-        </w:rPr>
-        <w:t xml:space="preserve">20 de ore pe lună în unitățile având un efectiv de 1.500 de lucrători și peste.</w:t>
-      </w:r>
-    </w:p>
-    <w:p>
-      <w:pPr>
-        <w:pStyle w:val="Normal"/>
         <w:widowControl/>
         <w:numPr>
           <w:ilvl w:val="0"/>

</xml_diff>

<commit_message>
fix(templates): the employer briefing's water allowance follows O.U.G. 99/2000
Art. 73 pt 8 i) ended "(peste 30 °C), în funcție de posibilități, aer
condiționat sau ventilație. În cazul în care acest lucru nu este posibil se
va asigura un litru de apă minerală pe zi pentru fiecare salariat și/sau în
raport cu timpul lucrat;", which contradicted 9, 2.2 and 3.2. It now ends
"…pot afecta sănătatea, în funcție de posibilități, aer condiționat sau
ventilație. În perioadele cu temperaturi ridicate extreme (peste +37 °C),
angajatorul va asigura apă minerală adecvată, câte 2 - 4 litri/ persoană/
schimb, iar în perioadele cu temperaturi scăzute extreme (sub -20 °C),
salariaților care lucrează în aer liber, ceai fierbinte în cantitate de 0,5 - 1
litru/ persoană/ schimb (O.U.G. nr. 99/2000, art. 4 și 5);", the thresholds
of art. 1(2) and the quantities of art. 4 B a) and art. 5 a).

Claude-Session: https://claude.ai/code/session_01A9qjCHVH6kcDAEKFiJoShR
</commit_message>
<xml_diff>
--- a/packages/document-engine/templates/11_employer_briefing.docx
+++ b/packages/document-engine/templates/11_employer_briefing.docx
@@ -25515,7 +25515,7 @@
           <w:szCs w:val="20"/>
           <w:lang w:val="ro-RO"/>
         </w:rPr>
-        <w:t xml:space="preserve">în cazul în care temperaturile atmosferice sau cele din spațiul de lucru sunt ridicate și pot afecta sănătatea (peste 30 °C)</w:t>
+        <w:t xml:space="preserve">în cazul în care temperaturile atmosferice sau cele din spațiul de lucru sunt ridicate și pot afecta sănătatea, în funcție de posibilități, aer condiționat sau ventilație. În perioadele cu temperaturi ridicate extreme (peste +37 °C), angajatorul va asigura apă minerală adecvată, câte 2 - 4 litri/ persoană/ schimb, iar în perioadele cu temperaturi scăzute extreme (sub -20 °C), salariaților care lucrează în aer liber, ceai fierbinte în cantitate de 0,5 - 1 litru/ persoană/ schimb (O.U.G. nr. 99/2000, art. 4 și 5)</w:t>
       </w:r>
       <w:r>
         <w:rPr>
@@ -25528,7 +25528,7 @@
           <w:szCs w:val="20"/>
           <w:lang w:val="ro-RO"/>
         </w:rPr>
-        <w:t xml:space="preserve">, în funcție de posibilități, aer condiționat sau ventilație. În cazul în care acest lucru nu este posibil se va asigura un litru de apă minerală pe zi pentru fiecare salariat și/sau în raport cu timpul lucrat;</w:t>
+        <w:t xml:space="preserve">;</w:t>
       </w:r>
     </w:p>
     <w:p>

</xml_diff>

<commit_message>
fix(templates): the employer briefing quotes H.G. 1425 art. 21 as in force
Art. 19 ended "…potrivit prevederilor art. 49, sau prevederile Art. 51¹ lit.
a) H.G. 1425/ 2006." Art. 21 was amended by H.G. 1.242/2011 (in force since
27.12.2011) to end at "art. 49.", and art. 51¹ is repealed (consolidated
text of 07.03.2022, https://legislatie.just.ro/Public/DetaliiDocumentAfis/252029).
It now ends "…potrivit prevederilor art. 49 din H.G. 1425/ 2006.", naming
the act because this document has its own Art. 49.

Claude-Session: https://claude.ai/code/session_01A9qjCHVH6kcDAEKFiJoShR
</commit_message>
<xml_diff>
--- a/packages/document-engine/templates/11_employer_briefing.docx
+++ b/packages/document-engine/templates/11_employer_briefing.docx
@@ -7604,36 +7604,7 @@
           <w:szCs w:val="20"/>
           <w:lang w:val="ro-RO"/>
         </w:rPr>
-        <w:t>Pentru a putea să desfășoare activitățile de prevenire și protecție, lucrătorul desemnat trebuie să îndeplinească cel puțin cerințele minime de pregătire în domeniul securității și sănătății în muncă, potrivit prevederilor art. 49, sau prevederile Art. 51</w:t>
-      </w:r>
-      <w:r>
-        <w:rPr>
-          <w:rStyle w:val="tpa1"/>
-          <w:rFonts w:eastAsia="Arial" w:cs="Arial" w:ascii="Arial" w:hAnsi="Arial"/>
-          <w:bCs/>
-          <w:color w:val="auto"/>
-          <w:spacing w:val="0"/>
-          <w:w w:val="100"/>
-          <w:sz w:val="20"/>
-          <w:szCs w:val="20"/>
-          <w:vertAlign w:val="superscript"/>
-          <w:lang w:val="ro-RO"/>
-        </w:rPr>
-        <w:t>1</w:t>
-      </w:r>
-      <w:r>
-        <w:rPr>
-          <w:rStyle w:val="tpa1"/>
-          <w:rFonts w:eastAsia="Arial" w:cs="Arial" w:ascii="Arial" w:hAnsi="Arial"/>
-          <w:bCs/>
-          <w:color w:val="auto"/>
-          <w:spacing w:val="0"/>
-          <w:w w:val="100"/>
-          <w:sz w:val="20"/>
-          <w:szCs w:val="20"/>
-          <w:lang w:val="ro-RO"/>
-        </w:rPr>
-        <w:t xml:space="preserve"> lit. a) H.G. 1425/ 2006.</w:t>
+        <w:t>Pentru a putea să desfășoare activitățile de prevenire și protecție, lucrătorul desemnat trebuie să îndeplinească cel puțin cerințele minime de pregătire în domeniul securității și sănătății în muncă, potrivit prevederilor art. 49 din H.G. 1425/ 2006.</w:t>
       </w:r>
     </w:p>
     <w:p>

</xml_diff>

<commit_message>
fix(templates): the employer briefing's points 33 and 40 cite in the house form
Art. 73 pt 33 "conform art. 19, alin. (1), litera o din Legea nr. 307" now
reads "lit. o)", and pt 40 "Conform HG 1425/ 2006, art. 55" reads "H.G.".

Claude-Session: https://claude.ai/code/session_01A9qjCHVH6kcDAEKFiJoShR
</commit_message>
<xml_diff>
--- a/packages/document-engine/templates/11_employer_briefing.docx
+++ b/packages/document-engine/templates/11_employer_briefing.docx
@@ -27597,7 +27597,7 @@
           <w:szCs w:val="20"/>
           <w:lang w:val="ro-RO"/>
         </w:rPr>
-        <w:t xml:space="preserve">Asigurarea mijloacelor tehnice, echipamentelor de protecție, substanțelor chimice de stingere care sunt specifice riscurilor care decurg din existența și funcționarea unității, precum și a medicamentelor și antidotului necesare acordării primului ajutor, conform art. 19, alin. (1), litera o din Legea nr. 307 din 12.07.2006.</w:t>
+        <w:t xml:space="preserve">Asigurarea mijloacelor tehnice, echipamentelor de protecție, substanțelor chimice de stingere care sunt specifice riscurilor care decurg din existența și funcționarea unității, precum și a medicamentelor și antidotului necesare acordării primului ajutor, conform art. 19, alin. (1), lit. o) din Legea nr. 307 din 12.07.2006.</w:t>
       </w:r>
     </w:p>
     <w:p>
@@ -28301,7 +28301,7 @@
           <w:szCs w:val="20"/>
           <w:lang w:val="ro-RO"/>
         </w:rPr>
-        <w:t xml:space="preserve">Conform HG 1425/ 2006, art. 55, reprezentanții lucrătorilor cu răspunderi specifice în domeniul securității și sănătății în muncă trebuie să urmeze un program de pregătire în domeniul securității și sănătății în muncă, cu o durată de cel puțin 40 de ore, cu conținutul minim conform celui prevăzut în anexa nr. 6 lit. A; îndeplinirea cerinței se atestă printr-un document de absolvire a programului de pregătire.</w:t>
+        <w:t xml:space="preserve">Conform H.G. 1425/ 2006, art. 55, reprezentanții lucrătorilor cu răspunderi specifice în domeniul securității și sănătății în muncă trebuie să urmeze un program de pregătire în domeniul securității și sănătății în muncă, cu o durată de cel puțin 40 de ore, cu conținutul minim conform celui prevăzut în anexa nr. 6 lit. A; îndeplinirea cerinței se atestă printr-un document de absolvire a programului de pregătire.</w:t>
       </w:r>
     </w:p>
     <w:p>

</xml_diff>

<commit_message>
fix(templates): the employer briefing's eighth-pack slips
Legea 319's "schimba / se afla" in Art. 59, "introductiv-generală", "alin. (n)" in the
lead-ins, commas in Art. 71–75, Art. 73 pt 17 split into d) and e), Art. 35's bold "(1)",
and 9's title with "și/ sau".

Claude-Session: https://claude.ai/code/session_01A9qjCHVH6kcDAEKFiJoShR
</commit_message>
<xml_diff>
--- a/packages/document-engine/templates/11_employer_briefing.docx
+++ b/packages/document-engine/templates/11_employer_briefing.docx
@@ -665,7 +665,7 @@
           <w:szCs w:val="20"/>
           <w:lang w:val="ro-RO"/>
         </w:rPr>
-        <w:t>Material de instruire în domeniul securității și sănătății în muncă pentru instruirea introductiv – generală (cod MISSMIG)</w:t>
+        <w:t xml:space="preserve">Material de instruire în domeniul securității și sănătății în muncă pentru instruirea introductiv-generală (cod MISSMIG)</w:t>
       </w:r>
     </w:p>
     <w:p>
@@ -913,7 +913,7 @@
           <w:szCs w:val="20"/>
           <w:lang w:val="ro-RO"/>
         </w:rPr>
-        <w:t xml:space="preserve">Evaluarea riscurilor de accidentare și/sau îmbolnăvire profesională (Descrierea metodei elaborate de I.N.C.D.P.M. București, utilizată de evaluator) (cod EVR)</w:t>
+        <w:t xml:space="preserve">Evaluarea riscurilor de accidentare și/ sau îmbolnăvire profesională (Descrierea metodei elaborate de I.N.C.D.P.M. București, utilizată de evaluator) (cod EVR)</w:t>
       </w:r>
     </w:p>
     <w:p>
@@ -1570,7 +1570,7 @@
           <w:szCs w:val="20"/>
           <w:lang w:val="ro-RO"/>
         </w:rPr>
-        <w:t xml:space="preserve">(Legea 319/ 2006, Art. 6, alin. 1, 2, 3) </w:t>
+        <w:t xml:space="preserve">(Legea 319/ 2006, Art. 6, alin. (1), (2), (3)) </w:t>
       </w:r>
       <w:r>
         <w:rPr>
@@ -4269,7 +4269,7 @@
           <w:szCs w:val="20"/>
           <w:lang w:val="ro-RO"/>
         </w:rPr>
-        <w:t>asigurarea întocmirii planului de acțiune în caz de pericol grav și iminent, și asigurarea ca toți lucrătorii să fie instruiți pentru aplicarea lui;</w:t>
+        <w:t xml:space="preserve">asigurarea întocmirii planului de acțiune în caz de pericol grav și iminent și asigurarea ca toți lucrătorii să fie instruiți pentru aplicarea lui;</w:t>
       </w:r>
     </w:p>
     <w:p>
@@ -5287,7 +5287,7 @@
           <w:szCs w:val="20"/>
           <w:lang w:val="ro-RO"/>
         </w:rPr>
-        <w:t>alte activități necesare/specifice asigurării securității și sănătății lucrătorilor la locul de muncă;</w:t>
+        <w:t xml:space="preserve">alte activități necesare/specifice asigurării securității și sănătății lucrătorilor la locul de muncă.</w:t>
       </w:r>
     </w:p>
     <w:p>
@@ -8828,7 +8828,7 @@
           <w:szCs w:val="20"/>
           <w:lang w:val="ro-RO"/>
         </w:rPr>
-        <w:t>(Preluare din Legea 319/ 2006 – Art. 20, alin. 1, 2, 4)</w:t>
+        <w:t xml:space="preserve">(Preluare din Legea 319/ 2006 – Art. 20, alin. (1), (2), (4))</w:t>
       </w:r>
       <w:r>
         <w:rPr>
@@ -9446,7 +9446,7 @@
           <w:szCs w:val="20"/>
           <w:lang w:val="ro-RO"/>
         </w:rPr>
-        <w:t>(Preluare din H.G. 1425/ 2006 – Art. 76, alin. 2)</w:t>
+        <w:t xml:space="preserve">(Preluare din H.G. 1425/ 2006 – Art. 76, alin. (2))</w:t>
       </w:r>
       <w:r>
         <w:rPr>
@@ -9728,7 +9728,7 @@
         <w:rPr>
           <w:rStyle w:val="al1"/>
           <w:rFonts w:eastAsia="Arial" w:cs="Arial" w:ascii="Arial" w:hAnsi="Arial"/>
-          <w:b w:val="false"/>
+          <w:b/>
           <w:bCs/>
           <w:color w:val="auto"/>
           <w:spacing w:val="0"/>
@@ -10588,7 +10588,7 @@
           <w:szCs w:val="20"/>
           <w:lang w:val="ro-RO"/>
         </w:rPr>
-        <w:t xml:space="preserve">și are denumirea de « Material de instruire în domeniul securității și sănătății în muncă pentru instruirea introductiv – generală », fiind codificat MISSMIG.</w:t>
+        <w:t xml:space="preserve">și are denumirea de « Material de instruire în domeniul securității și sănătății în muncă pentru instruirea introductiv-generală », fiind codificat MISSMIG.</w:t>
       </w:r>
     </w:p>
     <w:p>
@@ -10714,7 +10714,7 @@
           <w:szCs w:val="20"/>
           <w:lang w:val="ro-RO"/>
         </w:rPr>
-        <w:t xml:space="preserve">(Preluare din H.G. 1425/ 2006 – Art. 92 - conf. H.G. 767/ 2016 pct. 4)</w:t>
+        <w:t xml:space="preserve">(Preluare din H.G. 1425/ 2006 – Art. 92 – conf. H.G. 767/ 2016 pct. 4)</w:t>
       </w:r>
       <w:r>
         <w:rPr>
@@ -13549,7 +13549,7 @@
           <w:szCs w:val="20"/>
           <w:lang w:val="ro-RO"/>
         </w:rPr>
-        <w:t>accidentul suferit înainte sau după încetarea lucrului, dacă victima prelua sau preda uneltele de lucru, locul de muncă, utilajul ori materialele, dacă schimbă îmbrăcămintea personală, echipamentul individual de protecție sau orice alt echipament pus la dispoziție de angajator, dacă se află în baie ori în spălător sau dacă se deplasa de la locul de muncă la ieșirea din întreprindere sau unitate și invers;</w:t>
+        <w:t xml:space="preserve">accidentul suferit înainte sau după încetarea lucrului, dacă victima prelua sau preda uneltele de lucru, locul de muncă, utilajul ori materialele, dacă schimba îmbrăcămintea personală, echipamentul individual de protecție sau orice alt echipament pus la dispoziție de angajator, dacă se afla în baie ori în spălător sau dacă se deplasa de la locul de muncă la ieșirea din întreprindere sau unitate și invers;</w:t>
       </w:r>
     </w:p>
     <w:p>
@@ -13704,7 +13704,7 @@
           <w:szCs w:val="20"/>
           <w:lang w:val="ro-RO"/>
         </w:rPr>
-        <w:t xml:space="preserve">accidentul determinat de fenomene sau calamități naturale, cum ar fi furtună, viscol, cutremur, inundație, alunecări de teren, trăsnet (electrocutare), dacă victima se află în timpul procesului de muncă sau în îndeplinirea îndatoririlor de serviciu;</w:t>
+        <w:t xml:space="preserve">accidentul determinat de fenomene sau calamități naturale, cum ar fi furtună, viscol, cutremur, inundație, alunecări de teren, trăsnet (electrocutare), dacă victima se afla în timpul procesului de muncă sau în îndeplinirea îndatoririlor de serviciu;</w:t>
       </w:r>
     </w:p>
     <w:p>
@@ -14411,7 +14411,7 @@
           <w:szCs w:val="20"/>
           <w:lang w:val="ro-RO"/>
         </w:rPr>
-        <w:t xml:space="preserve">(H.G. 1425/ 2006, Art. 15, alin. 3) </w:t>
+        <w:t xml:space="preserve">(H.G. 1425/ 2006, Art. 15, alin. (3)) </w:t>
       </w:r>
       <w:r>
         <w:rPr>
@@ -14677,7 +14677,7 @@
           <w:szCs w:val="20"/>
           <w:lang w:val="ro-RO"/>
         </w:rPr>
-        <w:t>conform prevederilor H.G. 1425/ 2006, Art. 15, alin. 1, punctul 6, are ca scop oferirea de informații pentru ușurarea desfășurării activităților de prevenire și protecție.</w:t>
+        <w:t xml:space="preserve">conform prevederilor H.G. 1425/ 2006, Art. 15, alin. (1), punctul 6, are ca scop oferirea de informații pentru ușurarea desfășurării activităților de prevenire și protecție.</w:t>
       </w:r>
     </w:p>
     <w:p>
@@ -18474,7 +18474,7 @@
                 <w:szCs w:val="18"/>
                 <w:lang w:val="ro-RO"/>
               </w:rPr>
-              <w:t>Material de instruire în domeniul securității și sănătății în muncă pentru instruirea introductiv – generală</w:t>
+              <w:t xml:space="preserve">Material de instruire în domeniul securității și sănătății în muncă pentru instruirea introductiv-generală</w:t>
             </w:r>
           </w:p>
         </w:tc>
@@ -19038,7 +19038,7 @@
                 <w:szCs w:val="18"/>
                 <w:lang w:val="ro-RO"/>
               </w:rPr>
-              <w:t xml:space="preserve">Evaluarea riscurilor de accidentare și/sau îmbolnăvire profesională</w:t>
+              <w:t xml:space="preserve">Evaluarea riscurilor de accidentare și/ sau îmbolnăvire profesională</w:t>
             </w:r>
           </w:p>
         </w:tc>
@@ -21318,7 +21318,7 @@
           <w:szCs w:val="20"/>
           <w:lang w:val="ro-RO"/>
         </w:rPr>
-        <w:t>să participe la instruirile de la angajare în domeniul securității și sănătății în muncă (instruirea introductiv – generală, instruirea la locul de muncă);</w:t>
+        <w:t xml:space="preserve">să participe la instruirile de la angajare în domeniul securității și sănătății în muncă (instruirea introductiv-generală, instruirea la locul de muncă);</w:t>
       </w:r>
     </w:p>
     <w:p>
@@ -22102,7 +22102,7 @@
           <w:szCs w:val="20"/>
           <w:lang w:val="ro-RO"/>
         </w:rPr>
-        <w:t xml:space="preserve">să participe la instruirile de la angajare în domeniul situațiilor de urgență (instruirea introductiv – generală, instruirea la locul de muncă);</w:t>
+        <w:t xml:space="preserve">să participe la instruirile de la angajare în domeniul situațiilor de urgență (instruirea introductiv-generală, instruirea la locul de muncă);</w:t>
       </w:r>
     </w:p>
     <w:p>
@@ -22323,7 +22323,7 @@
           <w:szCs w:val="20"/>
           <w:lang w:val="ro-RO"/>
         </w:rPr>
-        <w:t xml:space="preserve">reprezentanții lucrătorilor cu răspunderi specifice în domeniul securității și sănătății în muncă </w:t>
+        <w:t xml:space="preserve">reprezentanții lucrătorilor cu răspunderi specifice în domeniul securității și sănătății în muncă, </w:t>
       </w:r>
       <w:r>
         <w:rPr>
@@ -22633,7 +22633,7 @@
           <w:szCs w:val="20"/>
           <w:lang w:val="ro-RO"/>
         </w:rPr>
-        <w:t xml:space="preserve">lucrătorii desemnați </w:t>
+        <w:t xml:space="preserve">lucrătorii desemnați, </w:t>
       </w:r>
       <w:r>
         <w:rPr>
@@ -23012,7 +23012,7 @@
           <w:szCs w:val="20"/>
           <w:lang w:val="ro-RO"/>
         </w:rPr>
-        <w:t>asigurarea întocmirii planului de acțiune în caz de pericol grav și iminent, și asigurarea ca toți lucrătorii să fie instruiți pentru aplicarea lui;</w:t>
+        <w:t xml:space="preserve">asigurarea întocmirii planului de acțiune în caz de pericol grav și iminent și asigurarea ca toți lucrătorii să fie instruiți pentru aplicarea lui;</w:t>
       </w:r>
     </w:p>
     <w:p>
@@ -24472,7 +24472,7 @@
           <w:szCs w:val="20"/>
           <w:lang w:val="ro-RO"/>
         </w:rPr>
-        <w:t xml:space="preserve"> din punct de vedere al securității muncii, să mențină condițiile de lucru pentru care s-a obținut autorizație și să ceară revizuirea acesteia în cazul modificării condițiilor inițiale pentru care a fost emisă;</w:t>
+        <w:t xml:space="preserve"> din punctul de vedere al securității muncii, să mențină condițiile de lucru pentru care s-a obținut autorizație și să ceară revizuirea acesteia în cazul modificării condițiilor inițiale pentru care a fost emisă;</w:t>
       </w:r>
     </w:p>
     <w:p>
@@ -24815,7 +24815,7 @@
           <w:szCs w:val="20"/>
           <w:lang w:val="ro-RO"/>
         </w:rPr>
-        <w:t>Astfel lucrătorul desemnat sau serviciul extern va trebui să:</w:t>
+        <w:t xml:space="preserve">Astfel, lucrătorul desemnat sau serviciul extern va trebui să:</w:t>
       </w:r>
     </w:p>
     <w:p>
@@ -25473,7 +25473,7 @@
           <w:szCs w:val="20"/>
           <w:lang w:val="ro-RO"/>
         </w:rPr>
-        <w:t xml:space="preserve">să asigure </w:t>
+        <w:t xml:space="preserve">să asigure, </w:t>
       </w:r>
       <w:r>
         <w:rPr>
@@ -25561,7 +25561,7 @@
           <w:szCs w:val="20"/>
           <w:lang w:val="ro-RO"/>
         </w:rPr>
-        <w:t xml:space="preserve">să asigure securitatea și sănătatea în muncă a salariatelor gravide și/sau mame, lăuze sau care alăptează conform OUG nr. 96/2003 privind protecția maternității la locurile de muncă.</w:t>
+        <w:t xml:space="preserve">să asigure securitatea și sănătatea în muncă a salariatelor gravide și/sau mame, lăuze sau care alăptează, conform O.U.G. nr. 96/ 2003 privind protecția maternității la locurile de muncă.</w:t>
       </w:r>
     </w:p>
     <w:p>
@@ -26798,7 +26798,38 @@
           <w:szCs w:val="20"/>
           <w:lang w:val="ro-RO"/>
         </w:rPr>
-        <w:t xml:space="preserve">depistarea bolilor care ar constitui risc pentru viață și sănătatea celorlalți angajați la același loc de muncă; depistarea bolilor care ar constitui risc pentru securitatea unității, pentru calitatea produselor sau pentru populația cu care angajatul vine în contact prin natura activității sale.</w:t>
+        <w:t xml:space="preserve">depistarea bolilor care ar constitui risc pentru viața și sănătatea celorlalți angajați la același loc de muncă;</w:t>
+      </w:r>
+    </w:p>
+    <w:p>
+      <w:pPr>
+        <w:pStyle w:val="Normal"/>
+        <w:widowControl/>
+        <w:numPr>
+          <w:ilvl w:val="0"/>
+          <w:numId w:val="31"/>
+        </w:numPr>
+        <w:spacing w:before="0" w:after="40"/>
+        <w:ind w:hanging="360" w:left="1080"/>
+        <w:jc w:val="left"/>
+        <w:rPr>
+          <w:rFonts w:ascii="Arial" w:hAnsi="Arial" w:cs="Arial"/>
+          <w:sz w:val="18"/>
+          <w:szCs w:val="18"/>
+          <w:lang w:val="it-IT"/>
+        </w:rPr>
+      </w:pPr>
+      <w:r>
+        <w:rPr>
+          <w:rFonts w:eastAsia="Arial" w:cs="Arial" w:ascii="Arial" w:hAnsi="Arial"/>
+          <w:color w:val="auto"/>
+          <w:spacing w:val="0"/>
+          <w:w w:val="100"/>
+          <w:sz w:val="20"/>
+          <w:szCs w:val="20"/>
+          <w:lang w:val="ro-RO"/>
+        </w:rPr>
+        <w:t xml:space="preserve">depistarea bolilor care ar constitui risc pentru securitatea unității, pentru calitatea produselor sau pentru populația cu care angajatul vine în contact prin natura activității sale.</w:t>
       </w:r>
     </w:p>
     <w:p>
@@ -30457,7 +30488,7 @@
           <w:szCs w:val="20"/>
           <w:lang w:val="ro-RO"/>
         </w:rPr>
-        <w:t>salariata lăuză, care și-a reluat activitatea după efectuarea concediului de lăuzie respectiv a concediului postnatal obligatoriu de 42 de zile, sau după caz a 63 de zile ale concediului de lăuzie, va solicita angajatorului în scris măsurile de protecție prevăzute de lege, anexând un document medical eliberat de medicul de familie/ medicul specialist, dar nu mai târziu de 6 luni de la data la care a născut;</w:t>
+        <w:t xml:space="preserve">salariata lăuză, care și-a reluat activitatea după efectuarea concediului de lăuzie, respectiv a concediului postnatal obligatoriu de 42 de zile, sau, după caz, a 63 de zile ale concediului de lăuzie, va solicita angajatorului în scris măsurile de protecție prevăzute de lege, anexând un document medical eliberat de medicul de familie/ medicul specialist, dar nu mai târziu de 6 luni de la data la care a născut;</w:t>
       </w:r>
     </w:p>
     <w:p>
@@ -30571,7 +30602,7 @@
           <w:szCs w:val="20"/>
           <w:lang w:val="ro-RO"/>
         </w:rPr>
-        <w:t>salariata mamă are obligația să efectueze, în cadrul concediului pentru sarcină și lăuzie, concediul postnatal de 42 de zile, după naștere, sau după caz 63 de zile ale concediului de lăuzie;</w:t>
+        <w:t xml:space="preserve">salariata mamă are obligația să efectueze, în cadrul concediului pentru sarcină și lăuzie, concediul postnatal de 42 de zile, după naștere, sau, după caz, 63 de zile ale concediului de lăuzie;</w:t>
       </w:r>
     </w:p>
     <w:p>
@@ -31376,7 +31407,7 @@
           <w:szCs w:val="20"/>
           <w:lang w:val="ro-RO"/>
         </w:rPr>
-        <w:t>integral sau fracționat după expirarea concediului postnatal obligatoriu și dacă este cazul, până la data intrării în concediu pentru creșterea copilului în vârstă de până la 2 ani sau în cazul copilului cu handicap, până la 3 ani;</w:t>
+        <w:t xml:space="preserve">integral sau fracționat, după expirarea concediului postnatal obligatoriu și, dacă este cazul, până la data intrării în concediu pentru creșterea copilului în vârstă de până la 2 ani sau în cazul copilului cu handicap, până la 3 ani;</w:t>
       </w:r>
     </w:p>
     <w:p>

</xml_diff>

<commit_message>
fix(templates): the employer briefing drops Art. 73 pts 22 and 25, which repeat pt 20
Pt 22 named no phase, so it also had the introductory training given by the workplace
manager, against pt 20; pt 25 repeated pt 20 for the periodic training. The points
renumber to 1–48 by themselves.

Claude-Session: https://claude.ai/code/session_01A9qjCHVH6kcDAEKFiJoShR
</commit_message>
<xml_diff>
--- a/packages/document-engine/templates/11_employer_briefing.docx
+++ b/packages/document-engine/templates/11_employer_briefing.docx
@@ -27049,6 +27049,7 @@
     <w:p>
       <w:pPr>
         <w:pStyle w:val="Normal"/>
+        <w:keepNext/>
         <w:widowControl/>
         <w:numPr>
           <w:ilvl w:val="0"/>
@@ -27060,26 +27061,239 @@
           <w:rFonts w:ascii="Arial" w:hAnsi="Arial" w:cs="Arial"/>
           <w:sz w:val="18"/>
           <w:szCs w:val="18"/>
-          <w:lang w:val="es-ES"/>
-        </w:rPr>
-      </w:pPr>
-      <w:r>
-        <w:rPr>
-          <w:rFonts w:eastAsia="Arial" w:cs="Arial" w:ascii="Arial" w:hAnsi="Arial"/>
-          <w:color w:val="auto"/>
-          <w:spacing w:val="0"/>
-          <w:w w:val="100"/>
-          <w:sz w:val="20"/>
-          <w:szCs w:val="20"/>
-          <w:lang w:val="ro-RO"/>
-        </w:rPr>
-        <w:t xml:space="preserve">Instruirea de securitate și sănătate a muncii se efectuează de către conducătorul locului de muncă sau de către serviciul extern de prevenire și protecție, potrivit tematicii de instruire.</w:t>
-      </w:r>
-    </w:p>
-    <w:p>
-      <w:pPr>
-        <w:pStyle w:val="Normal"/>
-        <w:keepNext/>
+          <w:lang w:val="it-IT"/>
+        </w:rPr>
+      </w:pPr>
+      <w:r>
+        <w:rPr>
+          <w:rFonts w:eastAsia="Arial" w:cs="Arial" w:ascii="Arial" w:hAnsi="Arial"/>
+          <w:color w:val="auto"/>
+          <w:spacing w:val="0"/>
+          <w:w w:val="100"/>
+          <w:sz w:val="20"/>
+          <w:szCs w:val="20"/>
+          <w:lang w:val="ro-RO"/>
+        </w:rPr>
+        <w:t>Instruirea introductivă durează cf. deciziei și planificării interne și în cadrul său se prezintă:</w:t>
+      </w:r>
+    </w:p>
+    <w:p>
+      <w:pPr>
+        <w:pStyle w:val="Normal"/>
+        <w:widowControl/>
+        <w:numPr>
+          <w:ilvl w:val="0"/>
+          <w:numId w:val="45"/>
+        </w:numPr>
+        <w:spacing w:before="0" w:after="40"/>
+        <w:ind w:hanging="360" w:left="1080"/>
+        <w:jc w:val="left"/>
+        <w:rPr>
+          <w:rFonts w:ascii="Arial" w:hAnsi="Arial" w:cs="Arial"/>
+          <w:sz w:val="18"/>
+          <w:szCs w:val="18"/>
+          <w:lang w:val="it-IT"/>
+        </w:rPr>
+      </w:pPr>
+      <w:r>
+        <w:rPr>
+          <w:rFonts w:eastAsia="Arial" w:cs="Arial" w:ascii="Arial" w:hAnsi="Arial"/>
+          <w:color w:val="auto"/>
+          <w:spacing w:val="0"/>
+          <w:w w:val="100"/>
+          <w:sz w:val="20"/>
+          <w:szCs w:val="20"/>
+          <w:lang w:val="ro-RO"/>
+        </w:rPr>
+        <w:t>riscurile de accidentare și îmbolnăvire profesională specifice unității;</w:t>
+      </w:r>
+    </w:p>
+    <w:p>
+      <w:pPr>
+        <w:pStyle w:val="Normal"/>
+        <w:widowControl/>
+        <w:numPr>
+          <w:ilvl w:val="0"/>
+          <w:numId w:val="45"/>
+        </w:numPr>
+        <w:spacing w:before="0" w:after="40"/>
+        <w:ind w:hanging="360" w:left="1080"/>
+        <w:jc w:val="left"/>
+        <w:rPr>
+          <w:rFonts w:ascii="Arial" w:hAnsi="Arial" w:cs="Arial"/>
+          <w:sz w:val="18"/>
+          <w:szCs w:val="18"/>
+          <w:lang w:val="it-IT"/>
+        </w:rPr>
+      </w:pPr>
+      <w:r>
+        <w:rPr>
+          <w:rFonts w:eastAsia="Arial" w:cs="Arial" w:ascii="Arial" w:hAnsi="Arial"/>
+          <w:color w:val="auto"/>
+          <w:spacing w:val="0"/>
+          <w:w w:val="100"/>
+          <w:sz w:val="20"/>
+          <w:szCs w:val="20"/>
+          <w:lang w:val="ro-RO"/>
+        </w:rPr>
+        <w:t>legislația de sănătate și securitate în muncă în vigoare;</w:t>
+      </w:r>
+    </w:p>
+    <w:p>
+      <w:pPr>
+        <w:pStyle w:val="Normal"/>
+        <w:widowControl/>
+        <w:numPr>
+          <w:ilvl w:val="0"/>
+          <w:numId w:val="45"/>
+        </w:numPr>
+        <w:spacing w:before="0" w:after="40"/>
+        <w:ind w:hanging="360" w:left="1080"/>
+        <w:jc w:val="left"/>
+        <w:rPr>
+          <w:rFonts w:ascii="Arial" w:hAnsi="Arial" w:cs="Arial"/>
+          <w:sz w:val="18"/>
+          <w:szCs w:val="18"/>
+          <w:lang w:val="it-IT"/>
+        </w:rPr>
+      </w:pPr>
+      <w:r>
+        <w:rPr>
+          <w:rFonts w:eastAsia="Arial" w:cs="Arial" w:ascii="Arial" w:hAnsi="Arial"/>
+          <w:color w:val="auto"/>
+          <w:spacing w:val="0"/>
+          <w:w w:val="100"/>
+          <w:sz w:val="20"/>
+          <w:szCs w:val="20"/>
+          <w:lang w:val="ro-RO"/>
+        </w:rPr>
+        <w:t>consecințele posibile ale necunoașterii și nerespectării legislației de protecție a muncii;</w:t>
+      </w:r>
+    </w:p>
+    <w:p>
+      <w:pPr>
+        <w:pStyle w:val="Normal"/>
+        <w:widowControl/>
+        <w:numPr>
+          <w:ilvl w:val="0"/>
+          <w:numId w:val="45"/>
+        </w:numPr>
+        <w:spacing w:before="0" w:after="40"/>
+        <w:ind w:hanging="360" w:left="1080"/>
+        <w:jc w:val="left"/>
+        <w:rPr>
+          <w:rFonts w:ascii="Arial" w:hAnsi="Arial" w:cs="Arial"/>
+          <w:sz w:val="18"/>
+          <w:szCs w:val="18"/>
+          <w:lang w:val="it-IT"/>
+        </w:rPr>
+      </w:pPr>
+      <w:r>
+        <w:rPr>
+          <w:rFonts w:eastAsia="Arial" w:cs="Arial" w:ascii="Arial" w:hAnsi="Arial"/>
+          <w:color w:val="auto"/>
+          <w:spacing w:val="0"/>
+          <w:w w:val="100"/>
+          <w:sz w:val="20"/>
+          <w:szCs w:val="20"/>
+          <w:lang w:val="ro-RO"/>
+        </w:rPr>
+        <w:t>măsuri tehnico-organizatorice de prevenire, alarmare, intervenție, evacuare și prim ajutor;</w:t>
+      </w:r>
+    </w:p>
+    <w:p>
+      <w:pPr>
+        <w:pStyle w:val="Normal"/>
+        <w:widowControl/>
+        <w:numPr>
+          <w:ilvl w:val="0"/>
+          <w:numId w:val="45"/>
+        </w:numPr>
+        <w:spacing w:before="0" w:after="40"/>
+        <w:ind w:hanging="360" w:left="1080"/>
+        <w:jc w:val="left"/>
+        <w:rPr>
+          <w:rFonts w:ascii="Arial" w:hAnsi="Arial" w:cs="Arial"/>
+          <w:sz w:val="18"/>
+          <w:szCs w:val="18"/>
+        </w:rPr>
+      </w:pPr>
+      <w:r>
+        <w:rPr>
+          <w:rFonts w:eastAsia="Arial" w:cs="Arial" w:ascii="Arial" w:hAnsi="Arial"/>
+          <w:color w:val="auto"/>
+          <w:spacing w:val="0"/>
+          <w:w w:val="100"/>
+          <w:sz w:val="20"/>
+          <w:szCs w:val="20"/>
+          <w:lang w:val="ro-RO"/>
+        </w:rPr>
+        <w:t>instrucțiunile proprii la nivelul societății;</w:t>
+      </w:r>
+    </w:p>
+    <w:p>
+      <w:pPr>
+        <w:pStyle w:val="Normal"/>
+        <w:widowControl/>
+        <w:numPr>
+          <w:ilvl w:val="0"/>
+          <w:numId w:val="45"/>
+        </w:numPr>
+        <w:spacing w:before="0" w:after="40"/>
+        <w:ind w:hanging="360" w:left="1080"/>
+        <w:jc w:val="left"/>
+        <w:rPr>
+          <w:rFonts w:ascii="Arial" w:hAnsi="Arial" w:cs="Arial"/>
+          <w:sz w:val="18"/>
+          <w:szCs w:val="18"/>
+        </w:rPr>
+      </w:pPr>
+      <w:r>
+        <w:rPr>
+          <w:rFonts w:eastAsia="Arial" w:cs="Arial" w:ascii="Arial" w:hAnsi="Arial"/>
+          <w:color w:val="auto"/>
+          <w:spacing w:val="0"/>
+          <w:w w:val="100"/>
+          <w:sz w:val="20"/>
+          <w:szCs w:val="20"/>
+          <w:lang w:val="ro-RO"/>
+        </w:rPr>
+        <w:t>regulamentul intern;</w:t>
+      </w:r>
+    </w:p>
+    <w:p>
+      <w:pPr>
+        <w:pStyle w:val="Normal"/>
+        <w:widowControl/>
+        <w:numPr>
+          <w:ilvl w:val="0"/>
+          <w:numId w:val="45"/>
+        </w:numPr>
+        <w:spacing w:before="0" w:after="40"/>
+        <w:ind w:hanging="360" w:left="1080"/>
+        <w:jc w:val="left"/>
+        <w:rPr>
+          <w:rFonts w:ascii="Arial" w:hAnsi="Arial" w:cs="Arial"/>
+          <w:sz w:val="18"/>
+          <w:szCs w:val="18"/>
+        </w:rPr>
+      </w:pPr>
+      <w:r>
+        <w:rPr>
+          <w:rFonts w:eastAsia="Arial" w:cs="Arial" w:ascii="Arial" w:hAnsi="Arial"/>
+          <w:color w:val="auto"/>
+          <w:spacing w:val="0"/>
+          <w:w w:val="100"/>
+          <w:sz w:val="20"/>
+          <w:szCs w:val="20"/>
+          <w:lang w:val="ro-RO"/>
+        </w:rPr>
+        <w:t>contractul colectiv de muncă.</w:t>
+      </w:r>
+    </w:p>
+    <w:p>
+      <w:pPr>
+        <w:pStyle w:val="Normal"/>
         <w:widowControl/>
         <w:numPr>
           <w:ilvl w:val="0"/>
@@ -27091,250 +27305,6 @@
           <w:rFonts w:ascii="Arial" w:hAnsi="Arial" w:cs="Arial"/>
           <w:sz w:val="18"/>
           <w:szCs w:val="18"/>
-          <w:lang w:val="it-IT"/>
-        </w:rPr>
-      </w:pPr>
-      <w:r>
-        <w:rPr>
-          <w:rFonts w:eastAsia="Arial" w:cs="Arial" w:ascii="Arial" w:hAnsi="Arial"/>
-          <w:color w:val="auto"/>
-          <w:spacing w:val="0"/>
-          <w:w w:val="100"/>
-          <w:sz w:val="20"/>
-          <w:szCs w:val="20"/>
-          <w:lang w:val="ro-RO"/>
-        </w:rPr>
-        <w:t>Instruirea introductivă durează cf. deciziei și planificării interne și în cadrul său se prezintă:</w:t>
-      </w:r>
-    </w:p>
-    <w:p>
-      <w:pPr>
-        <w:pStyle w:val="Normal"/>
-        <w:widowControl/>
-        <w:numPr>
-          <w:ilvl w:val="0"/>
-          <w:numId w:val="45"/>
-        </w:numPr>
-        <w:spacing w:before="0" w:after="40"/>
-        <w:ind w:hanging="360" w:left="1080"/>
-        <w:jc w:val="left"/>
-        <w:rPr>
-          <w:rFonts w:ascii="Arial" w:hAnsi="Arial" w:cs="Arial"/>
-          <w:sz w:val="18"/>
-          <w:szCs w:val="18"/>
-          <w:lang w:val="it-IT"/>
-        </w:rPr>
-      </w:pPr>
-      <w:r>
-        <w:rPr>
-          <w:rFonts w:eastAsia="Arial" w:cs="Arial" w:ascii="Arial" w:hAnsi="Arial"/>
-          <w:color w:val="auto"/>
-          <w:spacing w:val="0"/>
-          <w:w w:val="100"/>
-          <w:sz w:val="20"/>
-          <w:szCs w:val="20"/>
-          <w:lang w:val="ro-RO"/>
-        </w:rPr>
-        <w:t>riscurile de accidentare și îmbolnăvire profesională specifice unității;</w:t>
-      </w:r>
-    </w:p>
-    <w:p>
-      <w:pPr>
-        <w:pStyle w:val="Normal"/>
-        <w:widowControl/>
-        <w:numPr>
-          <w:ilvl w:val="0"/>
-          <w:numId w:val="45"/>
-        </w:numPr>
-        <w:spacing w:before="0" w:after="40"/>
-        <w:ind w:hanging="360" w:left="1080"/>
-        <w:jc w:val="left"/>
-        <w:rPr>
-          <w:rFonts w:ascii="Arial" w:hAnsi="Arial" w:cs="Arial"/>
-          <w:sz w:val="18"/>
-          <w:szCs w:val="18"/>
-          <w:lang w:val="it-IT"/>
-        </w:rPr>
-      </w:pPr>
-      <w:r>
-        <w:rPr>
-          <w:rFonts w:eastAsia="Arial" w:cs="Arial" w:ascii="Arial" w:hAnsi="Arial"/>
-          <w:color w:val="auto"/>
-          <w:spacing w:val="0"/>
-          <w:w w:val="100"/>
-          <w:sz w:val="20"/>
-          <w:szCs w:val="20"/>
-          <w:lang w:val="ro-RO"/>
-        </w:rPr>
-        <w:t>legislația de sănătate și securitate în muncă în vigoare;</w:t>
-      </w:r>
-    </w:p>
-    <w:p>
-      <w:pPr>
-        <w:pStyle w:val="Normal"/>
-        <w:widowControl/>
-        <w:numPr>
-          <w:ilvl w:val="0"/>
-          <w:numId w:val="45"/>
-        </w:numPr>
-        <w:spacing w:before="0" w:after="40"/>
-        <w:ind w:hanging="360" w:left="1080"/>
-        <w:jc w:val="left"/>
-        <w:rPr>
-          <w:rFonts w:ascii="Arial" w:hAnsi="Arial" w:cs="Arial"/>
-          <w:sz w:val="18"/>
-          <w:szCs w:val="18"/>
-          <w:lang w:val="it-IT"/>
-        </w:rPr>
-      </w:pPr>
-      <w:r>
-        <w:rPr>
-          <w:rFonts w:eastAsia="Arial" w:cs="Arial" w:ascii="Arial" w:hAnsi="Arial"/>
-          <w:color w:val="auto"/>
-          <w:spacing w:val="0"/>
-          <w:w w:val="100"/>
-          <w:sz w:val="20"/>
-          <w:szCs w:val="20"/>
-          <w:lang w:val="ro-RO"/>
-        </w:rPr>
-        <w:t>consecințele posibile ale necunoașterii și nerespectării legislației de protecție a muncii;</w:t>
-      </w:r>
-    </w:p>
-    <w:p>
-      <w:pPr>
-        <w:pStyle w:val="Normal"/>
-        <w:widowControl/>
-        <w:numPr>
-          <w:ilvl w:val="0"/>
-          <w:numId w:val="45"/>
-        </w:numPr>
-        <w:spacing w:before="0" w:after="40"/>
-        <w:ind w:hanging="360" w:left="1080"/>
-        <w:jc w:val="left"/>
-        <w:rPr>
-          <w:rFonts w:ascii="Arial" w:hAnsi="Arial" w:cs="Arial"/>
-          <w:sz w:val="18"/>
-          <w:szCs w:val="18"/>
-          <w:lang w:val="it-IT"/>
-        </w:rPr>
-      </w:pPr>
-      <w:r>
-        <w:rPr>
-          <w:rFonts w:eastAsia="Arial" w:cs="Arial" w:ascii="Arial" w:hAnsi="Arial"/>
-          <w:color w:val="auto"/>
-          <w:spacing w:val="0"/>
-          <w:w w:val="100"/>
-          <w:sz w:val="20"/>
-          <w:szCs w:val="20"/>
-          <w:lang w:val="ro-RO"/>
-        </w:rPr>
-        <w:t>măsuri tehnico-organizatorice de prevenire, alarmare, intervenție, evacuare și prim ajutor;</w:t>
-      </w:r>
-    </w:p>
-    <w:p>
-      <w:pPr>
-        <w:pStyle w:val="Normal"/>
-        <w:widowControl/>
-        <w:numPr>
-          <w:ilvl w:val="0"/>
-          <w:numId w:val="45"/>
-        </w:numPr>
-        <w:spacing w:before="0" w:after="40"/>
-        <w:ind w:hanging="360" w:left="1080"/>
-        <w:jc w:val="left"/>
-        <w:rPr>
-          <w:rFonts w:ascii="Arial" w:hAnsi="Arial" w:cs="Arial"/>
-          <w:sz w:val="18"/>
-          <w:szCs w:val="18"/>
-        </w:rPr>
-      </w:pPr>
-      <w:r>
-        <w:rPr>
-          <w:rFonts w:eastAsia="Arial" w:cs="Arial" w:ascii="Arial" w:hAnsi="Arial"/>
-          <w:color w:val="auto"/>
-          <w:spacing w:val="0"/>
-          <w:w w:val="100"/>
-          <w:sz w:val="20"/>
-          <w:szCs w:val="20"/>
-          <w:lang w:val="ro-RO"/>
-        </w:rPr>
-        <w:t>instrucțiunile proprii la nivelul societății;</w:t>
-      </w:r>
-    </w:p>
-    <w:p>
-      <w:pPr>
-        <w:pStyle w:val="Normal"/>
-        <w:widowControl/>
-        <w:numPr>
-          <w:ilvl w:val="0"/>
-          <w:numId w:val="45"/>
-        </w:numPr>
-        <w:spacing w:before="0" w:after="40"/>
-        <w:ind w:hanging="360" w:left="1080"/>
-        <w:jc w:val="left"/>
-        <w:rPr>
-          <w:rFonts w:ascii="Arial" w:hAnsi="Arial" w:cs="Arial"/>
-          <w:sz w:val="18"/>
-          <w:szCs w:val="18"/>
-        </w:rPr>
-      </w:pPr>
-      <w:r>
-        <w:rPr>
-          <w:rFonts w:eastAsia="Arial" w:cs="Arial" w:ascii="Arial" w:hAnsi="Arial"/>
-          <w:color w:val="auto"/>
-          <w:spacing w:val="0"/>
-          <w:w w:val="100"/>
-          <w:sz w:val="20"/>
-          <w:szCs w:val="20"/>
-          <w:lang w:val="ro-RO"/>
-        </w:rPr>
-        <w:t>regulamentul intern;</w:t>
-      </w:r>
-    </w:p>
-    <w:p>
-      <w:pPr>
-        <w:pStyle w:val="Normal"/>
-        <w:widowControl/>
-        <w:numPr>
-          <w:ilvl w:val="0"/>
-          <w:numId w:val="45"/>
-        </w:numPr>
-        <w:spacing w:before="0" w:after="40"/>
-        <w:ind w:hanging="360" w:left="1080"/>
-        <w:jc w:val="left"/>
-        <w:rPr>
-          <w:rFonts w:ascii="Arial" w:hAnsi="Arial" w:cs="Arial"/>
-          <w:sz w:val="18"/>
-          <w:szCs w:val="18"/>
-        </w:rPr>
-      </w:pPr>
-      <w:r>
-        <w:rPr>
-          <w:rFonts w:eastAsia="Arial" w:cs="Arial" w:ascii="Arial" w:hAnsi="Arial"/>
-          <w:color w:val="auto"/>
-          <w:spacing w:val="0"/>
-          <w:w w:val="100"/>
-          <w:sz w:val="20"/>
-          <w:szCs w:val="20"/>
-          <w:lang w:val="ro-RO"/>
-        </w:rPr>
-        <w:t>contractul colectiv de muncă.</w:t>
-      </w:r>
-    </w:p>
-    <w:p>
-      <w:pPr>
-        <w:pStyle w:val="Normal"/>
-        <w:widowControl/>
-        <w:numPr>
-          <w:ilvl w:val="0"/>
-          <w:numId w:val="7"/>
-        </w:numPr>
-        <w:spacing w:before="0" w:after="40"/>
-        <w:jc w:val="left"/>
-        <w:rPr>
-          <w:rFonts w:ascii="Arial" w:hAnsi="Arial" w:cs="Arial"/>
-          <w:sz w:val="18"/>
-          <w:szCs w:val="18"/>
           <w:lang w:val="pt-BR"/>
         </w:rPr>
       </w:pPr>
@@ -27349,36 +27319,6 @@
           <w:lang w:val="ro-RO"/>
         </w:rPr>
         <w:t>Instruirea periodică se face tuturor lucrătorilor angajați sau detașați.</w:t>
-      </w:r>
-    </w:p>
-    <w:p>
-      <w:pPr>
-        <w:pStyle w:val="Normal"/>
-        <w:widowControl/>
-        <w:numPr>
-          <w:ilvl w:val="0"/>
-          <w:numId w:val="7"/>
-        </w:numPr>
-        <w:spacing w:before="0" w:after="40"/>
-        <w:jc w:val="left"/>
-        <w:rPr>
-          <w:rFonts w:ascii="Arial" w:hAnsi="Arial" w:cs="Arial"/>
-          <w:sz w:val="18"/>
-          <w:szCs w:val="18"/>
-          <w:lang w:val="pt-BR"/>
-        </w:rPr>
-      </w:pPr>
-      <w:r>
-        <w:rPr>
-          <w:rFonts w:eastAsia="Arial" w:cs="Arial" w:ascii="Arial" w:hAnsi="Arial"/>
-          <w:color w:val="auto"/>
-          <w:spacing w:val="0"/>
-          <w:w w:val="100"/>
-          <w:sz w:val="20"/>
-          <w:szCs w:val="20"/>
-          <w:lang w:val="ro-RO"/>
-        </w:rPr>
-        <w:t xml:space="preserve">Instruirea periodică se efectuează de către conducătorul locului de muncă sau de către serviciul extern de prevenire și protecție, potrivit tematicii de instruire.</w:t>
       </w:r>
     </w:p>
     <w:p>

</xml_diff>

<commit_message>
fix(templates): the employer briefing and cover 4.1 give 4.2 its own title
"Tematica de instruire și programul de instruire – testare la nivelul unității în domeniul
securității și sănătății în muncă", as 4.2's header and 11's Tabel 2 print it, in 11 Art. 1
item 8, Art. 48 and on cover 4.1 (rebuilt from covers.ro.json; the other covers came out
unchanged and are left as they were).

Claude-Session: https://claude.ai/code/session_01A9qjCHVH6kcDAEKFiJoShR
</commit_message>
<xml_diff>
--- a/packages/document-engine/templates/11_employer_briefing.docx
+++ b/packages/document-engine/templates/11_employer_briefing.docx
@@ -727,7 +727,7 @@
           <w:szCs w:val="20"/>
           <w:lang w:val="ro-RO"/>
         </w:rPr>
-        <w:t>Tematicile pentru toate fazele de instruire și programul de instruire – testare la nivelul unității, conform cu periodicitatea adecvat stabilită pentru fiecare loc de muncă / post de lucru (cod TISSM)</w:t>
+        <w:t xml:space="preserve">Tematica de instruire și programul de instruire – testare la nivelul unității în domeniul securității și sănătății în muncă (cod TISSM)</w:t>
       </w:r>
     </w:p>
     <w:p>
@@ -11755,7 +11755,7 @@
           <w:szCs w:val="20"/>
           <w:lang w:val="ro-RO"/>
         </w:rPr>
-        <w:t>Tematica de instruire pentru toate fazele de instruire și programul de instruire – testare la nivelul unității în domeniul securității și sănătății în muncă</w:t>
+        <w:t xml:space="preserve">Tematica de instruire și programul de instruire – testare la nivelul unității în domeniul securității și sănătății în muncă</w:t>
       </w:r>
       <w:r>
         <w:rPr>

</xml_diff>

<commit_message>
fix(templates): the employer briefing's slash, act-number, comma and range slips
"și/ sau" (×26) and "necesare/ specifice" in the house form; "Legii 319/ 2006"
(×2), "Legii 307/ 2006", "Legii nr. 307/ 2006", "O.U.G. nr. 99/ 2000" and
"Legea nr. 53/ 2003 – Codul muncii"; "are obligația, potrivit Legii 319/ 2006,
să ia"; "lit. a)–c)", "2 – 4 litri", "0,5 – 1 litru"; the commas in Art. 74
pt 4 j) and Art. 75 pt 2; "Normele metodologice".

Claude-Session: https://claude.ai/code/session_01A9qjCHVH6kcDAEKFiJoShR
</commit_message>
<xml_diff>
--- a/packages/document-engine/templates/11_employer_briefing.docx
+++ b/packages/document-engine/templates/11_employer_briefing.docx
@@ -2762,7 +2762,7 @@
           <w:szCs w:val="20"/>
           <w:lang w:val="ro-RO"/>
         </w:rPr>
-        <w:t xml:space="preserve">să ia măsuri și să furnizeze instrucțiuni pentru a da lucrătorilor posibilitatea să oprească lucrul și/sau să părăsească imediat locul de muncă și să se îndrepte spre o zonă sigură, în caz de pericol grav și iminent;</w:t>
+        <w:t xml:space="preserve">să ia măsuri și să furnizeze instrucțiuni pentru a da lucrătorilor posibilitatea să oprească lucrul și/ sau să părăsească imediat locul de muncă și să se îndrepte spre o zonă sigură, în caz de pericol grav și iminent;</w:t>
       </w:r>
     </w:p>
     <w:p>
@@ -5228,7 +5228,7 @@
           <w:szCs w:val="20"/>
           <w:lang w:val="ro-RO"/>
         </w:rPr>
-        <w:t xml:space="preserve">evidența echipamentelor, zonarea corespunzătoare, asigurarea/urmărirea ca verificările și/sau încercările periodice ale echipamentelor de muncă să fie efectuate la timp și de către persoane competente ori alte activități necesare, potrivit prevederilor Hotărârii Guvernului nr. </w:t>
+        <w:t xml:space="preserve">evidența echipamentelor, zonarea corespunzătoare, asigurarea/urmărirea ca verificările și/ sau încercările periodice ale echipamentelor de muncă să fie efectuate la timp și de către persoane competente ori alte activități necesare, potrivit prevederilor Hotărârii Guvernului nr. </w:t>
       </w:r>
       <w:r>
         <w:rPr>
@@ -5287,7 +5287,7 @@
           <w:szCs w:val="20"/>
           <w:lang w:val="ro-RO"/>
         </w:rPr>
-        <w:t xml:space="preserve">alte activități necesare/specifice asigurării securității și sănătății lucrătorilor la locul de muncă.</w:t>
+        <w:t xml:space="preserve">alte activități necesare/ specifice asigurării securității și sănătății lucrătorilor la locul de muncă.</w:t>
       </w:r>
     </w:p>
     <w:p>
@@ -5635,7 +5635,7 @@
           <w:szCs w:val="20"/>
           <w:lang w:val="ro-RO"/>
         </w:rPr>
-        <w:t>să coopereze cu angajatorul și/sau cu lucrătorii desemnați, atât timp cât este necesar, pentru a face posibilă realizarea oricăror măsuri sau cerințe dispuse de către inspectorii de muncă și inspectorii sanitari, pentru protecția sănătății și securității lucrătorilor;</w:t>
+        <w:t xml:space="preserve">să coopereze cu angajatorul și/ sau cu lucrătorii desemnați, atât timp cât este necesar, pentru a face posibilă realizarea oricăror măsuri sau cerințe dispuse de către inspectorii de muncă și inspectorii sanitari, pentru protecția sănătății și securității lucrătorilor;</w:t>
       </w:r>
     </w:p>
     <w:p>
@@ -6156,7 +6156,7 @@
           <w:szCs w:val="20"/>
           <w:lang w:val="ro-RO"/>
         </w:rPr>
-        <w:t xml:space="preserve"> Prevenirea riscurilor, precum și protecția sănătății și securitatea lucrătorilor trebuie să fie asigurate de unul sau mai mulți lucrători, de un serviciu ori de servicii distincte din interiorul sau din exteriorul întreprinderii și/sau unității.</w:t>
+        <w:t xml:space="preserve"> Prevenirea riscurilor, precum și protecția sănătății și securitatea lucrătorilor trebuie să fie asigurate de unul sau mai mulți lucrători, de un serviciu ori de servicii distincte din interiorul sau din exteriorul întreprinderii și/ sau unității.</w:t>
       </w:r>
     </w:p>
     <w:p>
@@ -6196,7 +6196,7 @@
           <w:szCs w:val="20"/>
           <w:lang w:val="ro-RO"/>
         </w:rPr>
-        <w:t xml:space="preserve"> Lucrătorul/lucrătorii și/sau serviciul/serviciile prevăzute la alin. (2) trebuie să colaboreze între ei ori de câte ori este necesar.</w:t>
+        <w:t xml:space="preserve"> Lucrătorul/lucrătorii și/ sau serviciul/serviciile prevăzute la alin. (2) trebuie să colaboreze între ei ori de câte ori este necesar.</w:t>
       </w:r>
     </w:p>
     <w:p>
@@ -6460,7 +6460,7 @@
           <w:szCs w:val="20"/>
           <w:lang w:val="ro-RO"/>
         </w:rPr>
-        <w:t>angajatorul își desfășoară activitatea profesională în mod efectiv și cu regularitate în întreprindere și/sau unitate;</w:t>
+        <w:t xml:space="preserve">angajatorul își desfășoară activitatea profesională în mod efectiv și cu regularitate în întreprindere și/ sau unitate;</w:t>
       </w:r>
     </w:p>
     <w:p>
@@ -6534,7 +6534,7 @@
           <w:szCs w:val="20"/>
           <w:lang w:val="ro-RO"/>
         </w:rPr>
-        <w:t>În situația în care nu sunt îndeplinite condițiile prevăzute la alin. (1) de mai sus, angajatorul trebuie să desemneze unul sau mai mulți lucrători ori poate organiza serviciul intern de prevenire și protecție și/sau poate să apeleze la servicii externe, în condițiile prezentelor norme metodologice.</w:t>
+        <w:t xml:space="preserve">În situația în care nu sunt îndeplinite condițiile prevăzute la alin. (1) de mai sus, angajatorul trebuie să desemneze unul sau mai mulți lucrători ori poate organiza serviciul intern de prevenire și protecție și/ sau poate să apeleze la servicii externe, în condițiile prezentelor norme metodologice.</w:t>
       </w:r>
     </w:p>
     <w:p>
@@ -6759,7 +6759,7 @@
           <w:szCs w:val="20"/>
           <w:lang w:val="ro-RO"/>
         </w:rPr>
-        <w:t xml:space="preserve">(1) lit. a) - c) din H.G. 1425/ 2006;</w:t>
+        <w:t xml:space="preserve">(1) lit. a)–c) din H.G. 1425/ 2006;</w:t>
       </w:r>
     </w:p>
     <w:p>
@@ -6847,7 +6847,7 @@
           <w:szCs w:val="20"/>
           <w:lang w:val="ro-RO"/>
         </w:rPr>
-        <w:t>În situația în care nu sunt îndeplinite condițiile prevăzute la alin. (1), angajatorul trebuie să desemneze unul sau mai mulți lucrători ori poate organiza unul sau mai multe servicii interne de prevenire și protecție și/sau poate să apeleze la servicii externe, în condițiile prezentelor norme metodologice.</w:t>
+        <w:t xml:space="preserve">În situația în care nu sunt îndeplinite condițiile prevăzute la alin. (1), angajatorul trebuie să desemneze unul sau mai mulți lucrători ori poate organiza unul sau mai multe servicii interne de prevenire și protecție și/ sau poate să apeleze la servicii externe, în condițiile prezentelor norme metodologice.</w:t>
       </w:r>
     </w:p>
     <w:p>
@@ -7027,7 +7027,7 @@
           <w:szCs w:val="20"/>
           <w:lang w:val="ro-RO"/>
         </w:rPr>
-        <w:t>În cazul întreprinderilor și/sau unităților care au între 50 și 249 de lucrători, angajatorul trebuie să desemneze unul sau mai mulți lucrători ori să organizeze unul sau mai multe servicii interne de prevenire și protecție pentru a se ocupa de activitățile de prevenire și protecție din cadrul întreprinderii.</w:t>
+        <w:t xml:space="preserve">În cazul întreprinderilor și/ sau unităților care au între 50 și 249 de lucrători, angajatorul trebuie să desemneze unul sau mai mulți lucrători ori să organizeze unul sau mai multe servicii interne de prevenire și protecție pentru a se ocupa de activitățile de prevenire și protecție din cadrul întreprinderii.</w:t>
       </w:r>
     </w:p>
     <w:p>
@@ -7069,7 +7069,7 @@
           <w:szCs w:val="20"/>
           <w:lang w:val="ro-RO"/>
         </w:rPr>
-        <w:t xml:space="preserve">În cazul întreprinderilor și/sau unităților prevăzute la alin. (1) care desfășoară activități dintre cele prevăzute în anexa nr. 5 </w:t>
+        <w:t xml:space="preserve">În cazul întreprinderilor și/ sau unităților prevăzute la alin. (1) care desfășoară activități dintre cele prevăzute în anexa nr. 5 </w:t>
       </w:r>
       <w:r>
         <w:rPr>
@@ -8024,7 +8024,7 @@
           <w:szCs w:val="20"/>
           <w:lang w:val="ro-RO"/>
         </w:rPr>
-        <w:t>modul de colaborare cu lucrătorii desemnați/serviciile interne și/sau cu alte servicii externe de prevenire și protecție;</w:t>
+        <w:t xml:space="preserve">modul de colaborare cu lucrătorii desemnați/serviciile interne și/ sau cu alte servicii externe de prevenire și protecție;</w:t>
       </w:r>
     </w:p>
     <w:p>
@@ -8166,7 +8166,7 @@
           <w:szCs w:val="20"/>
           <w:lang w:val="ro-RO"/>
         </w:rPr>
-        <w:t xml:space="preserve">Reprezentanții lucrătorilor cu răspunderi specifice în domeniul securității și sănătății în muncă, definiți conform art. 5 lit. d) din Legea 319/ 2006, sunt aleși de către și dintre lucrătorii din întreprindere și/sau unitate, conform celor stabilite prin contractul colectiv de muncă, regulamentul intern sau regulamentul de organizare și funcționare.</w:t>
+        <w:t xml:space="preserve">Reprezentanții lucrătorilor cu răspunderi specifice în domeniul securității și sănătății în muncă, definiți conform art. 5 lit. d) din Legea 319/ 2006, sunt aleși de către și dintre lucrătorii din întreprindere și/ sau unitate, conform celor stabilite prin contractul colectiv de muncă, regulamentul intern sau regulamentul de organizare și funcționare.</w:t>
       </w:r>
     </w:p>
     <w:p>
@@ -8293,7 +8293,7 @@
           <w:szCs w:val="20"/>
           <w:lang w:val="ro-RO"/>
         </w:rPr>
-        <w:t>Numărul de reprezentanți ai lucrătorilor cu răspunderi specifice în domeniul securității și sănătății, care se aleg, va fi stabilit prin contractul colectiv de muncă, regulamentul intern sau regulamentul de organizare și funcționare, în funcție de numărul total al lucrătorilor din întreprindere și/sau unitate.</w:t>
+        <w:t xml:space="preserve">Numărul de reprezentanți ai lucrătorilor cu răspunderi specifice în domeniul securității și sănătății, care se aleg, va fi stabilit prin contractul colectiv de muncă, regulamentul intern sau regulamentul de organizare și funcționare, în funcție de numărul total al lucrătorilor din întreprindere și/ sau unitate.</w:t>
       </w:r>
     </w:p>
     <w:p>
@@ -8382,7 +8382,7 @@
           <w:szCs w:val="20"/>
           <w:lang w:val="ro-RO"/>
         </w:rPr>
-        <w:t>un reprezentant, în cazul întreprinderilor și/sau unităților care au între 10 și 49 de lucrători inclusiv;</w:t>
+        <w:t xml:space="preserve">un reprezentant, în cazul întreprinderilor și/ sau unităților care au între 10 și 49 de lucrători inclusiv;</w:t>
       </w:r>
     </w:p>
     <w:p>
@@ -8414,7 +8414,7 @@
           <w:szCs w:val="20"/>
           <w:lang w:val="ro-RO"/>
         </w:rPr>
-        <w:t>2 reprezentanți, în cazul întreprinderilor și/sau unităților care au între 50 și 100 de lucrători inclusiv;</w:t>
+        <w:t xml:space="preserve">2 reprezentanți, în cazul întreprinderilor și/ sau unităților care au între 50 și 100 de lucrători inclusiv;</w:t>
       </w:r>
     </w:p>
     <w:p>
@@ -9307,7 +9307,7 @@
           <w:szCs w:val="20"/>
           <w:lang w:val="ro-RO"/>
         </w:rPr>
-        <w:t xml:space="preserve"> Instruirea prevăzută la art. 20 alin. (4) din Legea 319/ 2006 trebuie să se efectueze în timpul programului de lucru, fie în interiorul, fie în afara întreprinderii și/sau unității, fie online.</w:t>
+        <w:t xml:space="preserve"> Instruirea prevăzută la art. 20 alin. (4) din Legea 319/ 2006 trebuie să se efectueze în timpul programului de lucru, fie în interiorul, fie în afara întreprinderii și/ sau unității, fie online.</w:t>
       </w:r>
     </w:p>
     <w:p>
@@ -10038,7 +10038,7 @@
           <w:szCs w:val="20"/>
           <w:lang w:val="ro-RO"/>
         </w:rPr>
-        <w:t xml:space="preserve">În conformitate cu prevederile art. 17 alin. (3) lit. o) și alin. (4) din Legea nr. 53/2003 - Codul muncii, republicată, cu modificările și completările ulterioare, procedurile privind utilizarea semnăturii electronice, semnăturii electronice avansate sau semnăturii electronice calificate pentru semnarea fișei de instruire individuală se regăsesc în contractul individual de muncă.</w:t>
+        <w:t xml:space="preserve">În conformitate cu prevederile art. 17 alin. (3) lit. o) și alin. (4) din Legea nr. 53/ 2003 – Codul muncii, republicată, cu modificările și completările ulterioare, procedurile privind utilizarea semnăturii electronice, semnăturii electronice avansate sau semnăturii electronice calificate pentru semnarea fișei de instruire individuală se regăsesc în contractul individual de muncă.</w:t>
       </w:r>
     </w:p>
     <w:p>
@@ -10465,7 +10465,7 @@
           <w:szCs w:val="20"/>
           <w:lang w:val="ro-RO"/>
         </w:rPr>
-        <w:t>urata instruirii introductiv-generale depinde de specificul activității și de riscurile pentru securitate și sănătate în muncă, precum și de măsurile și activitățile de prevenire și protecție la nivelul întreprinderii și/sau al unității, în general.</w:t>
+        <w:t xml:space="preserve">urata instruirii introductiv-generale depinde de specificul activității și de riscurile pentru securitate și sănătate în muncă, precum și de măsurile și activitățile de prevenire și protecție la nivelul întreprinderii și/ sau al unității, în general.</w:t>
       </w:r>
     </w:p>
     <w:p>
@@ -10542,7 +10542,7 @@
           <w:shd w:fill="FFFFFF" w:val="clear"/>
           <w:lang w:val="ro-RO"/>
         </w:rPr>
-        <w:t xml:space="preserve"> Persoanelor prevăzute la art. 82 din H.G. 1425/ 2006 li se vor prezenta succint activitățile, riscurile și măsurile de prevenire și protecție din întreprindere și/sau unitate.</w:t>
+        <w:t xml:space="preserve"> Persoanelor prevăzute la art. 82 din H.G. 1425/ 2006 li se vor prezenta succint activitățile, riscurile și măsurile de prevenire și protecție din întreprindere și/ sau unitate.</w:t>
       </w:r>
     </w:p>
     <w:p>
@@ -11127,7 +11127,7 @@
           <w:shd w:fill="FFFFFF" w:val="clear"/>
           <w:lang w:val="ro-RO"/>
         </w:rPr>
-        <w:t xml:space="preserve">ntervalul dintre două instruiri periodice și periodicitatea verificării instruirii vor fi stabilite prin programul de instruire-testare elaborat la nivelul întreprinderii și/sau unității potrivit prevederilor art. 15 alin. (1) pct. 8 din H.G. 1425/ 2006, în funcție de condițiile locului de muncă și/sau postului de lucru.</w:t>
+        <w:t xml:space="preserve">ntervalul dintre două instruiri periodice și periodicitatea verificării instruirii vor fi stabilite prin programul de instruire-testare elaborat la nivelul întreprinderii și/ sau unității potrivit prevederilor art. 15 alin. (1) pct. 8 din H.G. 1425/ 2006, în funcție de condițiile locului de muncă și/ sau postului de lucru.</w:t>
       </w:r>
     </w:p>
     <w:p>
@@ -13270,7 +13270,7 @@
           <w:szCs w:val="20"/>
           <w:lang w:val="ro-RO"/>
         </w:rPr>
-        <w:t xml:space="preserve">accidentul suferit de persoane aflate în vizită în întreprindere și/sau unitate, cu permisiunea angajatorului;</w:t>
+        <w:t xml:space="preserve">accidentul suferit de persoane aflate în vizită în întreprindere și/ sau unitate, cu permisiunea angajatorului;</w:t>
       </w:r>
     </w:p>
     <w:p>
@@ -14426,7 +14426,7 @@
           <w:szCs w:val="20"/>
           <w:lang w:val="ro-RO"/>
         </w:rPr>
-        <w:t>Evaluarea riscurilor cu privire la securitatea și sănătatea în muncă la nivelul întreprinderii și/sau unității, inclusiv pentru grupurile sensibile la riscuri specifice, trebuie revizuită, cel puțin, în următoarele situații:</w:t>
+        <w:t xml:space="preserve">Evaluarea riscurilor cu privire la securitatea și sănătatea în muncă la nivelul întreprinderii și/ sau unității, inclusiv pentru grupurile sensibile la riscuri specifice, trebuie revizuită, cel puțin, în următoarele situații:</w:t>
       </w:r>
     </w:p>
     <w:p>
@@ -16025,7 +16025,7 @@
                 <w:szCs w:val="18"/>
                 <w:lang w:val="ro-RO"/>
               </w:rPr>
-              <w:t>Cerințele minime pentru semnalizarea de securitate și/sau de sănătate la locul de muncă</w:t>
+              <w:t xml:space="preserve">Cerințele minime pentru semnalizarea de securitate și/ sau de sănătate la locul de muncă</w:t>
             </w:r>
           </w:p>
         </w:tc>
@@ -20916,7 +20916,7 @@
           <w:szCs w:val="20"/>
           <w:lang w:val="ro-RO"/>
         </w:rPr>
-        <w:t xml:space="preserve">Obligații, atribuții și răspunderi în domeniul securității și sănătății în muncă (conform Legii 319/2006 și H.G. 1425/ 2006), valabile pentru lucrători:</w:t>
+        <w:t xml:space="preserve">Obligații, atribuții și răspunderi în domeniul securității și sănătății în muncă (conform Legii 319/ 2006 și H.G. 1425/ 2006), valabile pentru lucrători:</w:t>
       </w:r>
     </w:p>
     <w:p>
@@ -21546,7 +21546,7 @@
           <w:szCs w:val="20"/>
           <w:lang w:val="ro-RO"/>
         </w:rPr>
-        <w:t xml:space="preserve">Obligații, atribuții și răspunderi în domeniul situațiilor de urgență (conform Legii 307/2006), valabile pentru lucrători:</w:t>
+        <w:t xml:space="preserve">Obligații, atribuții și răspunderi în domeniul situațiilor de urgență (conform Legii 307/ 2006), valabile pentru lucrători:</w:t>
       </w:r>
     </w:p>
     <w:p>
@@ -24015,7 +24015,7 @@
           <w:szCs w:val="20"/>
           <w:lang w:val="ro-RO"/>
         </w:rPr>
-        <w:t xml:space="preserve">evidența echipamentelor, zonarea corespunzătoare, asigurarea/urmărirea ca verificările și/sau încercările periodice ale echipamentelor de muncă să fie efectuate la timp și de către persoane competente ori alte activități necesare, potrivit prevederilor Hotărârii Guvernului nr. </w:t>
+        <w:t xml:space="preserve">evidența echipamentelor, zonarea corespunzătoare, asigurarea/urmărirea ca verificările și/ sau încercările periodice ale echipamentelor de muncă să fie efectuate la timp și de către persoane competente ori alte activități necesare, potrivit prevederilor Hotărârii Guvernului nr. </w:t>
       </w:r>
       <w:r>
         <w:rPr>
@@ -24197,7 +24197,7 @@
           <w:szCs w:val="20"/>
           <w:lang w:val="ro-RO"/>
         </w:rPr>
-        <w:t>Angajatorul are obligația potrivit Legii 319/2006 să ia toate măsurile necesare pentru protejarea vieții și sănătății salariaților, pentru prevenirea riscurilor profesionale, pentru informarea și pregătirea lucrătorilor cu privire la aceste riscuri, organizarea securității și sănătății în muncă și a mijloacelor necesare acesteia.</w:t>
+        <w:t xml:space="preserve">Angajatorul are obligația, potrivit Legii 319/ 2006, să ia toate măsurile necesare pentru protejarea vieții și sănătății salariaților, pentru prevenirea riscurilor profesionale, pentru informarea și pregătirea lucrătorilor cu privire la aceste riscuri, organizarea securității și sănătății în muncă și a mijloacelor necesare acesteia.</w:t>
       </w:r>
     </w:p>
     <w:p>
@@ -25256,7 +25256,7 @@
           <w:szCs w:val="20"/>
           <w:lang w:val="ro-RO"/>
         </w:rPr>
-        <w:t xml:space="preserve">să se asigure că sunt consultați angajații și/sau reprezentanții lor în problemele referitoare la măsurile și consecințele privind securitatea și sănătatea în muncă la introducerea de noi tehnologii, alegerea echipamentului tehnic, îmbunătățirea condițiilor și mediului de muncă, la desemnarea persoanelor cu atribuții privind primul ajutor, prevenirea și stingerea incendiilor, evacuarea angajaților, precum și la modul de desfășurare a activității de prevenire și protecție împotriva riscurilor profesionale, inclusiv a celei de instruire în domeniu;</w:t>
+        <w:t xml:space="preserve">să se asigure că sunt consultați angajații și/ sau reprezentanții lor în problemele referitoare la măsurile și consecințele privind securitatea și sănătatea în muncă la introducerea de noi tehnologii, alegerea echipamentului tehnic, îmbunătățirea condițiilor și mediului de muncă, la desemnarea persoanelor cu atribuții privind primul ajutor, prevenirea și stingerea incendiilor, evacuarea angajaților, precum și la modul de desfășurare a activității de prevenire și protecție împotriva riscurilor profesionale, inclusiv a celei de instruire în domeniu;</w:t>
       </w:r>
     </w:p>
     <w:p>
@@ -25486,7 +25486,7 @@
           <w:szCs w:val="20"/>
           <w:lang w:val="ro-RO"/>
         </w:rPr>
-        <w:t xml:space="preserve">în cazul în care temperaturile atmosferice sau cele din spațiul de lucru sunt ridicate și pot afecta sănătatea, în funcție de posibilități, aer condiționat sau ventilație. În perioadele cu temperaturi ridicate extreme (peste +37 °C), angajatorul va asigura apă minerală adecvată, câte 2 - 4 litri/ persoană/ schimb, iar în perioadele cu temperaturi scăzute extreme (sub -20 °C), salariaților care lucrează în aer liber, ceai fierbinte în cantitate de 0,5 - 1 litru/ persoană/ schimb (O.U.G. nr. 99/2000, art. 4 și 5)</w:t>
+        <w:t xml:space="preserve">în cazul în care temperaturile atmosferice sau cele din spațiul de lucru sunt ridicate și pot afecta sănătatea, în funcție de posibilități, aer condiționat sau ventilație. În perioadele cu temperaturi ridicate extreme (peste +37 °C), angajatorul va asigura apă minerală adecvată, câte 2 – 4 litri/ persoană/ schimb, iar în perioadele cu temperaturi scăzute extreme (sub -20 °C), salariaților care lucrează în aer liber, ceai fierbinte în cantitate de 0,5 – 1 litru/ persoană/ schimb (O.U.G. nr. 99/ 2000, art. 4 și 5)</w:t>
       </w:r>
       <w:r>
         <w:rPr>
@@ -25561,7 +25561,7 @@
           <w:szCs w:val="20"/>
           <w:lang w:val="ro-RO"/>
         </w:rPr>
-        <w:t xml:space="preserve">să asigure securitatea și sănătatea în muncă a salariatelor gravide și/sau mame, lăuze sau care alăptează, conform O.U.G. nr. 96/ 2003 privind protecția maternității la locurile de muncă.</w:t>
+        <w:t xml:space="preserve">să asigure securitatea și sănătatea în muncă a salariatelor gravide și/ sau mame, lăuze sau care alăptează, conform O.U.G. nr. 96/ 2003 privind protecția maternității la locurile de muncă.</w:t>
       </w:r>
     </w:p>
     <w:p>
@@ -27598,7 +27598,7 @@
           <w:szCs w:val="20"/>
           <w:lang w:val="ro-RO"/>
         </w:rPr>
-        <w:t xml:space="preserve">Prelucrarea actelor normative noi apărute care reglementează activitatea de apărare împotriva incendiilor, a Legii nr. 307/2006 și a altor acte normative subsecvente acesteia.</w:t>
+        <w:t xml:space="preserve">Prelucrarea actelor normative noi apărute care reglementează activitatea de apărare împotriva incendiilor, a Legii nr. 307/ 2006 și a altor acte normative subsecvente acesteia.</w:t>
       </w:r>
     </w:p>
     <w:p>
@@ -29956,7 +29956,7 @@
           <w:szCs w:val="20"/>
           <w:lang w:val="ro-RO"/>
         </w:rPr>
-        <w:t>acordarea altor drepturi sociale altele decât cele reprezentând salariul;</w:t>
+        <w:t xml:space="preserve">acordarea altor drepturi sociale, altele decât cele reprezentând salariul;</w:t>
       </w:r>
     </w:p>
     <w:p>
@@ -30351,7 +30351,7 @@
           <w:szCs w:val="20"/>
           <w:lang w:val="ro-RO"/>
         </w:rPr>
-        <w:t>Salariatele gravide și/ sau mamele, lăuzele sau care alăptează pentru a beneficia de aceste măsuri trebuie să informeze în scris angajatorul asupra stării lor fiziologice astfel:</w:t>
+        <w:t xml:space="preserve">Salariatele gravide și/ sau mamele, lăuzele sau care alăptează, pentru a beneficia de aceste măsuri, trebuie să informeze în scris angajatorul asupra stării lor fiziologice astfel:</w:t>
       </w:r>
     </w:p>
     <w:p>
@@ -30688,7 +30688,7 @@
           <w:szCs w:val="20"/>
           <w:lang w:val="ro-RO"/>
         </w:rPr>
-        <w:t>Angajatorii vor informa în scris salariatele asupra rezultatelor evaluării privind riscurile la care pot fi supuse la locurile lor de muncă, precum și asupra drepturilor care decurg din O.U.G. nr. 96/ 2003 prin informarea privind protecția maternității la locul de muncă (conform modelului din Normele Metodologice) în termen de cel mult 15 zile lucrătoare de la data întocmirii raportului de evaluare.</w:t>
+        <w:t xml:space="preserve">Angajatorii vor informa în scris salariatele asupra rezultatelor evaluării privind riscurile la care pot fi supuse la locurile lor de muncă, precum și asupra drepturilor care decurg din O.U.G. nr. 96/ 2003 prin informarea privind protecția maternității la locul de muncă (conform modelului din Normele metodologice) în termen de cel mult 15 zile lucrătoare de la data întocmirii raportului de evaluare.</w:t>
       </w:r>
     </w:p>
     <w:p>

</xml_diff>

<commit_message>
fix(templates): the employer briefing's election procedure applies "dacă este cazul"
Art. 73 pt 35 says a client under 10 workers has no representative, while pt 39
then has its workers elect one and the employer designate them by decision.
Pt 39's lead-in now reads "Dacă este cazul, modalitatea de desemnare a
reprezentanților lucrătorilor … este următoarea:", true for every client.

Claude-Session: https://claude.ai/code/session_01A9qjCHVH6kcDAEKFiJoShR
</commit_message>
<xml_diff>
--- a/packages/document-engine/templates/11_employer_briefing.docx
+++ b/packages/document-engine/templates/11_employer_briefing.docx
@@ -28304,7 +28304,7 @@
           <w:szCs w:val="20"/>
           <w:lang w:val="ro-RO"/>
         </w:rPr>
-        <w:t>M</w:t>
+        <w:t xml:space="preserve">Dacă este cazul, m</w:t>
       </w:r>
       <w:r>
         <w:rPr>
@@ -28330,7 +28330,7 @@
           <w:szCs w:val="20"/>
           <w:lang w:val="ro-RO"/>
         </w:rPr>
-        <w:t>cu răspunderi specifice în domeniul securității și sănătății în muncă:</w:t>
+        <w:t xml:space="preserve">cu răspunderi specifice în domeniul securității și sănătății în muncă este următoarea:</w:t>
       </w:r>
     </w:p>
     <w:p>

</xml_diff>

<commit_message>
fix(documents): the employer briefing's slashes take a space, Art. 73 pt 7 has one "să" and Art. 75 pt 9 agrees
Sixteen unspaced slashes between words now read "x/ y" like the other
25 in the document. Art. 73 pt 7 opens "va trebui:" with "să" moved
into a), as pt 48 has it. Art. 75 pt 9: "să le repartizeze" (the
pregnant employees).

Claude-Session: https://claude.ai/code/session_01A9qjCHVH6kcDAEKFiJoShR
</commit_message>
<xml_diff>
--- a/packages/document-engine/templates/11_employer_briefing.docx
+++ b/packages/document-engine/templates/11_employer_briefing.docx
@@ -4042,7 +4042,7 @@
           <w:szCs w:val="20"/>
           <w:lang w:val="ro-RO"/>
         </w:rPr>
-        <w:t>elaborarea de instrucțiuni proprii pentru completarea și/ sau aplicarea reglementărilor de securitate și sănătate în muncă, ținând seama de particularitățile activităților și ale unității/întreprinderii, precum și ale locurilor de muncă/ posturilor de lucru, și difuzarea acestora în întreprindere și/ sau unitate numai după ce au fost aprobate de către angajator</w:t>
+        <w:t xml:space="preserve">elaborarea de instrucțiuni proprii pentru completarea și/ sau aplicarea reglementărilor de securitate și sănătate în muncă, ținând seama de particularitățile activităților și ale unității/ întreprinderii, precum și ale locurilor de muncă/ posturilor de lucru, și difuzarea acestora în întreprindere și/ sau unitate numai după ce au fost aprobate de către angajator</w:t>
       </w:r>
       <w:r>
         <w:rPr>
@@ -5228,7 +5228,7 @@
           <w:szCs w:val="20"/>
           <w:lang w:val="ro-RO"/>
         </w:rPr>
-        <w:t xml:space="preserve">evidența echipamentelor, zonarea corespunzătoare, asigurarea/urmărirea ca verificările și/ sau încercările periodice ale echipamentelor de muncă să fie efectuate la timp și de către persoane competente ori alte activități necesare, potrivit prevederilor Hotărârii Guvernului nr. </w:t>
+        <w:t xml:space="preserve">evidența echipamentelor, zonarea corespunzătoare, asigurarea/ urmărirea ca verificările și/ sau încercările periodice ale echipamentelor de muncă să fie efectuate la timp și de către persoane competente ori alte activități necesare, potrivit prevederilor Hotărârii Guvernului nr. </w:t>
       </w:r>
       <w:r>
         <w:rPr>
@@ -6196,7 +6196,7 @@
           <w:szCs w:val="20"/>
           <w:lang w:val="ro-RO"/>
         </w:rPr>
-        <w:t xml:space="preserve"> Lucrătorul/lucrătorii și/ sau serviciul/serviciile prevăzute la alin. (2) trebuie să colaboreze între ei ori de câte ori este necesar.</w:t>
+        <w:t xml:space="preserve"> Lucrătorul/ lucrătorii și/ sau serviciul/ serviciile prevăzute la alin. (2) trebuie să colaboreze între ei ori de câte ori este necesar.</w:t>
       </w:r>
     </w:p>
     <w:p>
@@ -6578,7 +6578,7 @@
           <w:szCs w:val="20"/>
           <w:lang w:val="ro-RO"/>
         </w:rPr>
-        <w:t>În cazul în care angajatorul/lucrătorii desemnați/serviciile interne de prevenire și protecție nu au capacitățile și aptitudinile necesare pentru efectuarea tuturor activităților de prevenire și protecție prevăzute la art. 15 din H.G. 1425/ 2006, angajatorul trebuie să apeleze la servicii externe pentru acele activități de prevenire și protecție pe care nu le poate desfășura cu personalul propriu.</w:t>
+        <w:t xml:space="preserve">În cazul în care angajatorul/ lucrătorii desemnați/ serviciile interne de prevenire și protecție nu au capacitățile și aptitudinile necesare pentru efectuarea tuturor activităților de prevenire și protecție prevăzute la art. 15 din H.G. 1425/ 2006, angajatorul trebuie să apeleze la servicii externe pentru acele activități de prevenire și protecție pe care nu le poate desfășura cu personalul propriu.</w:t>
       </w:r>
     </w:p>
     <w:p>
@@ -6905,7 +6905,7 @@
           <w:szCs w:val="20"/>
           <w:lang w:val="ro-RO"/>
         </w:rPr>
-        <w:t xml:space="preserve">În cazul în care angajatorul/lucrătorii desemnați/serviciile interne de prevenire și protecție nu au capacitățile și aptitudinile necesare pentru efectuarea tuturor activităților de prevenire și protecție prevăzute la art. 15 din H.G. 1425/ 2006, angajatorul trebuie să apeleze la servicii externe pentru acele activități de prevenire și protecție pe care nu le poate desfășura cu personalul propriu.</w:t>
+        <w:t xml:space="preserve">În cazul în care angajatorul/ lucrătorii desemnați/ serviciile interne de prevenire și protecție nu au capacitățile și aptitudinile necesare pentru efectuarea tuturor activităților de prevenire și protecție prevăzute la art. 15 din H.G. 1425/ 2006, angajatorul trebuie să apeleze la servicii externe pentru acele activități de prevenire și protecție pe care nu le poate desfășura cu personalul propriu.</w:t>
       </w:r>
     </w:p>
     <w:p>
@@ -8024,7 +8024,7 @@
           <w:szCs w:val="20"/>
           <w:lang w:val="ro-RO"/>
         </w:rPr>
-        <w:t xml:space="preserve">modul de colaborare cu lucrătorii desemnați/serviciile interne și/ sau cu alte servicii externe de prevenire și protecție;</w:t>
+        <w:t xml:space="preserve">modul de colaborare cu lucrătorii desemnați/ serviciile interne și/ sau cu alte servicii externe de prevenire și protecție;</w:t>
       </w:r>
     </w:p>
     <w:p>
@@ -10230,7 +10230,7 @@
           <w:szCs w:val="20"/>
           <w:lang w:val="ro-RO"/>
         </w:rPr>
-        <w:t xml:space="preserve">Fișa de instruire individuală se păstrează în întreprindere/unitate, pe suport hârtie sau în format electronic, după caz, de la angajare până la data încetării raporturilor de muncă.</w:t>
+        <w:t xml:space="preserve">Fișa de instruire individuală se păstrează în întreprindere/ unitate, pe suport hârtie sau în format electronic, după caz, de la angajare până la data încetării raporturilor de muncă.</w:t>
       </w:r>
     </w:p>
     <w:p>
@@ -14458,7 +14458,7 @@
           <w:szCs w:val="20"/>
           <w:lang w:val="ro-RO"/>
         </w:rPr>
-        <w:t>ori de câte ori intervin schimbări sau modificări în ceea ce privește tehnologia, echipamentele de muncă, substanțele ori preparatele chimice utilizate și amenajarea locurilor de muncă/posturilor de muncă;</w:t>
+        <w:t xml:space="preserve">ori de câte ori intervin schimbări sau modificări în ceea ce privește tehnologia, echipamentele de muncă, substanțele ori preparatele chimice utilizate și amenajarea locurilor de muncă/ posturilor de muncă;</w:t>
       </w:r>
     </w:p>
     <w:p>
@@ -22429,7 +22429,7 @@
           <w:szCs w:val="20"/>
           <w:lang w:val="ro-RO"/>
         </w:rPr>
-        <w:t>însoțesc echipa/persoana care efectuează evaluarea riscurilor;</w:t>
+        <w:t xml:space="preserve">însoțesc echipa/ persoana care efectuează evaluarea riscurilor;</w:t>
       </w:r>
     </w:p>
     <w:p>
@@ -22773,7 +22773,7 @@
           <w:szCs w:val="20"/>
           <w:lang w:val="ro-RO"/>
         </w:rPr>
-        <w:t>elaborarea de instrucțiuni proprii pentru completarea și/ sau aplicarea reglementărilor de securitate și sănătate în muncă, ținând seama de particularitățile activităților și ale unității/întreprinderii, precum și ale locurilor de muncă/ posturilor de lucru, și difuzarea acestora în întreprindere și/ sau unitate numai după ce au fost aprobate de către angajator</w:t>
+        <w:t xml:space="preserve">elaborarea de instrucțiuni proprii pentru completarea și/ sau aplicarea reglementărilor de securitate și sănătate în muncă, ținând seama de particularitățile activităților și ale unității/ întreprinderii, precum și ale locurilor de muncă/ posturilor de lucru, și difuzarea acestora în întreprindere și/ sau unitate numai după ce au fost aprobate de către angajator</w:t>
       </w:r>
       <w:r>
         <w:rPr>
@@ -24015,7 +24015,7 @@
           <w:szCs w:val="20"/>
           <w:lang w:val="ro-RO"/>
         </w:rPr>
-        <w:t xml:space="preserve">evidența echipamentelor, zonarea corespunzătoare, asigurarea/urmărirea ca verificările și/ sau încercările periodice ale echipamentelor de muncă să fie efectuate la timp și de către persoane competente ori alte activități necesare, potrivit prevederilor Hotărârii Guvernului nr. </w:t>
+        <w:t xml:space="preserve">evidența echipamentelor, zonarea corespunzătoare, asigurarea/ urmărirea ca verificările și/ sau încercările periodice ale echipamentelor de muncă să fie efectuate la timp și de către persoane competente ori alte activități necesare, potrivit prevederilor Hotărârii Guvernului nr. </w:t>
       </w:r>
       <w:r>
         <w:rPr>
@@ -24815,7 +24815,7 @@
           <w:szCs w:val="20"/>
           <w:lang w:val="ro-RO"/>
         </w:rPr>
-        <w:t xml:space="preserve">Astfel, lucrătorul desemnat sau serviciul extern va trebui să:</w:t>
+        <w:t xml:space="preserve">Astfel, lucrătorul desemnat sau serviciul extern va trebui:</w:t>
       </w:r>
     </w:p>
     <w:p>
@@ -24846,7 +24846,7 @@
           <w:szCs w:val="20"/>
           <w:lang w:val="ro-RO"/>
         </w:rPr>
-        <w:t>stabilească în fișa postului atribuțiile și răspunderea angajaților în domeniul securității muncii, corespunzător funcțiilor exercitate;</w:t>
+        <w:t xml:space="preserve">să stabilească în fișa postului atribuțiile și răspunderea angajaților în domeniul securității muncii, corespunzător funcțiilor exercitate;</w:t>
       </w:r>
     </w:p>
     <w:p>
@@ -26705,7 +26705,7 @@
           <w:szCs w:val="20"/>
           <w:lang w:val="ro-RO"/>
         </w:rPr>
-        <w:t xml:space="preserve">confirmarea sau infirmarea aptitudinii în muncă pentru profesia/funcția și locul de muncă pentru care s-a făcut angajarea;</w:t>
+        <w:t xml:space="preserve">confirmarea sau infirmarea aptitudinii în muncă pentru profesia/ funcția și locul de muncă pentru care s-a făcut angajarea;</w:t>
       </w:r>
     </w:p>
     <w:p>
@@ -27508,7 +27508,7 @@
           <w:szCs w:val="20"/>
           <w:lang w:val="ro-RO"/>
         </w:rPr>
-        <w:t>Întocmirea/actualizarea planului de intervenție în caz de incendiu conform legislației actuale.</w:t>
+        <w:t xml:space="preserve">Întocmirea/ actualizarea planului de intervenție în caz de incendiu conform legislației actuale.</w:t>
       </w:r>
     </w:p>
     <w:p>
@@ -31227,7 +31227,7 @@
           <w:szCs w:val="20"/>
           <w:lang w:val="ro-RO"/>
         </w:rPr>
-        <w:t xml:space="preserve">să modifice în mod corespunzător condițiile și/ sau orarul de muncă ori să o repartizeze la alt loc de muncă, conform recomandării medicului de medicina muncii sau a medicului de familie, cu menținerea veniturilor salariale.</w:t>
+        <w:t xml:space="preserve">să modifice în mod corespunzător condițiile și/ sau orarul de muncă ori să le repartizeze la alt loc de muncă, conform recomandării medicului de medicina muncii sau a medicului de familie, cu menținerea veniturilor salariale.</w:t>
       </w:r>
     </w:p>
     <w:p>

</xml_diff>

<commit_message>
fix(documents): 11 drops a stray "o" in Art. 48 and spaces seven slashes
Art. 48 reads "va fi întocmită « Tematica de instruire … »". "Decizia/
Dispoziția" x5 in Art. 1 and "Fiecare lucrător/ persoana", "Fiecare
lucrător/ utilizatorul" in Art. 68 take the house form "x/ y".

Claude-Session: https://claude.ai/code/session_01A9qjCHVH6kcDAEKFiJoShR
</commit_message>
<xml_diff>
--- a/packages/document-engine/templates/11_employer_briefing.docx
+++ b/packages/document-engine/templates/11_employer_briefing.docx
@@ -425,7 +425,7 @@
           <w:szCs w:val="20"/>
           <w:lang w:val="ro-RO"/>
         </w:rPr>
-        <w:t>Decizia / Dispoziția privind responsabilii cu instruirea în domeniul securității și sănătății în muncă</w:t>
+        <w:t xml:space="preserve">Decizia/ Dispoziția privind responsabilii cu instruirea în domeniul securității și sănătății în muncă</w:t>
       </w:r>
     </w:p>
     <w:p>
@@ -456,7 +456,7 @@
           <w:szCs w:val="20"/>
           <w:lang w:val="ro-RO"/>
         </w:rPr>
-        <w:t xml:space="preserve">Decizia / Dispoziția de constituire a echipei de evaluare a riscurilor de accidentare și/ sau îmbolnăvire profesională</w:t>
+        <w:t xml:space="preserve">Decizia/ Dispoziția de constituire a echipei de evaluare a riscurilor de accidentare și/ sau îmbolnăvire profesională</w:t>
       </w:r>
     </w:p>
     <w:p>
@@ -487,7 +487,7 @@
           <w:szCs w:val="20"/>
           <w:lang w:val="ro-RO"/>
         </w:rPr>
-        <w:t>Decizia / Dispoziția privind responsabilii cu acordarea primului ajutor</w:t>
+        <w:t xml:space="preserve">Decizia/ Dispoziția privind responsabilii cu acordarea primului ajutor</w:t>
       </w:r>
     </w:p>
     <w:p>
@@ -518,7 +518,7 @@
           <w:szCs w:val="20"/>
           <w:lang w:val="ro-RO"/>
         </w:rPr>
-        <w:t xml:space="preserve">Decizia / Dispoziția privind personalul desemnat cu luarea măsurilor în caz de pericol grav și iminent</w:t>
+        <w:t xml:space="preserve">Decizia/ Dispoziția privind personalul desemnat cu luarea măsurilor în caz de pericol grav și iminent</w:t>
       </w:r>
     </w:p>
     <w:p>
@@ -576,7 +576,7 @@
           <w:szCs w:val="20"/>
           <w:lang w:val="ro-RO"/>
         </w:rPr>
-        <w:t>Decizia / Dispoziția privind desemnarea reprezentanților lucrătorilor cu răspunderi specifice în domeniul securității și sănătății în muncă</w:t>
+        <w:t xml:space="preserve">Decizia/ Dispoziția privind desemnarea reprezentanților lucrătorilor cu răspunderi specifice în domeniul securității și sănătății în muncă</w:t>
       </w:r>
     </w:p>
     <w:p>
@@ -11741,7 +11741,7 @@
           <w:szCs w:val="20"/>
           <w:lang w:val="ro-RO"/>
         </w:rPr>
-        <w:t xml:space="preserve">Ținând cont că instruirea în domeniul securității și sănătății în muncă cuprinde 3 (trei) faze, instruirea introductiv-generală, instruirea la locul de muncă și instruirea periodică, va fi întocmită o « </w:t>
+        <w:t xml:space="preserve">Ținând cont că instruirea în domeniul securității și sănătății în muncă cuprinde 3 (trei) faze, instruirea introductiv-generală, instruirea la locul de muncă și instruirea periodică, va fi întocmită « </w:t>
       </w:r>
       <w:r>
         <w:rPr>
@@ -21576,7 +21576,7 @@
           <w:szCs w:val="20"/>
           <w:lang w:val="ro-RO"/>
         </w:rPr>
-        <w:t>Fiecare lucrător / persoana care observă un incendiu are obligația să anunțe prin orice mijloc serviciile de urgență, poliția și să ia măsuri, după posibilitățile sale, pentru limitarea și stingerea incendiului.</w:t>
+        <w:t xml:space="preserve">Fiecare lucrător/ persoana care observă un incendiu are obligația să anunțe prin orice mijloc serviciile de urgență, poliția și să ia măsuri, după posibilitățile sale, pentru limitarea și stingerea incendiului.</w:t>
       </w:r>
     </w:p>
     <w:p>
@@ -21637,7 +21637,7 @@
           <w:szCs w:val="20"/>
           <w:lang w:val="ro-RO"/>
         </w:rPr>
-        <w:t>Fiecare lucrător / utilizatorul are următoarele obligații principale:</w:t>
+        <w:t xml:space="preserve">Fiecare lucrător/ utilizatorul are următoarele obligații principale:</w:t>
       </w:r>
     </w:p>
     <w:p>

</xml_diff>

<commit_message>
chore(templates): the tests cover names the hiring test alone, and 3.2 verifies the periodic training without a test
The cover 5.0 and its import source read in the singular. Article (4) of 3.2's chapter III
says what H.G. 1425/2006 art. 96 asks instead of a yearly test coded TPSSM, and the employer
briefing no longer lists TPSSM among the documents handed over. ADR 024.
</commit_message>
<xml_diff>
--- a/packages/document-engine/templates/11_employer_briefing.docx
+++ b/packages/document-engine/templates/11_employer_briefing.docx
@@ -759,37 +759,6 @@
           <w:lang w:val="ro-RO"/>
         </w:rPr>
         <w:t xml:space="preserve">Test de verificare a cunoștințelor în urma instruirii introductiv-generale în domeniul securității și sănătății în muncă (cod TASSM)</w:t>
-      </w:r>
-    </w:p>
-    <w:p>
-      <w:pPr>
-        <w:pStyle w:val="Normal"/>
-        <w:widowControl/>
-        <w:numPr>
-          <w:ilvl w:val="0"/>
-          <w:numId w:val="53"/>
-        </w:numPr>
-        <w:spacing w:before="0" w:after="40"/>
-        <w:ind w:left="720" w:hanging="360"/>
-        <w:jc w:val="left"/>
-        <w:rPr>
-          <w:rFonts w:ascii="Arial" w:hAnsi="Arial" w:cs="Arial"/>
-          <w:sz w:val="20"/>
-          <w:szCs w:val="20"/>
-          <w:lang w:val="ro-RO"/>
-        </w:rPr>
-      </w:pPr>
-      <w:r>
-        <w:rPr>
-          <w:rFonts w:eastAsia="Arial" w:cs="Arial" w:ascii="Arial" w:hAnsi="Arial"/>
-          <w:color w:val="auto"/>
-          <w:spacing w:val="0"/>
-          <w:w w:val="100"/>
-          <w:sz w:val="20"/>
-          <w:szCs w:val="20"/>
-          <w:lang w:val="ro-RO"/>
-        </w:rPr>
-        <w:t xml:space="preserve">Test de verificare periodică în domeniul securității și sănătății în muncă (cod TPSSM)</w:t>
       </w:r>
     </w:p>
     <w:p>

</xml_diff>